<commit_message>
solving zero cell problem in acceptability.R + data correction
</commit_message>
<xml_diff>
--- a/thesis/Thesis_Final.docx
+++ b/thesis/Thesis_Final.docx
@@ -840,15 +840,7 @@
         <w:jc w:val="both"/>
       </w:pPr>
       <w:r>
-        <w:t xml:space="preserve">While adolescent mental health needs have risen sharply, the capacity of conventional services has remained limited. Within one year after the onset of COVID-19, the global prevalence of MDD and anxiety disorders increased by approximately 28% and 26% respectively, with the impact most pronounced among young people (COVID-19 Mental Disorders Collaborators, 2021). Three persistent barriers limit adolescent access to care. The first is workforce shortage. According to the WHO Mental Health Atlas, the global median number of child and adolescent psychiatrists is only 0.3 per 100,000 </w:t>
-      </w:r>
-      <w:proofErr w:type="gramStart"/>
-      <w:r>
-        <w:t>population, and</w:t>
-      </w:r>
-      <w:proofErr w:type="gramEnd"/>
-      <w:r>
-        <w:t xml:space="preserve"> falls below 0.1 per 100,000 in low-income countries (World Health Organization, 2021). The second is economic disadvantage. Global evidence shows that treatment coverage for MDD is especially low in low- and lower-middle-income settings, while adolescents from lower socioeconomic backgrounds also report higher levels of depressive symptoms (Moitra et al., 2022; Zhou et al., 2018). The third is stigma, which restricts help-seeking, since adolescents with mental health conditions may be perceived as lazy, weak, or socially undesirable (World Health Organization, 2022). The result is a structural mismatch. Adolescents are among those most affected by post-pandemic increases in depression, but many cannot access timely, affordable, and acceptable care.</w:t>
+        <w:t>While adolescent mental health needs have risen sharply, the capacity of conventional services has remained limited. Within one year after the onset of COVID-19, the global prevalence of MDD and anxiety disorders increased by approximately 28% and 26% respectively, with the impact most pronounced among young people (COVID-19 Mental Disorders Collaborators, 2021). Three persistent barriers limit adolescent access to care. The first is workforce shortage. According to the WHO Mental Health Atlas, the global median number of child and adolescent psychiatrists is only 0.3 per 100,000 population, and falls below 0.1 per 100,000 in low-income countries (World Health Organization, 2021). The second is economic disadvantage. Global evidence shows that treatment coverage for MDD is especially low in low- and lower-middle-income settings, while adolescents from lower socioeconomic backgrounds also report higher levels of depressive symptoms (Moitra et al., 2022; Zhou et al., 2018). The third is stigma, which restricts help-seeking, since adolescents with mental health conditions may be perceived as lazy, weak, or socially undesirable (World Health Organization, 2022). The result is a structural mismatch. Adolescents are among those most affected by post-pandemic increases in depression, but many cannot access timely, affordable, and acceptable care.</w:t>
       </w:r>
     </w:p>
     <w:p>
@@ -859,15 +851,7 @@
       </w:pPr>
       <w:r>
         <w:lastRenderedPageBreak/>
-        <w:t xml:space="preserve">Self-help interventions can help to address these three barriers. They require little or no direct therapist time, which reduces demand on the limited specialist workforce. They can also reach </w:t>
-      </w:r>
-      <w:proofErr w:type="gramStart"/>
-      <w:r>
-        <w:t>a large number of</w:t>
-      </w:r>
-      <w:proofErr w:type="gramEnd"/>
-      <w:r>
-        <w:t xml:space="preserve"> users at low cost, which may improve access for adolescents with limited financial resources. Since they can be used in private, they may also make stigma less of a barrier to seeking help. Self-help interventions can therefore reach adolescents who might otherwise stay outside the conventional treatment system. This direction is consistent with the WHO World Mental Health Report, which calls for accessible and scalable mental health support in settings where existing services are insufficient (World Health Organization, 2022).</w:t>
+        <w:t>Self-help interventions can help to address these three barriers. They require little or no direct therapist time, which reduces demand on the limited specialist workforce. They can also reach a large number of users at low cost, which may improve access for adolescents with limited financial resources. Since they can be used in private, they may also make stigma less of a barrier to seeking help. Self-help interventions can therefore reach adolescents who might otherwise stay outside the conventional treatment system. This direction is consistent with the WHO World Mental Health Report, which calls for accessible and scalable mental health support in settings where existing services are insufficient (World Health Organization, 2022).</w:t>
       </w:r>
     </w:p>
     <w:p>
@@ -900,15 +884,7 @@
         <w:jc w:val="both"/>
       </w:pPr>
       <w:r>
-        <w:t xml:space="preserve">These barriers are not only practical but also relational. Family involvement is not always a neutral pathway to care. Family processes, including low parental warmth, inter-parental conflict, over-involvement, aversiveness, and limited autonomy granting, have been associated with depression and anxiety in young people (Yap et al., 2014). Parents may therefore function not only as facilitators of care, but in some circumstances also as barriers to access (Platell et al., 2023). In such contexts, unguided self-help CBT may provide a practical route to structured psychological support when access through families or formal services is difficult. The ecological constraints of adolescent help-seeking, together with the developmental capacities discussed above, support examining unguided self-help CBT as a clinically and developmentally meaningful intervention </w:t>
-      </w:r>
-      <w:proofErr w:type="gramStart"/>
-      <w:r>
-        <w:t>format in its own right</w:t>
-      </w:r>
-      <w:proofErr w:type="gramEnd"/>
-      <w:r>
-        <w:t>.</w:t>
+        <w:t>These barriers are not only practical but also relational. Family involvement is not always a neutral pathway to care. Family processes, including low parental warmth, inter-parental conflict, over-involvement, aversiveness, and limited autonomy granting, have been associated with depression and anxiety in young people (Yap et al., 2014). Parents may therefore function not only as facilitators of care, but in some circumstances also as barriers to access (Platell et al., 2023). In such contexts, unguided self-help CBT may provide a practical route to structured psychological support when access through families or formal services is difficult. The ecological constraints of adolescent help-seeking, together with the developmental capacities discussed above, support examining unguided self-help CBT as a clinically and developmentally meaningful intervention format in its own right.</w:t>
       </w:r>
     </w:p>
     <w:p>
@@ -1149,15 +1125,7 @@
       </w:r>
       <w:r>
         <w:lastRenderedPageBreak/>
-        <w:t xml:space="preserve">individuals show characteristic patterns of negative automatic thoughts and dysfunctional beliefs about the self, the world, and the future. These cognitive patterns are activated under stress and serve to maintain depressive mood and behavior (Beck, 1967; Beck, Rush, Shaw, &amp; Emery, 1979). Behavior therapy, which developed in parallel, applied principles of reinforcement, punishment, and extinction </w:t>
-      </w:r>
-      <w:proofErr w:type="gramStart"/>
-      <w:r>
-        <w:t>in order to</w:t>
-      </w:r>
-      <w:proofErr w:type="gramEnd"/>
-      <w:r>
-        <w:t xml:space="preserve"> modify maladaptive behavioral patterns and to increase engagement in activities likely to produce positive reinforcement. The integration of these two traditions, together with the addition of emotion as a central variable, gave rise to CBT. In the CBT framework, cognition, behavior, and emotion are understood as three components that interact reciprocally, so that a change in any one of them influences the others.</w:t>
+        <w:t>individuals show characteristic patterns of negative automatic thoughts and dysfunctional beliefs about the self, the world, and the future. These cognitive patterns are activated under stress and serve to maintain depressive mood and behavior (Beck, 1967; Beck, Rush, Shaw, &amp; Emery, 1979). Behavior therapy, which developed in parallel, applied principles of reinforcement, punishment, and extinction in order to modify maladaptive behavioral patterns and to increase engagement in activities likely to produce positive reinforcement. The integration of these two traditions, together with the addition of emotion as a central variable, gave rise to CBT. In the CBT framework, cognition, behavior, and emotion are understood as three components that interact reciprocally, so that a change in any one of them influences the others.</w:t>
       </w:r>
     </w:p>
     <w:p>
@@ -1215,15 +1183,7 @@
       </w:r>
       <w:r>
         <w:lastRenderedPageBreak/>
-        <w:t xml:space="preserve">improving sleep hygiene, practicing relaxation, taking up new hobbies, or spending time in nature. Self-support refers to situations in which a professional provides some degree of suggestion, monitoring, or guidance </w:t>
-      </w:r>
-      <w:proofErr w:type="gramStart"/>
-      <w:r>
-        <w:t>in order to</w:t>
-      </w:r>
-      <w:proofErr w:type="gramEnd"/>
-      <w:r>
-        <w:t xml:space="preserve"> help the individual sustain new practices. Self-change refers to situations in which an individual in a harmful state decides, with or without external assistance, to relinquish destructive behavior and adopt more adaptive alternatives.</w:t>
+        <w:t>improving sleep hygiene, practicing relaxation, taking up new hobbies, or spending time in nature. Self-support refers to situations in which a professional provides some degree of suggestion, monitoring, or guidance in order to help the individual sustain new practices. Self-change refers to situations in which an individual in a harmful state decides, with or without external assistance, to relinquish destructive behavior and adopt more adaptive alternatives.</w:t>
       </w:r>
     </w:p>
     <w:p>
@@ -1295,15 +1255,7 @@
         <w:jc w:val="both"/>
       </w:pPr>
       <w:r>
-        <w:t xml:space="preserve">Automated encouragement refers to pre-scripted, fixed prompts or messages that are generated by the program itself </w:t>
-      </w:r>
-      <w:proofErr w:type="gramStart"/>
-      <w:r>
-        <w:t>in order to</w:t>
-      </w:r>
-      <w:proofErr w:type="gramEnd"/>
-      <w:r>
-        <w:t xml:space="preserve"> encourage continued engagement. These prompts must not include guidance on therapeutic content.</w:t>
+        <w:t>Automated encouragement refers to pre-scripted, fixed prompts or messages that are generated by the program itself in order to encourage continued engagement. These prompts must not include guidance on therapeutic content.</w:t>
       </w:r>
     </w:p>
     <w:p>
@@ -1313,15 +1265,7 @@
         <w:jc w:val="both"/>
       </w:pPr>
       <w:r>
-        <w:t xml:space="preserve">Human encouragement refers to prompts or messages that are prepared and delivered by a person, for example through email, SMS, or telephone, </w:t>
-      </w:r>
-      <w:proofErr w:type="gramStart"/>
-      <w:r>
-        <w:t>in order to</w:t>
-      </w:r>
-      <w:proofErr w:type="gramEnd"/>
-      <w:r>
-        <w:t xml:space="preserve"> encourage engagement. Like automated encouragement, these prompts must not include guidance on therapeutic content. Peer support delivered through moderated discussion groups is also classified as human encouragement.</w:t>
+        <w:t>Human encouragement refers to prompts or messages that are prepared and delivered by a person, for example through email, SMS, or telephone, in order to encourage engagement. Like automated encouragement, these prompts must not include guidance on therapeutic content. Peer support delivered through moderated discussion groups is also classified as human encouragement.</w:t>
       </w:r>
     </w:p>
     <w:p>
@@ -1417,15 +1361,7 @@
         <w:jc w:val="both"/>
       </w:pPr>
       <w:r>
-        <w:t xml:space="preserve">The three reviews together point to several remaining gaps that the present meta-analysis aims to address. First, adolescent-specific evidence on unguided self-help CBT has not been comprehensively synthesized using a support-level framework that is independent from the guided/unguided distinction. Second, existing syntheses have generally not examined whether effect sizes differ systematically by control type, specifically between passive controls (waitlist, TAU, no treatment) and minimally active controls (attention or information-only), even though the choice of comparator can substantially shape apparent effect sizes. Third, depression in adolescence often overlaps with adjacent presentations such as suicidality, self-harm, and bereavement-related emotional difficulties (Herrman et al., 2022). Suicidal ideation is a recognized component of depressive symptomatology, self-harm frequently co-occurs with depressive disorders, and bereavement-related presentations may overlap with or precipitate depressive episodes. By including trials in which depression was assessed as a central outcome alongside these presentations, the present study aims to characterize the reach of unguided self-help CBT across the clinically proximal range in which it is </w:t>
-      </w:r>
-      <w:proofErr w:type="gramStart"/>
-      <w:r>
-        <w:t>actually deployed</w:t>
-      </w:r>
-      <w:proofErr w:type="gramEnd"/>
-      <w:r>
-        <w:t>.</w:t>
+        <w:t>The three reviews together point to several remaining gaps that the present meta-analysis aims to address. First, adolescent-specific evidence on unguided self-help CBT has not been comprehensively synthesized using a support-level framework that is independent from the guided/unguided distinction. Second, existing syntheses have generally not examined whether effect sizes differ systematically by control type, specifically between passive controls (waitlist, TAU, no treatment) and minimally active controls (attention or information-only), even though the choice of comparator can substantially shape apparent effect sizes. Third, depression in adolescence often overlaps with adjacent presentations such as suicidality, self-harm, and bereavement-related emotional difficulties (Herrman et al., 2022). Suicidal ideation is a recognized component of depressive symptomatology, self-harm frequently co-occurs with depressive disorders, and bereavement-related presentations may overlap with or precipitate depressive episodes. By including trials in which depression was assessed as a central outcome alongside these presentations, the present study aims to characterize the reach of unguided self-help CBT across the clinically proximal range in which it is actually deployed.</w:t>
       </w:r>
     </w:p>
     <w:bookmarkEnd w:id="2"/>
@@ -1511,7 +1447,6 @@
         <w:t xml:space="preserve">The search strategy was constructed from four concept blocks combined with the Boolean AND operator: (1) adolescent population, (2) depression, (3) cognitive behavioral therapy, and (4) unguided self-help and digital delivery modalities. Within each block, </w:t>
       </w:r>
       <w:proofErr w:type="spellStart"/>
-      <w:proofErr w:type="gramStart"/>
       <w:r>
         <w:rPr>
           <w:rFonts w:eastAsia="Times New Roman"/>
@@ -1519,7 +1454,6 @@
         <w:t>MeSH</w:t>
       </w:r>
       <w:proofErr w:type="spellEnd"/>
-      <w:proofErr w:type="gramEnd"/>
       <w:r>
         <w:rPr>
           <w:rFonts w:eastAsia="Times New Roman"/>
@@ -1537,21 +1471,7 @@
         <w:rPr>
           <w:rFonts w:eastAsia="Times New Roman"/>
         </w:rPr>
-        <w:t xml:space="preserve">No restrictions were placed on language at the search stage, and non-English records were screened with translation support where feasible. No restrictions were placed on publication status. Grey literature, including doctoral dissertations and preprints, was retained at the search stage </w:t>
-      </w:r>
-      <w:proofErr w:type="gramStart"/>
-      <w:r>
-        <w:rPr>
-          <w:rFonts w:eastAsia="Times New Roman"/>
-        </w:rPr>
-        <w:t>in order to</w:t>
-      </w:r>
-      <w:proofErr w:type="gramEnd"/>
-      <w:r>
-        <w:rPr>
-          <w:rFonts w:eastAsia="Times New Roman"/>
-        </w:rPr>
-        <w:t xml:space="preserve"> enhance the comprehensiveness of the review and to reduce the risk of publication bias (</w:t>
+        <w:t>No restrictions were placed on language at the search stage, and non-English records were screened with translation support where feasible. No restrictions were placed on publication status. Grey literature, including doctoral dissertations and preprints, was retained at the search stage in order to enhance the comprehensiveness of the review and to reduce the risk of publication bias (</w:t>
       </w:r>
       <w:proofErr w:type="spellStart"/>
       <w:r>
@@ -1656,21 +1576,7 @@
         <w:rPr>
           <w:rFonts w:eastAsia="Times New Roman"/>
         </w:rPr>
-        <w:t xml:space="preserve">Studies were eligible for inclusion when they satisfied </w:t>
-      </w:r>
-      <w:proofErr w:type="gramStart"/>
-      <w:r>
-        <w:rPr>
-          <w:rFonts w:eastAsia="Times New Roman"/>
-        </w:rPr>
-        <w:t>all of</w:t>
-      </w:r>
-      <w:proofErr w:type="gramEnd"/>
-      <w:r>
-        <w:rPr>
-          <w:rFonts w:eastAsia="Times New Roman"/>
-        </w:rPr>
-        <w:t xml:space="preserve"> the following criteria.</w:t>
+        <w:t>Studies were eligible for inclusion when they satisfied all of the following criteria.</w:t>
       </w:r>
     </w:p>
     <w:p>
@@ -1777,15 +1683,7 @@
       </w:r>
       <w:r>
         <w:lastRenderedPageBreak/>
-        <w:t xml:space="preserve">component (behavioral activation, problem-solving). Component definitions followed the framework summarized in Section 2.4 and Appendix B. Interventions delivered through </w:t>
-      </w:r>
-      <w:proofErr w:type="gramStart"/>
-      <w:r>
-        <w:t>artificial-intelligence</w:t>
-      </w:r>
-      <w:proofErr w:type="gramEnd"/>
-      <w:r>
-        <w:t xml:space="preserve"> chatbots that autonomously deliver CBT content without human therapist involvement were eligible as a form of unguided self-help.</w:t>
+        <w:t>component (behavioral activation, problem-solving). Component definitions followed the framework summarized in Section 2.4 and Appendix B. Interventions delivered through artificial-intelligence chatbots that autonomously deliver CBT content without human therapist involvement were eligible as a form of unguided self-help.</w:t>
       </w:r>
     </w:p>
     <w:p>
@@ -1809,21 +1707,7 @@
         <w:rPr>
           <w:rFonts w:eastAsia="Times New Roman"/>
         </w:rPr>
-        <w:t xml:space="preserve"> The comparator arm was required to be a non-active control condition. Non-active controls included waitlist, treatment-as-usual (TAU), no treatment, attention control, and information-only control. TAU was interpreted as the standard care that a participant would have received regardless of trial </w:t>
-      </w:r>
-      <w:proofErr w:type="gramStart"/>
-      <w:r>
-        <w:rPr>
-          <w:rFonts w:eastAsia="Times New Roman"/>
-        </w:rPr>
-        <w:t>participation, and</w:t>
-      </w:r>
-      <w:proofErr w:type="gramEnd"/>
-      <w:r>
-        <w:rPr>
-          <w:rFonts w:eastAsia="Times New Roman"/>
-        </w:rPr>
-        <w:t xml:space="preserve"> was therefore treated as non-active. For subgroup analysis, the comparator was further classified as passive (waitlist, TAU, no treatment) or minimally active (attention control, information-only control), reflecting evidence that the choice of comparator can substantially shape apparent effect sizes.</w:t>
+        <w:t xml:space="preserve"> The comparator arm was required to be a non-active control condition. Non-active controls included waitlist, treatment-as-usual (TAU), no treatment, attention control, and information-only control. TAU was interpreted as the standard care that a participant would have received regardless of trial participation, and was therefore treated as non-active. For subgroup analysis, the comparator was further classified as passive (waitlist, TAU, no treatment) or minimally active (attention control, information-only control), reflecting evidence that the choice of comparator can substantially shape apparent effect sizes.</w:t>
       </w:r>
     </w:p>
     <w:p>
@@ -6089,25 +5973,7 @@
           <w:sz w:val="20"/>
           <w:szCs w:val="20"/>
         </w:rPr>
-        <w:t xml:space="preserve">-dash (—) indicates that the measure is typically used with a single validated cutoff rather than with graduated severity bands. Where multiple cutoffs are in use, the </w:t>
-      </w:r>
-      <w:proofErr w:type="gramStart"/>
-      <w:r>
-        <w:rPr>
-          <w:rFonts w:eastAsia="Times New Roman"/>
-          <w:sz w:val="20"/>
-          <w:szCs w:val="20"/>
-        </w:rPr>
-        <w:t>most commonly cited</w:t>
-      </w:r>
-      <w:proofErr w:type="gramEnd"/>
-      <w:r>
-        <w:rPr>
-          <w:rFonts w:eastAsia="Times New Roman"/>
-          <w:sz w:val="20"/>
-          <w:szCs w:val="20"/>
-        </w:rPr>
-        <w:t xml:space="preserve"> is listed first, with alternatives in parentheses. The Clinical Cutoff column reflects the threshold used for establishing baseline eligibility; baseline severity for subgroup analysis (Subclinical, Mild-to-Moderate, Moderate, Severe) is classified using these cutoffs together with the reported baseline mean and standard deviation.</w:t>
+        <w:t>-dash (—) indicates that the measure is typically used with a single validated cutoff rather than with graduated severity bands. Where multiple cutoffs are in use, the most commonly cited is listed first, with alternatives in parentheses. The Clinical Cutoff column reflects the threshold used for establishing baseline eligibility; baseline severity for subgroup analysis (Subclinical, Mild-to-Moderate, Moderate, Severe) is classified using these cutoffs together with the reported baseline mean and standard deviation.</w:t>
       </w:r>
     </w:p>
     <w:p>
@@ -6605,15 +6471,7 @@
         <w:jc w:val="both"/>
       </w:pPr>
       <w:r>
-        <w:t xml:space="preserve">When a single trial reported multiple follow-up assessments within the same window, one assessment was selected for each window according to the following rules. For the short- and medium-term windows, the assessment closest to the midpoint of the window was retained. For the long-term window, the 12-month assessment was prioritized; when 12-month data were not available, the available long-term assessment closest to 12 months was used. The remaining assessments were retained in the database for descriptive reporting but were not entered into the corresponding pooled analysis, </w:t>
-      </w:r>
-      <w:proofErr w:type="gramStart"/>
-      <w:r>
-        <w:t>in order to</w:t>
-      </w:r>
-      <w:proofErr w:type="gramEnd"/>
-      <w:r>
-        <w:t xml:space="preserve"> avoid unit-of-analysis errors arising from the inclusion of multiple non-independent estimates from a single trial.</w:t>
+        <w:t>When a single trial reported multiple follow-up assessments within the same window, one assessment was selected for each window according to the following rules. For the short- and medium-term windows, the assessment closest to the midpoint of the window was retained. For the long-term window, the 12-month assessment was prioritized; when 12-month data were not available, the available long-term assessment closest to 12 months was used. The remaining assessments were retained in the database for descriptive reporting but were not entered into the corresponding pooled analysis, in order to avoid unit-of-analysis errors arising from the inclusion of multiple non-independent estimates from a single trial.</w:t>
       </w:r>
     </w:p>
     <w:bookmarkEnd w:id="3"/>
@@ -6816,15 +6674,7 @@
       </w:r>
       <w:proofErr w:type="spellEnd"/>
       <w:r>
-        <w:t xml:space="preserve"> activation was not examined as a single-component contrast because it was present in </w:t>
-      </w:r>
-      <w:proofErr w:type="gramStart"/>
-      <w:r>
-        <w:t>the substantial majority of</w:t>
-      </w:r>
-      <w:proofErr w:type="gramEnd"/>
-      <w:r>
-        <w:t xml:space="preserve"> included programs, leaving the absent subgroup with </w:t>
+        <w:t xml:space="preserve"> activation was not examined as a single-component contrast because it was present in the substantial majority of included programs, leaving the absent subgroup with </w:t>
       </w:r>
       <w:r>
         <w:lastRenderedPageBreak/>
@@ -6857,23 +6707,7 @@
         <w:jc w:val="both"/>
       </w:pPr>
       <w:r>
-        <w:t xml:space="preserve">Five sensitivity analyses were pre-specified to examine the robustness of the main findings. First, the pooled estimate was recomputed restricting to peer-reviewed journal articles, </w:t>
-      </w:r>
-      <w:proofErr w:type="gramStart"/>
-      <w:r>
-        <w:t>in order to</w:t>
-      </w:r>
-      <w:proofErr w:type="gramEnd"/>
-      <w:r>
-        <w:t xml:space="preserve"> examine the influence of including dissertations and preprints. Second, the pooled estimate was recomputed under a clinically restricted subset, defined as the subset of trials with baseline severity meeting an established clinical cutoff and with a treatment-focused rather than indicated-prevention intent; trials failing either condition </w:t>
-      </w:r>
-      <w:proofErr w:type="gramStart"/>
-      <w:r>
-        <w:t>were</w:t>
-      </w:r>
-      <w:proofErr w:type="gramEnd"/>
-      <w:r>
-        <w:t xml:space="preserve"> excluded. Third, the pooled estimate was recomputed restricting to trials in which depressive symptoms were the primary treatment target, with trials in which depression was assessed alongside another primary target (such as self-harm, suicidal ideation, peer violence, or insomnia) excluded. Fourth, the pooled estimate was recomputed excluding minimal-intensity programs, defined as those with an estimated intended weekly dose of 15 minutes per week or less. Self-paced or on-demand interventions without a fixed intended weekly dose were retained in this analysis rather than excluded, on the basis that not estimable does not equate to low dose. Fifth, a leave-one-out sensitivity analysis was conducted to identify any single study disproportionately influencing the pooled effect.</w:t>
+        <w:t>Five sensitivity analyses were pre-specified to examine the robustness of the main findings. First, the pooled estimate was recomputed restricting to peer-reviewed journal articles, in order to examine the influence of including dissertations and preprints. Second, the pooled estimate was recomputed under a clinically restricted subset, defined as the subset of trials with baseline severity meeting an established clinical cutoff and with a treatment-focused rather than indicated-prevention intent; trials failing either condition were excluded. Third, the pooled estimate was recomputed restricting to trials in which depressive symptoms were the primary treatment target, with trials in which depression was assessed alongside another primary target (such as self-harm, suicidal ideation, peer violence, or insomnia) excluded. Fourth, the pooled estimate was recomputed excluding minimal-intensity programs, defined as those with an estimated intended weekly dose of 15 minutes per week or less. Self-paced or on-demand interventions without a fixed intended weekly dose were retained in this analysis rather than excluded, on the basis that not estimable does not equate to low dose. Fifth, a leave-one-out sensitivity analysis was conducted to identify any single study disproportionately influencing the pooled effect.</w:t>
       </w:r>
     </w:p>
     <w:p>
@@ -7329,15 +7163,7 @@
       </w:r>
       <w:proofErr w:type="spellEnd"/>
       <w:r>
-        <w:t xml:space="preserve"> recruited on the basis of general adolescent mental health concerns without a depression severity threshold (O'Dea et al., 2020). Most other trials neither targeted nor systematically excluded comorbidity, recruiting </w:t>
-      </w:r>
-      <w:proofErr w:type="gramStart"/>
-      <w:r>
-        <w:t>on the basis of</w:t>
-      </w:r>
-      <w:proofErr w:type="gramEnd"/>
-      <w:r>
-        <w:t xml:space="preserve"> elevated depressive symptoms regardless of co-occurring anxiety or other internalizing symptoms. Active psychosis, bipolar disorder, current acute suicidality, and ongoing concurrent psychotherapy were the most consistently applied exclusion criteria.</w:t>
+        <w:t xml:space="preserve"> recruited on the basis of general adolescent mental health concerns without a depression severity threshold (O'Dea et al., 2020). Most other trials neither targeted nor systematically excluded comorbidity, recruiting on the basis of elevated depressive symptoms regardless of co-occurring anxiety or other internalizing symptoms. Active psychosis, bipolar disorder, current acute suicidality, and ongoing concurrent psychotherapy were the most consistently applied exclusion criteria.</w:t>
       </w:r>
     </w:p>
     <w:p>
@@ -7434,15 +7260,7 @@
       </w:r>
       <w:proofErr w:type="spellEnd"/>
       <w:r>
-        <w:t>) to 8 months of web-based modules (Grasp the Opportunity). Most programs were designed to be completed within a 4–</w:t>
-      </w:r>
-      <w:proofErr w:type="gramStart"/>
-      <w:r>
-        <w:t>8 week</w:t>
-      </w:r>
-      <w:proofErr w:type="gramEnd"/>
-      <w:r>
-        <w:t xml:space="preserve"> window, although several mobile-app interventions (</w:t>
+        <w:t>) to 8 months of web-based modules (Grasp the Opportunity). Most programs were designed to be completed within a 4–8 week window, although several mobile-app interventions (</w:t>
       </w:r>
       <w:proofErr w:type="spellStart"/>
       <w:r>
@@ -7617,13 +7435,8 @@
         <w:ind w:firstLine="360"/>
         <w:jc w:val="both"/>
       </w:pPr>
-      <w:bookmarkStart w:id="9" w:name="OLE_LINK11"/>
-      <w:r>
-        <w:t>Among the ten studies judged as having some concerns overall, six were driven by a single domain-level concern and four by concerns across multiple domains, corresponding to 60% and 40%, respectively. The most frequent source of some-concern judgements was Domain 2, bias due to deviations from intended interventions. T</w:t>
-      </w:r>
-      <w:bookmarkEnd w:id="9"/>
-      <w:r>
-        <w:t>his pattern largely reflected the open-label design of unguided self-help trials, particularly when interventions were compared with non-active or minimally active control conditions. The specific combinations of domains driving these judgements varied across studies. Domain 2 appeared most frequently, followed by concerns related to selection of the reported result (D5) and missing outcome data (D3), while concerns in randomization (D1) and outcome measurement (D4) were less frequent.</w:t>
+      <w:r>
+        <w:t>Among the ten studies judged as having some concerns overall, five were driven by a single domain-level concern and five by concerns across multiple domains. The most frequent source of domain-level some-concern judgements was Domain 2, bias due to deviations from intended interventions. This pattern largely reflected the difficulty of blinding participants and personnel in unguided self-help interventions, particularly when interventions were compared with non-active or minimally active control conditions. Concerns related to selection of the reported result also appeared in several studies, while concerns in randomization and outcome measurement were less frequent.</w:t>
       </w:r>
     </w:p>
     <w:p>
@@ -7633,16 +7446,15 @@
         <w:jc w:val="both"/>
       </w:pPr>
       <w:r>
-        <w:t xml:space="preserve">All studies judged as being at high overall risk of bias were driven by Domain 3, missing outcome data. These included Bohr et al. (2023), Wright et al. (2020), and Ackerson et al. (1998). Therefore, the pooled findings should be interpreted with caution, particularly in relation to attrition and incomplete outcome data. Of these three high-risk studies, Bohr et al. (2023) was retained only for the sensitivity analysis owing to the absence of an </w:t>
-      </w:r>
-      <w:proofErr w:type="spellStart"/>
-      <w:r>
-        <w:t>intracluster</w:t>
-      </w:r>
-      <w:proofErr w:type="spellEnd"/>
-      <w:r>
-        <w:t xml:space="preserve"> correlation coefficient. The main pooled estimate is therefore influenced by two high-risk studies, Wright et al. (2020) and Ackerson et al. (1998).</w:t>
-      </w:r>
+        <w:t>All studies judged as being at high overall risk of bias were driven by Domain 3, bias due to missing outcome data. These included Bohr et al. (2023), Wright et al. (2020), and Ackerson et al. (1998). Thus, while deviations from intended interventions were the most common source of moderate concern across the evidence base, missing outcome data represented the main source of serious bias.</w:t>
+      </w:r>
+    </w:p>
+    <w:p>
+      <w:pPr>
+        <w:spacing w:after="120" w:line="360" w:lineRule="auto"/>
+        <w:ind w:firstLine="360"/>
+        <w:jc w:val="both"/>
+      </w:pPr>
     </w:p>
     <w:bookmarkEnd w:id="7"/>
     <w:p>
@@ -7716,14 +7528,13 @@
       </w:pPr>
       <w:r>
         <w:rPr>
-          <w:rFonts w:hint="eastAsia"/>
           <w:noProof/>
         </w:rPr>
         <w:drawing>
-          <wp:inline distT="0" distB="0" distL="0" distR="0" wp14:anchorId="32300EC5" wp14:editId="035BE320">
+          <wp:inline distT="0" distB="0" distL="0" distR="0" wp14:anchorId="2590F4A8" wp14:editId="1EBDB50C">
             <wp:extent cx="5943600" cy="2797175"/>
             <wp:effectExtent l="0" t="0" r="0" b="3175"/>
-            <wp:docPr id="356044980" name="图片 17" descr="图表, 条形图&#10;&#10;描述已自动生成"/>
+            <wp:docPr id="533423545" name="图片 3" descr="图表, 条形图&#10;&#10;描述已自动生成"/>
             <wp:cNvGraphicFramePr>
               <a:graphicFrameLocks xmlns:a="http://schemas.openxmlformats.org/drawingml/2006/main" noChangeAspect="1"/>
             </wp:cNvGraphicFramePr>
@@ -7731,7 +7542,7 @@
               <a:graphicData uri="http://schemas.openxmlformats.org/drawingml/2006/picture">
                 <pic:pic xmlns:pic="http://schemas.openxmlformats.org/drawingml/2006/picture">
                   <pic:nvPicPr>
-                    <pic:cNvPr id="356044980" name="图片 17" descr="图表, 条形图&#10;&#10;描述已自动生成"/>
+                    <pic:cNvPr id="533423545" name="图片 3" descr="图表, 条形图&#10;&#10;描述已自动生成"/>
                     <pic:cNvPicPr/>
                   </pic:nvPicPr>
                   <pic:blipFill>
@@ -7767,10 +7578,10 @@
         </w:rPr>
         <w:lastRenderedPageBreak/>
         <w:drawing>
-          <wp:inline distT="0" distB="0" distL="0" distR="0" wp14:anchorId="26A21581" wp14:editId="5A3728EF">
+          <wp:inline distT="0" distB="0" distL="0" distR="0" wp14:anchorId="5B8D860D" wp14:editId="50B3D9F7">
             <wp:extent cx="5943600" cy="7726680"/>
             <wp:effectExtent l="0" t="0" r="0" b="7620"/>
-            <wp:docPr id="2110923058" name="图片 1" descr="图片包含 图表&#10;&#10;描述已自动生成"/>
+            <wp:docPr id="170169257" name="图片 4" descr="图片包含 图表&#10;&#10;描述已自动生成"/>
             <wp:cNvGraphicFramePr>
               <a:graphicFrameLocks xmlns:a="http://schemas.openxmlformats.org/drawingml/2006/main" noChangeAspect="1"/>
             </wp:cNvGraphicFramePr>
@@ -7778,7 +7589,7 @@
               <a:graphicData uri="http://schemas.openxmlformats.org/drawingml/2006/picture">
                 <pic:pic xmlns:pic="http://schemas.openxmlformats.org/drawingml/2006/picture">
                   <pic:nvPicPr>
-                    <pic:cNvPr id="2110923058" name="图片 1" descr="图片包含 图表&#10;&#10;描述已自动生成"/>
+                    <pic:cNvPr id="170169257" name="图片 4" descr="图片包含 图表&#10;&#10;描述已自动生成"/>
                     <pic:cNvPicPr/>
                   </pic:nvPicPr>
                   <pic:blipFill>
@@ -7829,7 +7640,8 @@
           <w:szCs w:val="24"/>
         </w:rPr>
       </w:pPr>
-      <w:bookmarkStart w:id="10" w:name="OLE_LINK19"/>
+      <w:bookmarkStart w:id="9" w:name="OLE_LINK19"/>
+      <w:bookmarkStart w:id="10" w:name="OLE_LINK11"/>
       <w:r>
         <w:rPr>
           <w:rFonts w:hint="eastAsia"/>
@@ -7868,34 +7680,48 @@
         <w:jc w:val="both"/>
       </w:pPr>
       <w:bookmarkStart w:id="11" w:name="OLE_LINK26"/>
-      <w:bookmarkEnd w:id="10"/>
-      <w:r>
-        <w:t xml:space="preserve">Fourteen studies contributed effect sizes at post-intervention. Under a random-effects model using the REML estimator and Hartung-Knapp adjustment, the pooled Hedges' g was 0.27, 95% CI [0.06, 0.47], </w:t>
-      </w:r>
-      <w:proofErr w:type="gramStart"/>
-      <w:r>
-        <w:rPr>
-          <w:i/>
-          <w:iCs/>
-        </w:rPr>
-        <w:t>t</w:t>
-      </w:r>
-      <w:r>
-        <w:t>(</w:t>
-      </w:r>
-      <w:proofErr w:type="gramEnd"/>
-      <w:r>
-        <w:t xml:space="preserve">13) = 2.80, </w:t>
-      </w:r>
-      <w:r>
-        <w:rPr>
-          <w:i/>
-          <w:iCs/>
-        </w:rPr>
-        <w:t>p</w:t>
-      </w:r>
-      <w:r>
-        <w:t xml:space="preserve"> = .015, indicating a benefit of unguided self-help CBT interventions over control conditions (Figure 3).</w:t>
+      <w:bookmarkEnd w:id="9"/>
+      <w:r>
+        <w:t>Fourteen studies contributed effect sizes at post-intervention, including 1,</w:t>
+      </w:r>
+      <w:r>
+        <w:rPr>
+          <w:rFonts w:hint="eastAsia"/>
+        </w:rPr>
+        <w:t>913</w:t>
+      </w:r>
+      <w:r>
+        <w:t xml:space="preserve"> participants in total, with 9</w:t>
+      </w:r>
+      <w:r>
+        <w:rPr>
+          <w:rFonts w:hint="eastAsia"/>
+        </w:rPr>
+        <w:t>44</w:t>
+      </w:r>
+      <w:r>
+        <w:t xml:space="preserve"> participants in the intervention conditions and 9</w:t>
+      </w:r>
+      <w:r>
+        <w:rPr>
+          <w:rFonts w:hint="eastAsia"/>
+        </w:rPr>
+        <w:t>69</w:t>
+      </w:r>
+      <w:r>
+        <w:t xml:space="preserve"> in the control conditions. Under a random-effects model using the REML estimator and Hartung-Knapp adjustment, the pooled Hedges’ g was 0.27, 95% CI [0.06, 0.47], t(13) = 2.8</w:t>
+      </w:r>
+      <w:r>
+        <w:rPr>
+          <w:rFonts w:hint="eastAsia"/>
+        </w:rPr>
+        <w:t>2</w:t>
+      </w:r>
+      <w:r>
+        <w:t>, p = .015, indicating a small but statistically significant benefit of unguided self-help CBT interventions over control conditions.</w:t>
+      </w:r>
+      <w:r>
+        <w:t xml:space="preserve"> (Figure 3).</w:t>
       </w:r>
     </w:p>
     <w:p>
@@ -7905,45 +7731,202 @@
         <w:jc w:val="both"/>
       </w:pPr>
       <w:r>
-        <w:t>Inspection of the forest plot revealed substantial dispersion in individual study estimates, ranging from g = −0.17 (O'Dea et al., 2020) to g = 1.51 (Fleming et al., 2012). Of the 14 trials, 12 yielded point estimates favoring the intervention condition, whereas two (</w:t>
-      </w:r>
-      <w:r>
-        <w:t>O'Dea et al., 2020;</w:t>
+        <w:t xml:space="preserve">Inspection of the forest plot revealed substantial dispersion in individual study estimates, ranging from g = −0.17 (O'Dea et al., 2020) to g = 1.51 (Fleming et al., 2012). Of the 14 trials, 12 yielded point estimates favoring the intervention condition, </w:t>
+      </w:r>
+      <w:r>
+        <w:t xml:space="preserve">whereas two produced estimates that did not favor the intervention (O'Dea et al., 2020, </w:t>
+      </w:r>
+      <w:r>
+        <w:rPr>
+          <w:i/>
+          <w:iCs/>
+        </w:rPr>
+        <w:t>g</w:t>
+      </w:r>
+      <w:r>
+        <w:t xml:space="preserve"> = −0.17; </w:t>
+      </w:r>
+      <w:proofErr w:type="spellStart"/>
+      <w:r>
+        <w:t>Poppelaars</w:t>
+      </w:r>
+      <w:proofErr w:type="spellEnd"/>
+      <w:r>
+        <w:t xml:space="preserve"> et al., 2016, </w:t>
+      </w:r>
+      <w:r>
+        <w:rPr>
+          <w:i/>
+          <w:iCs/>
+        </w:rPr>
+        <w:t>g</w:t>
+      </w:r>
+      <w:r>
+        <w:t xml:space="preserve"> = −0.01)</w:t>
+      </w:r>
+      <w:r>
+        <w:t xml:space="preserve">. Five trials had confidence intervals that excluded zero (Ackerson et al., 1998; Fleming et al., 2012; </w:t>
+      </w:r>
+      <w:proofErr w:type="spellStart"/>
+      <w:r>
+        <w:t>Makarushka</w:t>
+      </w:r>
+      <w:proofErr w:type="spellEnd"/>
+      <w:r>
+        <w:t>, 201</w:t>
       </w:r>
       <w:r>
         <w:rPr>
           <w:rFonts w:hint="eastAsia"/>
         </w:rPr>
-        <w:t xml:space="preserve"> </w:t>
-      </w:r>
-      <w:proofErr w:type="spellStart"/>
-      <w:r>
-        <w:rPr>
-          <w:rFonts w:hint="eastAsia"/>
-        </w:rPr>
-        <w:t>Poppelaars</w:t>
-      </w:r>
-      <w:proofErr w:type="spellEnd"/>
-      <w:r>
-        <w:rPr>
-          <w:rFonts w:hint="eastAsia"/>
-        </w:rPr>
-        <w:t>, 2016</w:t>
-      </w:r>
-      <w:r>
-        <w:t>)</w:t>
-      </w:r>
-      <w:r>
-        <w:t xml:space="preserve"> produced estimates near zero. Five trials had confidence intervals that excluded zero (Ackerson et al., 1998; Fleming et al., 2012; </w:t>
-      </w:r>
-      <w:proofErr w:type="spellStart"/>
-      <w:r>
-        <w:t>Makarushka</w:t>
-      </w:r>
-      <w:proofErr w:type="spellEnd"/>
-      <w:r>
-        <w:t>, 2012; Smith et al., 2015; O'Dea et al., 2025), whereas the remaining nine trials did not reach statistical significance at the individual-study level. Two trials, Ackerson et al. (1998) and Fleming et al. (2012), produced effect estimates substantially larger than most other studies, together with relatively wide confidence intervals, suggesting that they may have influenced the pooled estimate. Their influence is examined in the leave-one-out sensitivity analysis reported in Section 4.6.</w:t>
-      </w:r>
+        <w:t>1</w:t>
+      </w:r>
+      <w:r>
+        <w:t>; Smith et al., 2015; O'Dea et al., 2025), whereas the remaining nine trials did not reach statistical significance at the individual-study level. Two trials, Ackerson et al. (1998) and Fleming et al. (2012), produced effect estimates substantially larger than most other studies, together with relatively wide confidence intervals, suggesting that they may have influenced the pooled estimate. Their influence is examined in the leave-one-out sensitivity analysis reported in Section 4.6.</w:t>
+      </w:r>
+    </w:p>
+    <w:p>
+      <w:pPr>
+        <w:spacing w:after="120" w:line="360" w:lineRule="auto"/>
+        <w:jc w:val="both"/>
+        <w:rPr>
+          <w:b/>
+          <w:bCs/>
+          <w:noProof/>
+        </w:rPr>
+      </w:pPr>
+    </w:p>
+    <w:p>
+      <w:pPr>
+        <w:spacing w:after="120" w:line="360" w:lineRule="auto"/>
+        <w:jc w:val="both"/>
+        <w:rPr>
+          <w:b/>
+          <w:bCs/>
+          <w:noProof/>
+        </w:rPr>
+      </w:pPr>
+    </w:p>
+    <w:p>
+      <w:pPr>
+        <w:spacing w:after="120" w:line="360" w:lineRule="auto"/>
+        <w:jc w:val="both"/>
+        <w:rPr>
+          <w:b/>
+          <w:bCs/>
+          <w:noProof/>
+        </w:rPr>
+      </w:pPr>
+    </w:p>
+    <w:p>
+      <w:pPr>
+        <w:spacing w:after="120" w:line="360" w:lineRule="auto"/>
+        <w:jc w:val="both"/>
+        <w:rPr>
+          <w:b/>
+          <w:bCs/>
+          <w:noProof/>
+        </w:rPr>
+      </w:pPr>
+    </w:p>
+    <w:p>
+      <w:pPr>
+        <w:spacing w:after="120" w:line="360" w:lineRule="auto"/>
+        <w:jc w:val="both"/>
+        <w:rPr>
+          <w:b/>
+          <w:bCs/>
+          <w:noProof/>
+        </w:rPr>
+      </w:pPr>
+    </w:p>
+    <w:p>
+      <w:pPr>
+        <w:spacing w:after="120" w:line="360" w:lineRule="auto"/>
+        <w:jc w:val="both"/>
+        <w:rPr>
+          <w:b/>
+          <w:bCs/>
+          <w:noProof/>
+        </w:rPr>
+      </w:pPr>
+    </w:p>
+    <w:p>
+      <w:pPr>
+        <w:spacing w:after="120" w:line="360" w:lineRule="auto"/>
+        <w:jc w:val="both"/>
+        <w:rPr>
+          <w:b/>
+          <w:bCs/>
+          <w:noProof/>
+        </w:rPr>
+      </w:pPr>
+    </w:p>
+    <w:p>
+      <w:pPr>
+        <w:spacing w:after="120" w:line="360" w:lineRule="auto"/>
+        <w:jc w:val="both"/>
+        <w:rPr>
+          <w:b/>
+          <w:bCs/>
+          <w:noProof/>
+        </w:rPr>
+      </w:pPr>
+    </w:p>
+    <w:p>
+      <w:pPr>
+        <w:spacing w:after="120" w:line="360" w:lineRule="auto"/>
+        <w:jc w:val="both"/>
+        <w:rPr>
+          <w:b/>
+          <w:bCs/>
+          <w:noProof/>
+        </w:rPr>
+      </w:pPr>
+    </w:p>
+    <w:p>
+      <w:pPr>
+        <w:spacing w:after="120" w:line="360" w:lineRule="auto"/>
+        <w:jc w:val="both"/>
+        <w:rPr>
+          <w:b/>
+          <w:bCs/>
+          <w:noProof/>
+        </w:rPr>
+      </w:pPr>
+    </w:p>
+    <w:p>
+      <w:pPr>
+        <w:spacing w:after="120" w:line="360" w:lineRule="auto"/>
+        <w:jc w:val="both"/>
+        <w:rPr>
+          <w:b/>
+          <w:bCs/>
+          <w:noProof/>
+        </w:rPr>
+      </w:pPr>
+    </w:p>
+    <w:p>
+      <w:pPr>
+        <w:spacing w:after="120" w:line="360" w:lineRule="auto"/>
+        <w:jc w:val="both"/>
+        <w:rPr>
+          <w:b/>
+          <w:bCs/>
+          <w:noProof/>
+        </w:rPr>
+      </w:pPr>
+    </w:p>
+    <w:p>
+      <w:pPr>
+        <w:spacing w:after="120" w:line="360" w:lineRule="auto"/>
+        <w:jc w:val="both"/>
+        <w:rPr>
+          <w:b/>
+          <w:bCs/>
+          <w:noProof/>
+        </w:rPr>
+      </w:pPr>
     </w:p>
     <w:p>
       <w:pPr>
@@ -8014,14 +7997,13 @@
       </w:pPr>
       <w:r>
         <w:rPr>
-          <w:rFonts w:hint="eastAsia"/>
           <w:noProof/>
         </w:rPr>
         <w:drawing>
-          <wp:inline distT="0" distB="0" distL="0" distR="0" wp14:anchorId="2D38600B" wp14:editId="6C2DB028">
-            <wp:extent cx="5023092" cy="3817764"/>
-            <wp:effectExtent l="0" t="0" r="6350" b="0"/>
-            <wp:docPr id="1891334130" name="图片 29" descr="图片包含 图表&#10;&#10;描述已自动生成"/>
+          <wp:inline distT="0" distB="0" distL="0" distR="0" wp14:anchorId="5E79CE49" wp14:editId="68FB7B82">
+            <wp:extent cx="5943600" cy="4517390"/>
+            <wp:effectExtent l="0" t="0" r="0" b="0"/>
+            <wp:docPr id="1740318388" name="图片 1" descr="图片包含 图表&#10;&#10;描述已自动生成"/>
             <wp:cNvGraphicFramePr>
               <a:graphicFrameLocks xmlns:a="http://schemas.openxmlformats.org/drawingml/2006/main" noChangeAspect="1"/>
             </wp:cNvGraphicFramePr>
@@ -8029,7 +8011,7 @@
               <a:graphicData uri="http://schemas.openxmlformats.org/drawingml/2006/picture">
                 <pic:pic xmlns:pic="http://schemas.openxmlformats.org/drawingml/2006/picture">
                   <pic:nvPicPr>
-                    <pic:cNvPr id="1891334130" name="图片 29" descr="图片包含 图表&#10;&#10;描述已自动生成"/>
+                    <pic:cNvPr id="1740318388" name="图片 1" descr="图片包含 图表&#10;&#10;描述已自动生成"/>
                     <pic:cNvPicPr/>
                   </pic:nvPicPr>
                   <pic:blipFill>
@@ -8047,7 +8029,7 @@
                   <pic:spPr>
                     <a:xfrm>
                       <a:off x="0" y="0"/>
-                      <a:ext cx="5043666" cy="3833401"/>
+                      <a:ext cx="5943600" cy="4517390"/>
                     </a:xfrm>
                     <a:prstGeom prst="rect">
                       <a:avLst/>
@@ -8072,7 +8054,6 @@
           <w:i/>
           <w:iCs/>
         </w:rPr>
-        <w:lastRenderedPageBreak/>
         <w:t xml:space="preserve">Note. </w:t>
       </w:r>
       <w:r>
@@ -8134,15 +8115,56 @@
       </w:pPr>
       <w:bookmarkStart w:id="13" w:name="OLE_LINK13"/>
       <w:r>
-        <w:t xml:space="preserve">Between-study heterogeneity was moderate to high, </w:t>
-      </w:r>
-      <w:proofErr w:type="gramStart"/>
-      <w:r>
-        <w:t>Q(</w:t>
-      </w:r>
-      <w:proofErr w:type="gramEnd"/>
-      <w:r>
-        <w:t>13) = 35.34, p &lt; .001, I² = 63.2%, 95% CI [34.6%, 79.3%], τ² = 0.055, 95% CI [0.020, 0.425]. The corresponding τ value was 0.23, indicating that the dispersion of true effects across studies was nearly as large as the pooled effect itself (g = 0.27). This implies that even after accounting for sampling error, substantial between-study variability in true effects remained. The 95% prediction interval ranged from −0.27 to 0.80, suggesting that the true effect in a comparable future trial could plausibly range from a small negative effect to a moderate positive effect. This variability supports the need for the subgroup analyses, exploratory meta-regression, and sensitivity analyses reported in Sections 4.6 and 4.7.</w:t>
+        <w:t>Between-study heterogeneity was moderate to high, Q(13) = 35.</w:t>
+      </w:r>
+      <w:r>
+        <w:rPr>
+          <w:rFonts w:hint="eastAsia"/>
+        </w:rPr>
+        <w:t>39</w:t>
+      </w:r>
+      <w:r>
+        <w:t>, p &lt; .001, I² = 63.</w:t>
+      </w:r>
+      <w:r>
+        <w:rPr>
+          <w:rFonts w:hint="eastAsia"/>
+        </w:rPr>
+        <w:t>3</w:t>
+      </w:r>
+      <w:r>
+        <w:t>%, 95% CI [34.</w:t>
+      </w:r>
+      <w:r>
+        <w:rPr>
+          <w:rFonts w:hint="eastAsia"/>
+        </w:rPr>
+        <w:t>7</w:t>
+      </w:r>
+      <w:r>
+        <w:t>%, 79.</w:t>
+      </w:r>
+      <w:r>
+        <w:rPr>
+          <w:rFonts w:hint="eastAsia"/>
+        </w:rPr>
+        <w:t>3</w:t>
+      </w:r>
+      <w:r>
+        <w:t>%], τ² = 0.055, 95% CI [0.020, 0.42</w:t>
+      </w:r>
+      <w:r>
+        <w:rPr>
+          <w:rFonts w:hint="eastAsia"/>
+        </w:rPr>
+        <w:t>4</w:t>
+      </w:r>
+      <w:r>
+        <w:t xml:space="preserve">]. The corresponding τ value was 0.23, indicating that the dispersion of true effects across studies was nearly as large as the pooled effect itself (g = 0.27). This implies that even after accounting for sampling error, substantial between-study variability in true effects remained. The 95% prediction interval ranged from −0.27 to 0.80, suggesting that the true effect in a comparable </w:t>
+      </w:r>
+      <w:r>
+        <w:lastRenderedPageBreak/>
+        <w:t>future trial could plausibly range from a small negative effect to a moderate positive effect. This variability supports the need for the subgroup analyses, exploratory meta-regression, and sensitivity analyses reported in Sections 4.6 and 4.7.</w:t>
       </w:r>
     </w:p>
     <w:p>
@@ -8672,7 +8694,19 @@
               <w:rPr>
                 <w:rFonts w:hint="eastAsia"/>
               </w:rPr>
-              <w:t>2.80(13)</w:t>
+              <w:t>2.8</w:t>
+            </w:r>
+            <w:r>
+              <w:rPr>
+                <w:rFonts w:hint="eastAsia"/>
+              </w:rPr>
+              <w:t>2</w:t>
+            </w:r>
+            <w:r>
+              <w:rPr>
+                <w:rFonts w:hint="eastAsia"/>
+              </w:rPr>
+              <w:t>(13)</w:t>
             </w:r>
           </w:p>
         </w:tc>
@@ -8703,7 +8737,13 @@
               <w:jc w:val="center"/>
             </w:pPr>
             <w:r>
-              <w:t>35.34</w:t>
+              <w:t>35.</w:t>
+            </w:r>
+            <w:r>
+              <w:rPr>
+                <w:rFonts w:hint="eastAsia"/>
+              </w:rPr>
+              <w:t>39</w:t>
             </w:r>
             <w:r>
               <w:rPr>
@@ -8743,7 +8783,16 @@
               <w:jc w:val="center"/>
             </w:pPr>
             <w:r>
-              <w:t>63.2%</w:t>
+              <w:t>63.</w:t>
+            </w:r>
+            <w:r>
+              <w:rPr>
+                <w:rFonts w:hint="eastAsia"/>
+              </w:rPr>
+              <w:t>3</w:t>
+            </w:r>
+            <w:r>
+              <w:t>%</w:t>
             </w:r>
           </w:p>
           <w:p>
@@ -8752,7 +8801,25 @@
               <w:jc w:val="center"/>
             </w:pPr>
             <w:r>
-              <w:t>[34.6, 79.3]</w:t>
+              <w:t>[34.</w:t>
+            </w:r>
+            <w:r>
+              <w:rPr>
+                <w:rFonts w:hint="eastAsia"/>
+              </w:rPr>
+              <w:t>7</w:t>
+            </w:r>
+            <w:r>
+              <w:t>, 79.</w:t>
+            </w:r>
+            <w:r>
+              <w:rPr>
+                <w:rFonts w:hint="eastAsia"/>
+              </w:rPr>
+              <w:t>3</w:t>
+            </w:r>
+            <w:r>
+              <w:t>]</w:t>
             </w:r>
           </w:p>
         </w:tc>
@@ -8815,6 +8882,7 @@
       </w:r>
       <w:bookmarkEnd w:id="14"/>
     </w:p>
+    <w:bookmarkEnd w:id="10"/>
     <w:bookmarkEnd w:id="11"/>
     <w:bookmarkEnd w:id="15"/>
     <w:p>
@@ -8869,53 +8937,121 @@
           <w:sz w:val="24"/>
           <w:szCs w:val="24"/>
         </w:rPr>
-        <w:t xml:space="preserve">4.4.2 Overall Effects for different Lengths </w:t>
-      </w:r>
-      <w:proofErr w:type="gramStart"/>
+        <w:t>4.4.2 Overall Effects for different Lengths of  follow-up</w:t>
+      </w:r>
+    </w:p>
+    <w:p>
+      <w:pPr>
+        <w:spacing w:after="120" w:line="360" w:lineRule="auto"/>
+        <w:ind w:firstLine="360"/>
+        <w:jc w:val="both"/>
+        <w:rPr>
+          <w:b/>
+          <w:bCs/>
+        </w:rPr>
+      </w:pPr>
+      <w:bookmarkStart w:id="18" w:name="OLE_LINK27"/>
       <w:r>
         <w:rPr>
           <w:rFonts w:hint="eastAsia"/>
           <w:b/>
           <w:bCs/>
-          <w:sz w:val="24"/>
-          <w:szCs w:val="24"/>
-        </w:rPr>
-        <w:t>of  follow</w:t>
-      </w:r>
-      <w:proofErr w:type="gramEnd"/>
-      <w:r>
-        <w:rPr>
-          <w:rFonts w:hint="eastAsia"/>
-          <w:b/>
-          <w:bCs/>
-          <w:sz w:val="24"/>
-          <w:szCs w:val="24"/>
-        </w:rPr>
-        <w:t>-up</w:t>
-      </w:r>
-    </w:p>
+        </w:rPr>
+        <w:t>Short-term follow-up</w:t>
+      </w:r>
+    </w:p>
+    <w:bookmarkEnd w:id="18"/>
     <w:p>
       <w:pPr>
         <w:spacing w:after="120" w:line="360" w:lineRule="auto"/>
         <w:ind w:firstLine="360"/>
         <w:jc w:val="both"/>
-        <w:rPr>
-          <w:b/>
-          <w:bCs/>
-        </w:rPr>
-      </w:pPr>
-      <w:bookmarkStart w:id="18" w:name="OLE_LINK27"/>
+      </w:pPr>
       <w:r>
         <w:rPr>
           <w:rFonts w:hint="eastAsia"/>
-          <w:b/>
-          <w:bCs/>
-        </w:rPr>
-        <w:lastRenderedPageBreak/>
-        <w:t>Short-term follow-up</w:t>
-      </w:r>
-    </w:p>
-    <w:bookmarkEnd w:id="18"/>
+        </w:rPr>
+        <w:t xml:space="preserve"> </w:t>
+      </w:r>
+      <w:bookmarkStart w:id="19" w:name="OLE_LINK29"/>
+      <w:r>
+        <w:rPr>
+          <w:rFonts w:hint="eastAsia"/>
+        </w:rPr>
+        <w:t>Three studies (</w:t>
+      </w:r>
+      <w:r>
+        <w:t xml:space="preserve">O'Dea et al., 2020; </w:t>
+      </w:r>
+      <w:proofErr w:type="spellStart"/>
+      <w:r>
+        <w:t>Poppelaars</w:t>
+      </w:r>
+      <w:proofErr w:type="spellEnd"/>
+      <w:r>
+        <w:t xml:space="preserve"> et al., 2016; Stasiak et al., 2014</w:t>
+      </w:r>
+      <w:r>
+        <w:rPr>
+          <w:rFonts w:hint="eastAsia"/>
+        </w:rPr>
+        <w:t>) contributed effect sizes at short-term follow-up (</w:t>
+      </w:r>
+      <w:r>
+        <w:t>≤3 months post-intervention)</w:t>
+      </w:r>
+      <w:r>
+        <w:rPr>
+          <w:rFonts w:hint="eastAsia"/>
+        </w:rPr>
+        <w:t xml:space="preserve">. </w:t>
+      </w:r>
+      <w:r>
+        <w:t>Under a random-effects model with REML estimator and Hartung-Knapp adjustment, the pooled Hedges' g was 0.01</w:t>
+      </w:r>
+      <w:r>
+        <w:rPr>
+          <w:rFonts w:hint="eastAsia"/>
+        </w:rPr>
+        <w:t>8</w:t>
+      </w:r>
+      <w:r>
+        <w:t xml:space="preserve"> (95% CI [−0.34, 0.3</w:t>
+      </w:r>
+      <w:r>
+        <w:rPr>
+          <w:rFonts w:hint="eastAsia"/>
+        </w:rPr>
+        <w:t>8</w:t>
+      </w:r>
+      <w:r>
+        <w:t>], t(2) = 0.</w:t>
+      </w:r>
+      <w:r>
+        <w:rPr>
+          <w:rFonts w:hint="eastAsia"/>
+        </w:rPr>
+        <w:t>21</w:t>
+      </w:r>
+      <w:r>
+        <w:t>, p = .8</w:t>
+      </w:r>
+      <w:r>
+        <w:rPr>
+          <w:rFonts w:hint="eastAsia"/>
+        </w:rPr>
+        <w:t>51</w:t>
+      </w:r>
+      <w:r>
+        <w:t xml:space="preserve">), </w:t>
+      </w:r>
+      <w:r>
+        <w:t>indicating no detectable benefit of unguided self-help CBTs over control conditions at this timepoint (Figure 4)</w:t>
+      </w:r>
+      <w:r>
+        <w:t>.</w:t>
+      </w:r>
+    </w:p>
     <w:p>
       <w:pPr>
         <w:spacing w:after="120" w:line="360" w:lineRule="auto"/>
@@ -8923,78 +9059,25 @@
         <w:jc w:val="both"/>
       </w:pPr>
       <w:r>
+        <w:t>Between-study heterogeneity was negligible (Q(2) = 0.8</w:t>
+      </w:r>
+      <w:r>
         <w:rPr>
           <w:rFonts w:hint="eastAsia"/>
         </w:rPr>
-        <w:t xml:space="preserve"> </w:t>
-      </w:r>
-      <w:bookmarkStart w:id="19" w:name="OLE_LINK29"/>
+        <w:t>8</w:t>
+      </w:r>
+      <w:r>
+        <w:t>, p = .6</w:t>
+      </w:r>
       <w:r>
         <w:rPr>
           <w:rFonts w:hint="eastAsia"/>
         </w:rPr>
-        <w:t>Three studies (</w:t>
-      </w:r>
-      <w:r>
-        <w:t xml:space="preserve">O'Dea et al., 2020; </w:t>
-      </w:r>
-      <w:proofErr w:type="spellStart"/>
-      <w:r>
-        <w:t>Poppelaars</w:t>
-      </w:r>
-      <w:proofErr w:type="spellEnd"/>
-      <w:r>
-        <w:t xml:space="preserve"> et al., 2016; Stasiak et al., 2014</w:t>
-      </w:r>
-      <w:r>
-        <w:rPr>
-          <w:rFonts w:hint="eastAsia"/>
-        </w:rPr>
-        <w:t>) contributed effect sizes at short-term follow-up (</w:t>
-      </w:r>
-      <w:r>
-        <w:t>≤3 months post-intervention)</w:t>
-      </w:r>
-      <w:r>
-        <w:rPr>
-          <w:rFonts w:hint="eastAsia"/>
-        </w:rPr>
-        <w:t xml:space="preserve">. </w:t>
-      </w:r>
-      <w:r>
-        <w:t xml:space="preserve">Under a random-effects model with REML estimator and Hartung-Knapp adjustment, the pooled Hedges' g was 0.015 (95% CI [−0.34, 0.37], </w:t>
-      </w:r>
-      <w:proofErr w:type="gramStart"/>
-      <w:r>
-        <w:t>t(</w:t>
-      </w:r>
-      <w:proofErr w:type="gramEnd"/>
-      <w:r>
-        <w:t xml:space="preserve">2) = 0.18, p = .875), </w:t>
-      </w:r>
-      <w:r>
-        <w:t>indicating no detectable benefit of unguided self-help CBTs over control conditions at this timepoint (Figure 4)</w:t>
-      </w:r>
-      <w:r>
-        <w:t>.</w:t>
-      </w:r>
-    </w:p>
-    <w:p>
-      <w:pPr>
-        <w:spacing w:after="120" w:line="360" w:lineRule="auto"/>
-        <w:ind w:firstLine="360"/>
-        <w:jc w:val="both"/>
-      </w:pPr>
-      <w:r>
-        <w:t>Between-study heterogeneity was negligible (</w:t>
-      </w:r>
-      <w:proofErr w:type="gramStart"/>
-      <w:r>
-        <w:t>Q(</w:t>
-      </w:r>
-      <w:proofErr w:type="gramEnd"/>
-      <w:r>
-        <w:t>2) = 0.85, p = .653; I² = 0.0%, 95% CI [0.0%, 89.6%]; τ² = 0.000). However, the wide confidence interval around I² reflects the limited precision of heterogeneity estimates when the number of studies is small (Borenstein et al., 2017). The 95% prediction interval extended from −0.53 to 0.56, similarly reflecting substantial uncertainty rather than informative dispersion.</w:t>
+        <w:t>44</w:t>
+      </w:r>
+      <w:r>
+        <w:t>; I² = 0.0%, 95% CI [0.0%, 89.6%]; τ² = 0.000). However, the wide confidence interval around I² reflects the limited precision of heterogeneity estimates when the number of studies is small (Borenstein et al., 2017). The 95% prediction interval extended from −0.53 to 0.56, similarly reflecting substantial uncertainty rather than informative dispersion.</w:t>
       </w:r>
     </w:p>
     <w:p>
@@ -9068,16 +9151,7 @@
           <w:bCs/>
           <w:noProof/>
         </w:rPr>
-        <w:t xml:space="preserve">Forest Plot of Studies </w:t>
-      </w:r>
-      <w:proofErr w:type="gramStart"/>
-      <w:r>
-        <w:rPr>
-          <w:b/>
-          <w:bCs/>
-          <w:noProof/>
-        </w:rPr>
-        <w:t xml:space="preserve">at </w:t>
+        <w:t xml:space="preserve">Forest Plot of Studies at </w:t>
       </w:r>
       <w:r>
         <w:rPr>
@@ -9092,15 +9166,7 @@
           <w:b/>
           <w:bCs/>
         </w:rPr>
-        <w:t>Short</w:t>
-      </w:r>
-      <w:proofErr w:type="gramEnd"/>
-      <w:r>
-        <w:rPr>
-          <w:b/>
-          <w:bCs/>
-        </w:rPr>
-        <w:t xml:space="preserve">-Term </w:t>
+        <w:t xml:space="preserve">Short-Term </w:t>
       </w:r>
       <w:proofErr w:type="spellStart"/>
       <w:r>
@@ -9133,10 +9199,10 @@
           <w:szCs w:val="24"/>
         </w:rPr>
         <w:drawing>
-          <wp:inline distT="0" distB="0" distL="0" distR="0" wp14:anchorId="7441B3C9" wp14:editId="6DBACB8B">
+          <wp:inline distT="0" distB="0" distL="0" distR="0" wp14:anchorId="2218540E" wp14:editId="55F21EC3">
             <wp:extent cx="5943600" cy="2773680"/>
             <wp:effectExtent l="0" t="0" r="0" b="7620"/>
-            <wp:docPr id="1140889400" name="图片 28" descr="图表, 箱线图&#10;&#10;描述已自动生成"/>
+            <wp:docPr id="295007338" name="图片 8" descr="图表, 箱线图&#10;&#10;描述已自动生成"/>
             <wp:cNvGraphicFramePr>
               <a:graphicFrameLocks xmlns:a="http://schemas.openxmlformats.org/drawingml/2006/main" noChangeAspect="1"/>
             </wp:cNvGraphicFramePr>
@@ -9144,7 +9210,7 @@
               <a:graphicData uri="http://schemas.openxmlformats.org/drawingml/2006/picture">
                 <pic:pic xmlns:pic="http://schemas.openxmlformats.org/drawingml/2006/picture">
                   <pic:nvPicPr>
-                    <pic:cNvPr id="1140889400" name="图片 28" descr="图表, 箱线图&#10;&#10;描述已自动生成"/>
+                    <pic:cNvPr id="295007338" name="图片 8" descr="图表, 箱线图&#10;&#10;描述已自动生成"/>
                     <pic:cNvPicPr/>
                   </pic:nvPicPr>
                   <pic:blipFill>
@@ -9331,7 +9397,19 @@
         <w:rPr>
           <w:rFonts w:hint="eastAsia"/>
         </w:rPr>
-        <w:t>, 2012; O</w:t>
+        <w:t>, 201</w:t>
+      </w:r>
+      <w:r>
+        <w:rPr>
+          <w:rFonts w:hint="eastAsia"/>
+        </w:rPr>
+        <w:t>1</w:t>
+      </w:r>
+      <w:r>
+        <w:rPr>
+          <w:rFonts w:hint="eastAsia"/>
+        </w:rPr>
+        <w:t>; O</w:t>
       </w:r>
       <w:r>
         <w:t>’</w:t>
@@ -9393,24 +9471,37 @@
         <w:t xml:space="preserve">Under a random-effects model with REML estimator and Hartung-Knapp adjustment, the pooled Hedges' g was </w:t>
       </w:r>
       <w:r>
-        <w:t xml:space="preserve">0.113 </w:t>
-      </w:r>
-      <w:proofErr w:type="gramStart"/>
+        <w:t>0.11</w:t>
+      </w:r>
       <w:r>
         <w:rPr>
           <w:rFonts w:hint="eastAsia"/>
         </w:rPr>
-        <w:t>( 95</w:t>
-      </w:r>
-      <w:proofErr w:type="gramEnd"/>
+        <w:t>5</w:t>
+      </w:r>
+      <w:r>
+        <w:t xml:space="preserve"> </w:t>
+      </w:r>
       <w:r>
         <w:rPr>
           <w:rFonts w:hint="eastAsia"/>
         </w:rPr>
-        <w:t xml:space="preserve">% CI </w:t>
-      </w:r>
-      <w:r>
-        <w:t>[0.004, 0.223]</w:t>
+        <w:t xml:space="preserve">( 95% CI </w:t>
+      </w:r>
+      <w:r>
+        <w:t>[</w:t>
+      </w:r>
+      <w:r>
+        <w:t>0.005, 0.22</w:t>
+      </w:r>
+      <w:r>
+        <w:rPr>
+          <w:rFonts w:hint="eastAsia"/>
+        </w:rPr>
+        <w:t>4</w:t>
+      </w:r>
+      <w:r>
+        <w:t>]</w:t>
       </w:r>
       <w:r>
         <w:t>, t(</w:t>
@@ -9425,7 +9516,13 @@
         <w:t xml:space="preserve">) = </w:t>
       </w:r>
       <w:r>
-        <w:t>2.55</w:t>
+        <w:t>2.5</w:t>
+      </w:r>
+      <w:r>
+        <w:rPr>
+          <w:rFonts w:hint="eastAsia"/>
+        </w:rPr>
+        <w:t>6</w:t>
       </w:r>
       <w:r>
         <w:t>, p = .</w:t>
@@ -9519,7 +9616,20 @@
       </w:r>
       <w:proofErr w:type="spellEnd"/>
       <w:r>
-        <w:t>, 2012). Five studies showed point estimates favoring the intervention, whereas two yielded negative point estimates. All individual confidence intervals crossed zero, indicating that none of the studies reached statistical significance on its own.</w:t>
+        <w:t>, 201</w:t>
+      </w:r>
+      <w:r>
+        <w:rPr>
+          <w:rFonts w:hint="eastAsia"/>
+        </w:rPr>
+        <w:t>1</w:t>
+      </w:r>
+      <w:r>
+        <w:t xml:space="preserve">). Five studies showed point estimates favoring the intervention, whereas two yielded negative point estimates. </w:t>
+      </w:r>
+      <w:r>
+        <w:lastRenderedPageBreak/>
+        <w:t>All individual confidence intervals crossed zero, indicating that none of the studies reached statistical significance on its own.</w:t>
       </w:r>
       <w:r>
         <w:rPr>
@@ -9535,15 +9645,16 @@
         <w:jc w:val="both"/>
       </w:pPr>
       <w:r>
-        <w:t xml:space="preserve">Between-study heterogeneity was low across all three indicators, </w:t>
-      </w:r>
-      <w:proofErr w:type="gramStart"/>
-      <w:r>
-        <w:t>Q(</w:t>
-      </w:r>
-      <w:proofErr w:type="gramEnd"/>
-      <w:r>
-        <w:t xml:space="preserve">6) = 3.48, </w:t>
+        <w:t>Between-study heterogeneity was low across all three indicators, Q(6) = 3.4</w:t>
+      </w:r>
+      <w:r>
+        <w:rPr>
+          <w:rFonts w:hint="eastAsia"/>
+        </w:rPr>
+        <w:t>7</w:t>
+      </w:r>
+      <w:r>
+        <w:t xml:space="preserve">, </w:t>
       </w:r>
       <w:r>
         <w:rPr>
@@ -9553,7 +9664,19 @@
         <w:t>p</w:t>
       </w:r>
       <w:r>
-        <w:t xml:space="preserve"> = .747, I² = 0.0%, 95% CI [0.0%, 70.8%], τ² = 0.000, 95% CI [0.000, 0.050]. The wide upper bound of the I² confidence interval (70.8%) reflects the limited precision of heterogeneity estimates when the number of studies is moderate (Borenstein et al., 2017), but the three indicators were consistent and jointly supported low between-study variability. The 95% prediction interval ranged from −0.03 to 0.26, suggesting that the true effect in a comparable future trial would most likely fall within a small positive range, with little chance of a null or negative effect.</w:t>
+        <w:t xml:space="preserve"> = .74</w:t>
+      </w:r>
+      <w:r>
+        <w:rPr>
+          <w:rFonts w:hint="eastAsia"/>
+        </w:rPr>
+        <w:t>9</w:t>
+      </w:r>
+      <w:r>
+        <w:t xml:space="preserve">, I² = 0.0%, 95% CI [0.0%, 70.8%], τ² = 0.000, 95% CI [0.000, 0.050]. The wide upper bound of the I² confidence interval (70.8%) reflects the limited precision of heterogeneity estimates when the number of studies is moderate (Borenstein et al., 2017), but the three indicators were consistent and jointly supported low between-study variability. </w:t>
+      </w:r>
+      <w:r>
+        <w:t>The 95% prediction interval ranged from −0.03 to 0.26, suggesting that the true effect in a comparable future trial would most likely be small and positive, though the interval marginally included zero.</w:t>
       </w:r>
     </w:p>
     <w:bookmarkEnd w:id="22"/>
@@ -9668,12 +9791,11 @@
           <w:sz w:val="24"/>
           <w:szCs w:val="24"/>
         </w:rPr>
-        <w:lastRenderedPageBreak/>
         <w:drawing>
-          <wp:inline distT="0" distB="0" distL="0" distR="0" wp14:anchorId="47E2A83F" wp14:editId="13A020B7">
+          <wp:inline distT="0" distB="0" distL="0" distR="0" wp14:anchorId="05E3921F" wp14:editId="75EB34C9">
             <wp:extent cx="5943600" cy="4358640"/>
             <wp:effectExtent l="0" t="0" r="0" b="3810"/>
-            <wp:docPr id="1949811313" name="图片 30" descr="文本&#10;&#10;中度可信度描述已自动生成"/>
+            <wp:docPr id="1582559487" name="图片 9" descr="文本&#10;&#10;中度可信度描述已自动生成"/>
             <wp:cNvGraphicFramePr>
               <a:graphicFrameLocks xmlns:a="http://schemas.openxmlformats.org/drawingml/2006/main" noChangeAspect="1"/>
             </wp:cNvGraphicFramePr>
@@ -9681,7 +9803,7 @@
               <a:graphicData uri="http://schemas.openxmlformats.org/drawingml/2006/picture">
                 <pic:pic xmlns:pic="http://schemas.openxmlformats.org/drawingml/2006/picture">
                   <pic:nvPicPr>
-                    <pic:cNvPr id="1949811313" name="图片 30" descr="文本&#10;&#10;中度可信度描述已自动生成"/>
+                    <pic:cNvPr id="1582559487" name="图片 9" descr="文本&#10;&#10;中度可信度描述已自动生成"/>
                     <pic:cNvPicPr/>
                   </pic:nvPicPr>
                   <pic:blipFill>
@@ -9766,7 +9888,11 @@
         <w:t>g</w:t>
       </w:r>
       <w:r>
-        <w:t>. Squares represent point estimates of individual studies, with size proportional to study weight in the random-effects model. Horizontal lines represent 95% confidence intervals; arrows indicate intervals extending beyond the plot range. The blue diamond represents the random-effects pooled estimate using Hartung-Knapp adjustment. The red bar represents the 95% prediction interval. CI = confidence interval; HK = Hartung-Knapp.</w:t>
+        <w:t xml:space="preserve">. Squares represent point estimates of individual studies, with size proportional to study weight in the random-effects model. Horizontal lines represent 95% confidence intervals; arrows indicate intervals extending beyond the </w:t>
+      </w:r>
+      <w:r>
+        <w:lastRenderedPageBreak/>
+        <w:t>plot range. The blue diamond represents the random-effects pooled estimate using Hartung-Knapp adjustment. The red bar represents the 95% prediction interval. CI = confidence interval; HK = Hartung-Knapp.</w:t>
       </w:r>
     </w:p>
     <w:p>
@@ -9823,9 +9949,23 @@
       </w:r>
       <w:proofErr w:type="spellEnd"/>
       <w:r>
-        <w:t xml:space="preserve"> et al., 2016; Wright et al., 2020; Rohde et al., 2015) contributed effect sizes at long-term follow-up (≥12 months post-intervention). Where a study reported multiple long-term assessments, the longest available timepoint was used. Under a random-effects model with REML estimator and Hartung-Knapp adjustment, the pooled Hedges' g was 0.148, 95% CI [−0.082, 0.379], </w:t>
-      </w:r>
-      <w:proofErr w:type="gramStart"/>
+        <w:t xml:space="preserve"> et al., 2016; Wright et al., 2020; Rohde et al., 2015) contributed effect sizes at long-term follow-up (≥12 months post-intervention). Where a study reported multiple long-term assessments, the longest available timepoint was used. Under a random-effects model with REML estimator and Hartung-Knapp adjustment, the pooled Hedges' g was 0.1</w:t>
+      </w:r>
+      <w:r>
+        <w:rPr>
+          <w:rFonts w:hint="eastAsia"/>
+        </w:rPr>
+        <w:t>48</w:t>
+      </w:r>
+      <w:r>
+        <w:t xml:space="preserve">, 95% CI </w:t>
+      </w:r>
+      <w:r>
+        <w:t>[−0.082, 0.378]</w:t>
+      </w:r>
+      <w:r>
+        <w:t xml:space="preserve"> </w:t>
+      </w:r>
       <w:r>
         <w:rPr>
           <w:i/>
@@ -9834,11 +9974,16 @@
         <w:t>t</w:t>
       </w:r>
       <w:r>
-        <w:t>(</w:t>
-      </w:r>
-      <w:proofErr w:type="gramEnd"/>
-      <w:r>
-        <w:t xml:space="preserve">4) = 1.78, </w:t>
+        <w:t>(4) = 1.</w:t>
+      </w:r>
+      <w:r>
+        <w:rPr>
+          <w:rFonts w:hint="eastAsia"/>
+        </w:rPr>
+        <w:t>79</w:t>
+      </w:r>
+      <w:r>
+        <w:t xml:space="preserve">, </w:t>
       </w:r>
       <w:r>
         <w:rPr>
@@ -9848,7 +9993,16 @@
         <w:t>p</w:t>
       </w:r>
       <w:r>
-        <w:t xml:space="preserve"> = .149, indicating no detectable benefit of unguided self-help CBT interventions over control conditions at this timepoint (Figure 6).</w:t>
+        <w:t xml:space="preserve"> = .14</w:t>
+      </w:r>
+      <w:r>
+        <w:rPr>
+          <w:rFonts w:hint="eastAsia"/>
+        </w:rPr>
+        <w:t>9</w:t>
+      </w:r>
+      <w:r>
+        <w:t>, indicating no detectable benefit of unguided self-help CBT interventions over control conditions at this timepoint (Figure 6).</w:t>
       </w:r>
     </w:p>
     <w:p>
@@ -9858,7 +10012,6 @@
         <w:jc w:val="both"/>
       </w:pPr>
       <w:r>
-        <w:lastRenderedPageBreak/>
         <w:t>Inspection of the forest plot revealed moderate dispersion in individual study estimates, ranging from g = −0.05 (Wright et al., 2020) to g = 0.36 (Ip et al., 2016). Three studies showed point estimates favoring the intervention, while two yielded negative point estimates close to zero. Only one study (Ip et al., 2016) reached statistical significance at the individual-study level, with a moderate effect size and a relatively narrow confidence interval; the remaining four studies produced confidence intervals that crossed zero. The influence of Ip et al. (2016) on the pooled estimate is further examined in the leave-one-out sensitivity analysis (Section 4.6).</w:t>
       </w:r>
     </w:p>
@@ -9869,15 +10022,19 @@
         <w:jc w:val="both"/>
       </w:pPr>
       <w:r>
-        <w:t xml:space="preserve">Between-study heterogeneity was low to moderate, </w:t>
-      </w:r>
-      <w:proofErr w:type="gramStart"/>
-      <w:r>
-        <w:t>Q(</w:t>
-      </w:r>
-      <w:proofErr w:type="gramEnd"/>
-      <w:r>
-        <w:t xml:space="preserve">4) = 5.97, </w:t>
+        <w:t xml:space="preserve">Between-study heterogeneity was low to moderate, Q(4) = </w:t>
+      </w:r>
+      <w:r>
+        <w:t>5.</w:t>
+      </w:r>
+      <w:r>
+        <w:rPr>
+          <w:rFonts w:hint="eastAsia"/>
+        </w:rPr>
+        <w:t>98</w:t>
+      </w:r>
+      <w:r>
+        <w:t xml:space="preserve">, </w:t>
       </w:r>
       <w:r>
         <w:rPr>
@@ -9887,7 +10044,41 @@
         <w:t>p</w:t>
       </w:r>
       <w:r>
-        <w:t xml:space="preserve"> = .201, I² = 33.0%, 95% CI [0.0%, 74.6%], τ² = 0.014, 95% CI [0.000, 0.247]. Although τ² was small, the I² point estimate of 33% and the wide upper bound of its confidence interval (74.6%) suggest some unresolved between-study variability that could not be ruled out given the small number of studies (Borenstein et al., 2017). The 95% prediction interval ranged from −0.27 to 0.56, indicating considerable uncertainty about the direction and magnitude of the true effect in a comparable future trial.</w:t>
+        <w:t xml:space="preserve"> = .2</w:t>
+      </w:r>
+      <w:r>
+        <w:rPr>
+          <w:rFonts w:hint="eastAsia"/>
+        </w:rPr>
+        <w:t>01</w:t>
+      </w:r>
+      <w:r>
+        <w:t>,</w:t>
+      </w:r>
+      <w:r>
+        <w:rPr>
+          <w:i/>
+          <w:iCs/>
+        </w:rPr>
+        <w:t xml:space="preserve"> I</w:t>
+      </w:r>
+      <w:r>
+        <w:t>² = 33.</w:t>
+      </w:r>
+      <w:r>
+        <w:rPr>
+          <w:rFonts w:hint="eastAsia"/>
+        </w:rPr>
+        <w:t>1</w:t>
+      </w:r>
+      <w:r>
+        <w:t xml:space="preserve">%, 95% CI [0.0%, </w:t>
+      </w:r>
+      <w:r>
+        <w:t>74.6%</w:t>
+      </w:r>
+      <w:r>
+        <w:t>], τ² = 0.014, 95% CI [0.000, 0.247]. Although τ² was small, the I² point estimate of 33% and the wide upper bound of its confidence interval (74.6%) suggest some unresolved between-study variability that could not be ruled out given the small number of studies (Borenstein et al., 2017). The 95% prediction interval ranged from −0.27 to 0.56, indicating considerable uncertainty about the direction and magnitude of the true effect in a comparable future trial.</w:t>
       </w:r>
     </w:p>
     <w:p>
@@ -9942,16 +10133,7 @@
           <w:bCs/>
           <w:noProof/>
         </w:rPr>
-        <w:t xml:space="preserve">Forest Plot of Studies </w:t>
-      </w:r>
-      <w:proofErr w:type="gramStart"/>
-      <w:r>
-        <w:rPr>
-          <w:b/>
-          <w:bCs/>
-          <w:noProof/>
-        </w:rPr>
-        <w:t xml:space="preserve">at </w:t>
+        <w:t xml:space="preserve">Forest Plot of Studies at </w:t>
       </w:r>
       <w:r>
         <w:rPr>
@@ -9961,7 +10143,6 @@
         </w:rPr>
         <w:t xml:space="preserve"> Long</w:t>
       </w:r>
-      <w:proofErr w:type="gramEnd"/>
       <w:r>
         <w:rPr>
           <w:b/>
@@ -9998,11 +10179,12 @@
           <w:sz w:val="24"/>
           <w:szCs w:val="24"/>
         </w:rPr>
+        <w:lastRenderedPageBreak/>
         <w:drawing>
-          <wp:inline distT="0" distB="0" distL="0" distR="0" wp14:anchorId="45B9E967" wp14:editId="3A832402">
+          <wp:inline distT="0" distB="0" distL="0" distR="0" wp14:anchorId="1817AA2E" wp14:editId="4FB9D2D0">
             <wp:extent cx="5943600" cy="3566160"/>
             <wp:effectExtent l="0" t="0" r="0" b="0"/>
-            <wp:docPr id="1083054699" name="图片 31" descr="图表, 箱线图&#10;&#10;描述已自动生成"/>
+            <wp:docPr id="260028480" name="图片 10" descr="图表, 箱线图&#10;&#10;描述已自动生成"/>
             <wp:cNvGraphicFramePr>
               <a:graphicFrameLocks xmlns:a="http://schemas.openxmlformats.org/drawingml/2006/main" noChangeAspect="1"/>
             </wp:cNvGraphicFramePr>
@@ -10010,7 +10192,7 @@
               <a:graphicData uri="http://schemas.openxmlformats.org/drawingml/2006/picture">
                 <pic:pic xmlns:pic="http://schemas.openxmlformats.org/drawingml/2006/picture">
                   <pic:nvPicPr>
-                    <pic:cNvPr id="1083054699" name="图片 31" descr="图表, 箱线图&#10;&#10;描述已自动生成"/>
+                    <pic:cNvPr id="260028480" name="图片 10" descr="图表, 箱线图&#10;&#10;描述已自动生成"/>
                     <pic:cNvPicPr/>
                   </pic:nvPicPr>
                   <pic:blipFill>
@@ -10064,11 +10246,7 @@
         <w:t>g</w:t>
       </w:r>
       <w:r>
-        <w:t xml:space="preserve">. Squares represent point estimates of individual studies, with size proportional to study weight in the random-effects model. Horizontal lines represent 95% confidence intervals; arrows indicate intervals extending beyond the </w:t>
-      </w:r>
-      <w:r>
-        <w:lastRenderedPageBreak/>
-        <w:t>plot range. The blue diamond represents the random-effects pooled estimate using Hartung-Knapp adjustment. The red bar represents the 95% prediction interval. CI = confidence interval; HK = Hartung-Knapp.</w:t>
+        <w:t>. Squares represent point estimates of individual studies, with size proportional to study weight in the random-effects model. Horizontal lines represent 95% confidence intervals; arrows indicate intervals extending beyond the plot range. The blue diamond represents the random-effects pooled estimate using Hartung-Knapp adjustment. The red bar represents the 95% prediction interval. CI = confidence interval; HK = Hartung-Knapp.</w:t>
       </w:r>
     </w:p>
     <w:p>
@@ -10668,48 +10846,30 @@
               <w:rPr>
                 <w:rFonts w:hint="eastAsia"/>
               </w:rPr>
-              <w:t>015</w:t>
+              <w:t>01</w:t>
             </w:r>
             <w:r>
               <w:rPr>
                 <w:rFonts w:hint="eastAsia"/>
               </w:rPr>
-              <w:t xml:space="preserve"> [</w:t>
+              <w:t>8</w:t>
             </w:r>
             <w:r>
               <w:rPr>
                 <w:rFonts w:hint="eastAsia"/>
               </w:rPr>
-              <w:t>-</w:t>
-            </w:r>
-            <w:r>
-              <w:t>0.</w:t>
+              <w:t xml:space="preserve"> </w:t>
+            </w:r>
+            <w:r>
+              <w:t>[−0.34, 0.3</w:t>
             </w:r>
             <w:r>
               <w:rPr>
                 <w:rFonts w:hint="eastAsia"/>
               </w:rPr>
-              <w:t>34</w:t>
-            </w:r>
-            <w:r>
-              <w:rPr>
-                <w:rFonts w:hint="eastAsia"/>
-              </w:rPr>
-              <w:t xml:space="preserve">, </w:t>
-            </w:r>
-            <w:r>
-              <w:t>0.</w:t>
-            </w:r>
-            <w:r>
-              <w:rPr>
-                <w:rFonts w:hint="eastAsia"/>
-              </w:rPr>
-              <w:t>37</w:t>
-            </w:r>
-            <w:r>
-              <w:rPr>
-                <w:rFonts w:hint="eastAsia"/>
-              </w:rPr>
+              <w:t>8</w:t>
+            </w:r>
+            <w:r>
               <w:t>]</w:t>
             </w:r>
           </w:p>
@@ -10731,7 +10891,13 @@
               <w:rPr>
                 <w:rFonts w:hint="eastAsia"/>
               </w:rPr>
-              <w:t>0.18</w:t>
+              <w:t>0.</w:t>
+            </w:r>
+            <w:r>
+              <w:rPr>
+                <w:rFonts w:hint="eastAsia"/>
+              </w:rPr>
+              <w:t>21</w:t>
             </w:r>
             <w:r>
               <w:rPr>
@@ -10765,18 +10931,27 @@
             <w:pPr>
               <w:spacing w:after="120" w:line="360" w:lineRule="auto"/>
               <w:jc w:val="center"/>
-            </w:pPr>
-            <w:r>
               <w:rPr>
                 <w:rFonts w:hint="eastAsia"/>
               </w:rPr>
+            </w:pPr>
+            <w:r>
+              <w:rPr>
+                <w:rFonts w:hint="eastAsia"/>
+              </w:rPr>
               <w:t>.</w:t>
             </w:r>
             <w:r>
               <w:rPr>
                 <w:rFonts w:hint="eastAsia"/>
               </w:rPr>
-              <w:t>875</w:t>
+              <w:t>8</w:t>
+            </w:r>
+            <w:r>
+              <w:rPr>
+                <w:rFonts w:hint="eastAsia"/>
+              </w:rPr>
+              <w:t>51</w:t>
             </w:r>
           </w:p>
         </w:tc>
@@ -10794,7 +10969,13 @@
               <w:jc w:val="center"/>
             </w:pPr>
             <w:r>
-              <w:t>0.85</w:t>
+              <w:t>0.8</w:t>
+            </w:r>
+            <w:r>
+              <w:rPr>
+                <w:rFonts w:hint="eastAsia"/>
+              </w:rPr>
+              <w:t>8</w:t>
             </w:r>
             <w:r>
               <w:rPr>
@@ -10834,12 +11015,21 @@
             <w:pPr>
               <w:spacing w:after="120" w:line="360" w:lineRule="auto"/>
               <w:jc w:val="center"/>
-            </w:pPr>
-            <w:r>
               <w:rPr>
                 <w:rFonts w:hint="eastAsia"/>
               </w:rPr>
-              <w:t>.653</w:t>
+            </w:pPr>
+            <w:r>
+              <w:rPr>
+                <w:rFonts w:hint="eastAsia"/>
+              </w:rPr>
+              <w:t>.6</w:t>
+            </w:r>
+            <w:r>
+              <w:rPr>
+                <w:rFonts w:hint="eastAsia"/>
+              </w:rPr>
+              <w:t>44</w:t>
             </w:r>
           </w:p>
         </w:tc>
@@ -10959,25 +11149,44 @@
               <w:rPr>
                 <w:rFonts w:hint="eastAsia"/>
               </w:rPr>
-              <w:t>0.113 [0.00</w:t>
+              <w:t>0.11</w:t>
             </w:r>
             <w:r>
               <w:rPr>
                 <w:rFonts w:hint="eastAsia"/>
               </w:rPr>
+              <w:t>5</w:t>
+            </w:r>
+            <w:r>
+              <w:rPr>
+                <w:rFonts w:hint="eastAsia"/>
+              </w:rPr>
+              <w:t xml:space="preserve"> </w:t>
+            </w:r>
+            <w:r>
+              <w:rPr>
+                <w:rFonts w:hint="eastAsia"/>
+              </w:rPr>
+              <w:lastRenderedPageBreak/>
+              <w:t>[0.00</w:t>
+            </w:r>
+            <w:r>
+              <w:rPr>
+                <w:rFonts w:hint="eastAsia"/>
+              </w:rPr>
+              <w:t>5</w:t>
+            </w:r>
+            <w:r>
+              <w:rPr>
+                <w:rFonts w:hint="eastAsia"/>
+              </w:rPr>
+              <w:t>, 0.22</w:t>
+            </w:r>
+            <w:r>
+              <w:rPr>
+                <w:rFonts w:hint="eastAsia"/>
+              </w:rPr>
               <w:t>4</w:t>
-            </w:r>
-            <w:r>
-              <w:rPr>
-                <w:rFonts w:hint="eastAsia"/>
-              </w:rPr>
-              <w:t>, 0.22</w:t>
-            </w:r>
-            <w:r>
-              <w:rPr>
-                <w:rFonts w:hint="eastAsia"/>
-              </w:rPr>
-              <w:t>3</w:t>
             </w:r>
             <w:r>
               <w:rPr>
@@ -11005,7 +11214,20 @@
               <w:rPr>
                 <w:rFonts w:hint="eastAsia"/>
               </w:rPr>
-              <w:t>2.55(6)</w:t>
+              <w:lastRenderedPageBreak/>
+              <w:t>2.5</w:t>
+            </w:r>
+            <w:r>
+              <w:rPr>
+                <w:rFonts w:hint="eastAsia"/>
+              </w:rPr>
+              <w:t>6</w:t>
+            </w:r>
+            <w:r>
+              <w:rPr>
+                <w:rFonts w:hint="eastAsia"/>
+              </w:rPr>
+              <w:t>(6)</w:t>
             </w:r>
           </w:p>
         </w:tc>
@@ -11047,7 +11269,19 @@
               <w:rPr>
                 <w:rFonts w:hint="eastAsia"/>
               </w:rPr>
-              <w:t>3.48(6)</w:t>
+              <w:t>3.4</w:t>
+            </w:r>
+            <w:r>
+              <w:rPr>
+                <w:rFonts w:hint="eastAsia"/>
+              </w:rPr>
+              <w:t>7</w:t>
+            </w:r>
+            <w:r>
+              <w:rPr>
+                <w:rFonts w:hint="eastAsia"/>
+              </w:rPr>
+              <w:t>(6)</w:t>
             </w:r>
           </w:p>
         </w:tc>
@@ -11063,12 +11297,21 @@
             <w:pPr>
               <w:spacing w:after="120" w:line="360" w:lineRule="auto"/>
               <w:jc w:val="center"/>
-            </w:pPr>
-            <w:r>
               <w:rPr>
                 <w:rFonts w:hint="eastAsia"/>
               </w:rPr>
-              <w:t>.747</w:t>
+            </w:pPr>
+            <w:r>
+              <w:rPr>
+                <w:rFonts w:hint="eastAsia"/>
+              </w:rPr>
+              <w:t>.7</w:t>
+            </w:r>
+            <w:r>
+              <w:rPr>
+                <w:rFonts w:hint="eastAsia"/>
+              </w:rPr>
+              <w:t>49</w:t>
             </w:r>
           </w:p>
         </w:tc>
@@ -11089,7 +11332,14 @@
               <w:rPr>
                 <w:rFonts w:hint="eastAsia"/>
               </w:rPr>
-              <w:t>0.0% [0.0, 70.8]</w:t>
+              <w:t xml:space="preserve">0.0% </w:t>
+            </w:r>
+            <w:r>
+              <w:rPr>
+                <w:rFonts w:hint="eastAsia"/>
+              </w:rPr>
+              <w:lastRenderedPageBreak/>
+              <w:t>[0.0, 70.8]</w:t>
             </w:r>
           </w:p>
         </w:tc>
@@ -11110,6 +11360,7 @@
               <w:rPr>
                 <w:rFonts w:hint="eastAsia"/>
               </w:rPr>
+              <w:lastRenderedPageBreak/>
               <w:t>0.000</w:t>
             </w:r>
           </w:p>
@@ -11131,7 +11382,14 @@
               <w:rPr>
                 <w:rFonts w:hint="eastAsia"/>
               </w:rPr>
-              <w:t>[-0.03, 0.26]</w:t>
+              <w:t xml:space="preserve">[-0.03, </w:t>
+            </w:r>
+            <w:r>
+              <w:rPr>
+                <w:rFonts w:hint="eastAsia"/>
+              </w:rPr>
+              <w:lastRenderedPageBreak/>
+              <w:t>0.26]</w:t>
             </w:r>
           </w:p>
         </w:tc>
@@ -11154,6 +11412,7 @@
               <w:rPr>
                 <w:rFonts w:hint="eastAsia"/>
               </w:rPr>
+              <w:lastRenderedPageBreak/>
               <w:t>Long</w:t>
             </w:r>
           </w:p>
@@ -11196,7 +11455,19 @@
               <w:rPr>
                 <w:rFonts w:hint="eastAsia"/>
               </w:rPr>
-              <w:t>0.148 [-0.08, 0.38]</w:t>
+              <w:t>0.1</w:t>
+            </w:r>
+            <w:r>
+              <w:rPr>
+                <w:rFonts w:hint="eastAsia"/>
+              </w:rPr>
+              <w:t>48</w:t>
+            </w:r>
+            <w:r>
+              <w:rPr>
+                <w:rFonts w:hint="eastAsia"/>
+              </w:rPr>
+              <w:t xml:space="preserve"> [-0.08, 0.38]</w:t>
             </w:r>
           </w:p>
         </w:tc>
@@ -11217,7 +11488,19 @@
               <w:rPr>
                 <w:rFonts w:hint="eastAsia"/>
               </w:rPr>
-              <w:t>1.78(4)</w:t>
+              <w:t>1.</w:t>
+            </w:r>
+            <w:r>
+              <w:rPr>
+                <w:rFonts w:hint="eastAsia"/>
+              </w:rPr>
+              <w:t>79</w:t>
+            </w:r>
+            <w:r>
+              <w:rPr>
+                <w:rFonts w:hint="eastAsia"/>
+              </w:rPr>
+              <w:t>(4)</w:t>
             </w:r>
           </w:p>
         </w:tc>
@@ -11238,7 +11521,13 @@
               <w:rPr>
                 <w:rFonts w:hint="eastAsia"/>
               </w:rPr>
-              <w:t>.149</w:t>
+              <w:t>.14</w:t>
+            </w:r>
+            <w:r>
+              <w:rPr>
+                <w:rFonts w:hint="eastAsia"/>
+              </w:rPr>
+              <w:t>9</w:t>
             </w:r>
           </w:p>
         </w:tc>
@@ -11259,7 +11548,19 @@
               <w:rPr>
                 <w:rFonts w:hint="eastAsia"/>
               </w:rPr>
-              <w:t>5.97(4)</w:t>
+              <w:t>5.</w:t>
+            </w:r>
+            <w:r>
+              <w:rPr>
+                <w:rFonts w:hint="eastAsia"/>
+              </w:rPr>
+              <w:t>98</w:t>
+            </w:r>
+            <w:r>
+              <w:rPr>
+                <w:rFonts w:hint="eastAsia"/>
+              </w:rPr>
+              <w:t>(4)</w:t>
             </w:r>
           </w:p>
         </w:tc>
@@ -11275,12 +11576,21 @@
             <w:pPr>
               <w:spacing w:after="120" w:line="360" w:lineRule="auto"/>
               <w:jc w:val="center"/>
-            </w:pPr>
-            <w:r>
               <w:rPr>
                 <w:rFonts w:hint="eastAsia"/>
               </w:rPr>
-              <w:t>.201</w:t>
+            </w:pPr>
+            <w:r>
+              <w:rPr>
+                <w:rFonts w:hint="eastAsia"/>
+              </w:rPr>
+              <w:t>.2</w:t>
+            </w:r>
+            <w:r>
+              <w:rPr>
+                <w:rFonts w:hint="eastAsia"/>
+              </w:rPr>
+              <w:t>01</w:t>
             </w:r>
           </w:p>
         </w:tc>
@@ -11301,7 +11611,43 @@
               <w:rPr>
                 <w:rFonts w:hint="eastAsia"/>
               </w:rPr>
-              <w:t>33.0% [0.0, 74.6]</w:t>
+              <w:t>3</w:t>
+            </w:r>
+            <w:r>
+              <w:rPr>
+                <w:rFonts w:hint="eastAsia"/>
+              </w:rPr>
+              <w:t>3</w:t>
+            </w:r>
+            <w:r>
+              <w:rPr>
+                <w:rFonts w:hint="eastAsia"/>
+              </w:rPr>
+              <w:t>.</w:t>
+            </w:r>
+            <w:r>
+              <w:rPr>
+                <w:rFonts w:hint="eastAsia"/>
+              </w:rPr>
+              <w:t>1</w:t>
+            </w:r>
+            <w:r>
+              <w:rPr>
+                <w:rFonts w:hint="eastAsia"/>
+              </w:rPr>
+              <w:t>% [0.0, 7</w:t>
+            </w:r>
+            <w:r>
+              <w:rPr>
+                <w:rFonts w:hint="eastAsia"/>
+              </w:rPr>
+              <w:t>4</w:t>
+            </w:r>
+            <w:r>
+              <w:rPr>
+                <w:rFonts w:hint="eastAsia"/>
+              </w:rPr>
+              <w:t>.6]</w:t>
             </w:r>
           </w:p>
         </w:tc>
@@ -11343,7 +11689,16 @@
               <w:rPr>
                 <w:rFonts w:hint="eastAsia"/>
               </w:rPr>
-              <w:t>[-0.27, 0.56]</w:t>
+              <w:t>[</w:t>
+            </w:r>
+            <w:r>
+              <w:t>−0.27</w:t>
+            </w:r>
+            <w:r>
+              <w:rPr>
+                <w:rFonts w:hint="eastAsia"/>
+              </w:rPr>
+              <w:t>, 0.56]</w:t>
             </w:r>
           </w:p>
         </w:tc>
@@ -11460,7 +11815,6 @@
         <w:rPr>
           <w:rFonts w:eastAsiaTheme="minorEastAsia"/>
         </w:rPr>
-        <w:lastRenderedPageBreak/>
         <w:t>4.</w:t>
       </w:r>
       <w:r>
@@ -11530,7 +11884,19 @@
     </w:p>
     <w:p>
       <w:pPr>
+        <w:spacing w:after="120" w:line="360" w:lineRule="auto"/>
+        <w:jc w:val="both"/>
+      </w:pPr>
+      <w:r>
+        <w:t>GLMM</w:t>
+      </w:r>
+    </w:p>
+    <w:p>
+      <w:pPr>
         <w:pStyle w:val="2"/>
+        <w:rPr>
+          <w:rFonts w:eastAsiaTheme="minorEastAsia"/>
+        </w:rPr>
       </w:pPr>
       <w:r>
         <w:t>4.</w:t>
@@ -11542,10 +11908,7 @@
         <w:t>7</w:t>
       </w:r>
       <w:r>
-        <w:t xml:space="preserve">. </w:t>
-      </w:r>
-      <w:r>
-        <w:t>Acceptability (Differential Dropout)</w:t>
+        <w:t>. Publication Bias</w:t>
       </w:r>
     </w:p>
     <w:p>
@@ -11555,30 +11918,21 @@
         <w:jc w:val="both"/>
       </w:pPr>
       <w:r>
-        <w:rPr>
-          <w:rFonts w:eastAsia="Times New Roman"/>
-        </w:rPr>
-        <w:t>[Placeholder for differential dropout analysis.]</w:t>
-      </w:r>
-    </w:p>
-    <w:p>
-      <w:pPr>
-        <w:pStyle w:val="2"/>
-        <w:rPr>
-          <w:rFonts w:eastAsiaTheme="minorEastAsia"/>
-        </w:rPr>
-      </w:pPr>
-      <w:r>
-        <w:t>4.</w:t>
-      </w:r>
-      <w:r>
-        <w:rPr>
-          <w:rFonts w:eastAsiaTheme="minorEastAsia" w:hint="eastAsia"/>
-        </w:rPr>
-        <w:t>8</w:t>
-      </w:r>
-      <w:r>
-        <w:t>. Publication Bias</w:t>
+        <w:t>A contour-enhanced funnel plot was constructed to assess potential small-study effects at post-intervention (Figure X). Visual inspection suggested some asymmetry: the more precise studies clustered around the pooled estimate, whereas the least precise trials, particularly Fleming (2012), Ackerson (1998), and Stasiak (2014), were located on the positive side of the plot, with no clearly comparable small-sample studies on the negative side. The contour shading indicated that the corresponding mirror region on the left would fall mainly within the non-significant zone (</w:t>
+      </w:r>
+      <w:r>
+        <w:rPr>
+          <w:i/>
+          <w:iCs/>
+        </w:rPr>
+        <w:t>p</w:t>
+      </w:r>
+      <w:r>
+        <w:t xml:space="preserve"> &gt; .10). If studies were missing from this region, such </w:t>
+      </w:r>
+      <w:r>
+        <w:lastRenderedPageBreak/>
+        <w:t>a pattern would be consistent with selective non-publication of small, non-significant trials, although alternative explanations such as heterogeneity or methodological differences could not be ruled out.</w:t>
       </w:r>
     </w:p>
     <w:p>
@@ -11586,12 +11940,49 @@
         <w:spacing w:after="120" w:line="360" w:lineRule="auto"/>
         <w:ind w:firstLine="360"/>
         <w:jc w:val="both"/>
-        <w:rPr>
-          <w:rFonts w:hint="eastAsia"/>
-        </w:rPr>
-      </w:pPr>
-      <w:r>
-        <w:t>A contour-enhanced funnel plot was constructed to assess potential small-study effects (Figure X). Visual inspection suggested some asymmetry: high-precision studies clustered around the pooled estimate, whereas the three least precise trials (Fleming, 2012; Ackerson, 1998; Stasiak, 2014) were located on the positive side of the plot, with no comparable small-sample trials on the negative side. The contour shading indicated that the corresponding mirror region on the left would fall mainly within the non-significant zone (p &gt; .10). If studies were missing from this region, such a pattern would be consistent with selective non-publication of small, non-significant trials, although other sources of asymmetry, such as heterogeneity or methodological differences between studies, could not be ruled out.</w:t>
+      </w:pPr>
+      <w:r>
+        <w:t xml:space="preserve">Egger’s regression test indicated a non-significant trend toward funnel plot asymmetry, </w:t>
+      </w:r>
+      <w:r>
+        <w:rPr>
+          <w:i/>
+          <w:iCs/>
+        </w:rPr>
+        <w:t>t</w:t>
+      </w:r>
+      <w:r>
+        <w:t xml:space="preserve">(12) = 1.82, </w:t>
+      </w:r>
+      <w:r>
+        <w:rPr>
+          <w:i/>
+          <w:iCs/>
+        </w:rPr>
+        <w:t>p</w:t>
+      </w:r>
+      <w:r>
+        <w:t xml:space="preserve"> = .093. Because the pooled effect size was a standardized mean difference (SMD), a modified test proposed by Pustejovsky and Rodgers (2019), which adjusts for the artifactual dependence between SMDs and their standard errors, was also conducted. This modified test was likewise non-significant, </w:t>
+      </w:r>
+      <w:r>
+        <w:rPr>
+          <w:i/>
+          <w:iCs/>
+        </w:rPr>
+        <w:t>t</w:t>
+      </w:r>
+      <w:r>
+        <w:t xml:space="preserve">(12) = 1.66, </w:t>
+      </w:r>
+      <w:r>
+        <w:rPr>
+          <w:i/>
+          <w:iCs/>
+        </w:rPr>
+        <w:t>p</w:t>
+      </w:r>
+      <w:r>
+        <w:t xml:space="preserve"> = .123.</w:t>
       </w:r>
     </w:p>
     <w:p>
@@ -11600,97 +11991,24 @@
         <w:ind w:firstLine="360"/>
         <w:jc w:val="both"/>
       </w:pPr>
-      <w:r>
-        <w:t xml:space="preserve">Egger’s regression test showed a non-significant trend toward funnel plot asymmetry, </w:t>
-      </w:r>
-      <w:proofErr w:type="gramStart"/>
-      <w:r>
-        <w:t>t(</w:t>
-      </w:r>
-      <w:proofErr w:type="gramEnd"/>
-      <w:r>
-        <w:t xml:space="preserve">12) = 1.85, p = .089. Because the effect size was a standardized mean difference (SMD), a modified test proposed by Pustejovsky and Rodgers (2019), which adjusts for the artifactual dependence between SMDs and their standard errors, was additionally conducted. This modified test was also not statistically significant, </w:t>
-      </w:r>
-      <w:proofErr w:type="gramStart"/>
-      <w:r>
-        <w:t>t(</w:t>
-      </w:r>
-      <w:proofErr w:type="gramEnd"/>
-      <w:r>
-        <w:t>12) = 1.69, p = .117.</w:t>
-      </w:r>
-    </w:p>
-    <w:p>
-      <w:pPr>
-        <w:spacing w:after="120" w:line="360" w:lineRule="auto"/>
-        <w:ind w:firstLine="360"/>
-        <w:jc w:val="both"/>
-      </w:pPr>
-    </w:p>
-    <w:p>
-      <w:pPr>
-        <w:spacing w:after="120" w:line="360" w:lineRule="auto"/>
-        <w:ind w:firstLine="360"/>
-        <w:jc w:val="both"/>
-      </w:pPr>
-    </w:p>
-    <w:p>
-      <w:pPr>
-        <w:spacing w:after="120" w:line="360" w:lineRule="auto"/>
-        <w:ind w:firstLine="360"/>
-        <w:jc w:val="both"/>
-      </w:pPr>
-    </w:p>
-    <w:p>
-      <w:pPr>
-        <w:spacing w:after="120" w:line="360" w:lineRule="auto"/>
-        <w:ind w:firstLine="360"/>
-        <w:jc w:val="both"/>
-      </w:pPr>
-    </w:p>
-    <w:p>
-      <w:pPr>
-        <w:spacing w:after="120" w:line="360" w:lineRule="auto"/>
-        <w:ind w:firstLine="360"/>
-        <w:jc w:val="both"/>
-      </w:pPr>
-    </w:p>
-    <w:p>
-      <w:pPr>
-        <w:spacing w:after="120" w:line="360" w:lineRule="auto"/>
-        <w:ind w:firstLine="360"/>
-        <w:jc w:val="both"/>
-      </w:pPr>
-    </w:p>
-    <w:p>
-      <w:pPr>
-        <w:spacing w:after="120" w:line="360" w:lineRule="auto"/>
-        <w:ind w:firstLine="360"/>
-        <w:jc w:val="both"/>
-        <w:rPr>
-          <w:rFonts w:hint="eastAsia"/>
-        </w:rPr>
-      </w:pPr>
     </w:p>
     <w:p>
       <w:pPr>
         <w:spacing w:after="120" w:line="360" w:lineRule="auto"/>
         <w:jc w:val="both"/>
+        <w:rPr>
+          <w:b/>
+          <w:bCs/>
+          <w:noProof/>
+        </w:rPr>
+      </w:pPr>
+      <w:r>
         <w:rPr>
           <w:rFonts w:hint="eastAsia"/>
           <w:b/>
           <w:bCs/>
           <w:noProof/>
         </w:rPr>
-      </w:pPr>
-      <w:r>
-        <w:rPr>
-          <w:rFonts w:hint="eastAsia"/>
-          <w:b/>
-          <w:bCs/>
-          <w:noProof/>
-        </w:rPr>
-        <w:lastRenderedPageBreak/>
         <w:t>Figure X. Contour-Enhanced Funnel Plot</w:t>
       </w:r>
     </w:p>
@@ -11698,9 +12016,12 @@
       <w:pPr>
         <w:spacing w:after="120" w:line="360" w:lineRule="auto"/>
         <w:jc w:val="center"/>
-        <w:rPr>
-          <w:rFonts w:hint="eastAsia"/>
-        </w:rPr>
+      </w:pPr>
+    </w:p>
+    <w:p>
+      <w:pPr>
+        <w:spacing w:after="120" w:line="360" w:lineRule="auto"/>
+        <w:jc w:val="center"/>
       </w:pPr>
       <w:r>
         <w:rPr>
@@ -11708,10 +12029,10 @@
           <w:noProof/>
         </w:rPr>
         <w:drawing>
-          <wp:inline distT="0" distB="0" distL="0" distR="0" wp14:anchorId="1C0FC166" wp14:editId="237B157D">
-            <wp:extent cx="4902200" cy="4085167"/>
+          <wp:inline distT="0" distB="0" distL="0" distR="0" wp14:anchorId="5C9BA0DB" wp14:editId="1F8530C8">
+            <wp:extent cx="5943600" cy="4953000"/>
             <wp:effectExtent l="0" t="0" r="0" b="0"/>
-            <wp:docPr id="121744578" name="图片 1" descr="图表&#10;&#10;描述已自动生成"/>
+            <wp:docPr id="2036369271" name="图片 11" descr="图表&#10;&#10;描述已自动生成"/>
             <wp:cNvGraphicFramePr>
               <a:graphicFrameLocks xmlns:a="http://schemas.openxmlformats.org/drawingml/2006/main" noChangeAspect="1"/>
             </wp:cNvGraphicFramePr>
@@ -11719,7 +12040,7 @@
               <a:graphicData uri="http://schemas.openxmlformats.org/drawingml/2006/picture">
                 <pic:pic xmlns:pic="http://schemas.openxmlformats.org/drawingml/2006/picture">
                   <pic:nvPicPr>
-                    <pic:cNvPr id="121744578" name="图片 1" descr="图表&#10;&#10;描述已自动生成"/>
+                    <pic:cNvPr id="2036369271" name="图片 11" descr="图表&#10;&#10;描述已自动生成"/>
                     <pic:cNvPicPr/>
                   </pic:nvPicPr>
                   <pic:blipFill>
@@ -11737,7 +12058,7 @@
                   <pic:spPr>
                     <a:xfrm>
                       <a:off x="0" y="0"/>
-                      <a:ext cx="4905577" cy="4087981"/>
+                      <a:ext cx="5943600" cy="4953000"/>
                     </a:xfrm>
                     <a:prstGeom prst="rect">
                       <a:avLst/>
@@ -11764,16 +12085,17 @@
         <w:t>Note</w:t>
       </w:r>
       <w:r>
-        <w:t>. Each circle represents one study included in the post-intervention meta-analysis. The x-axis shows the standardized mean difference (Hedges’ g), with positive values indicating effects favoring unguided self-help CBT. The y-axis shows the standard error, with more precise studies appearing toward the top of the plot. The vertical dotted line represents the pooled random-effects estimate, and the diagonal dotted lines indicate the expected funnel around the pooled effect. Shaded contours indicate regions of statistical significance for a two-sided test against the null effect (p &lt; .10, p &lt; .05, and p &lt; .01).</w:t>
+        <w:t xml:space="preserve">. Each circle represents one study included in the post-intervention meta-analysis. The x-axis shows the standardized mean difference (Hedges’ g), with positive values indicating effects favoring unguided self-help CBT. The y-axis shows the standard error, with more precise studies appearing toward </w:t>
+      </w:r>
+      <w:r>
+        <w:lastRenderedPageBreak/>
+        <w:t>the top of the plot. The vertical dotted line represents the pooled random-effects estimate, and the diagonal dotted lines indicate the expected funnel around the pooled effect. Shaded contours indicate regions of statistical significance for a two-sided test against the null effect (p &lt; .10, p &lt; .05, and p &lt; .01).</w:t>
       </w:r>
     </w:p>
     <w:p>
       <w:pPr>
         <w:spacing w:after="120" w:line="360" w:lineRule="auto"/>
         <w:jc w:val="both"/>
-        <w:rPr>
-          <w:rFonts w:hint="eastAsia"/>
-        </w:rPr>
       </w:pPr>
     </w:p>
     <w:p>
@@ -11781,42 +12103,33 @@
         <w:spacing w:after="120" w:line="360" w:lineRule="auto"/>
         <w:ind w:firstLine="360"/>
         <w:jc w:val="both"/>
-        <w:rPr>
-          <w:rFonts w:hint="eastAsia"/>
-        </w:rPr>
-      </w:pPr>
-      <w:r>
-        <w:t>Trim-and-fill analysis using the L₀ estimator imputed two potentially missing studies on the negative side of the funnel plot. The adjusted pooled estimate was attenuated from g = 0.27 to g = 0.21, and the confidence interval crossed zero, 95% CI [−0.04, 0.47] (Table X). The prediction interval also widened from [−0.27, 0.80] to [−0.50, 0.93], alongside an increase in between-study heterogeneity (τ² = 0.055 to 0.102). Taken together, the formal regression tests did not provide statistically significant evidence of funnel plot asymmetry; however, the contour-enhanced funnel plot and trim-and-fill results suggest that small-study effects cannot be ruled out. Therefore, the pooled post-intervention effect should be interpreted cautiously.</w:t>
-      </w:r>
+      </w:pPr>
+      <w:r>
+        <w:t>Trim-and-fill analysis using the L₀ estimator imputed two potentially missing studies on the negative side of the funnel plot. The adjusted pooled estimate was attenuated from g = 0.27 to g = 0.21, and the confidence interval crossed zero, 95% CI [−0.04, 0.47] (Table X). The prediction interval widened from [−0.27, 0.80] to [−0.50, 0.92], and between-study heterogeneity increased (τ² = 0.055 to 0.102). Taken together, the formal regression tests did not provide statistically significant evidence of funnel plot asymmetry; however, the contour-enhanced funnel plot and trim-and-fill results suggest that small-study effects cannot be ruled out. Therefore, the pooled post-intervention effect should be interpreted cautiously.</w:t>
+      </w:r>
+    </w:p>
+    <w:p>
+      <w:pPr>
+        <w:spacing w:after="120" w:line="360" w:lineRule="auto"/>
+        <w:ind w:firstLine="360"/>
+        <w:jc w:val="both"/>
+      </w:pPr>
     </w:p>
     <w:p>
       <w:pPr>
         <w:spacing w:after="120" w:line="360" w:lineRule="auto"/>
         <w:jc w:val="both"/>
+        <w:rPr>
+          <w:b/>
+          <w:bCs/>
+        </w:rPr>
+      </w:pPr>
+      <w:r>
         <w:rPr>
           <w:rFonts w:hint="eastAsia"/>
           <w:b/>
           <w:bCs/>
         </w:rPr>
-      </w:pPr>
-    </w:p>
-    <w:p>
-      <w:pPr>
-        <w:spacing w:after="120" w:line="360" w:lineRule="auto"/>
-        <w:jc w:val="both"/>
-        <w:rPr>
-          <w:rFonts w:hint="eastAsia"/>
-          <w:b/>
-          <w:bCs/>
-        </w:rPr>
-      </w:pPr>
-      <w:r>
-        <w:rPr>
-          <w:rFonts w:hint="eastAsia"/>
-          <w:b/>
-          <w:bCs/>
-        </w:rPr>
-        <w:lastRenderedPageBreak/>
         <w:t xml:space="preserve">Table </w:t>
       </w:r>
       <w:r>
@@ -11908,73 +12221,71 @@
               <w:spacing w:after="120" w:line="360" w:lineRule="auto"/>
               <w:jc w:val="center"/>
               <w:rPr>
+                <w:b/>
+                <w:bCs/>
+                <w:i/>
+                <w:iCs/>
+              </w:rPr>
+            </w:pPr>
+            <w:r>
+              <w:rPr>
+                <w:b/>
+                <w:bCs/>
+              </w:rPr>
+              <w:t>I</w:t>
+            </w:r>
+            <w:r>
+              <w:rPr>
+                <w:rFonts w:hint="eastAsia"/>
+                <w:b/>
+                <w:bCs/>
+              </w:rPr>
+              <w:t>mputed k</w:t>
+            </w:r>
+          </w:p>
+        </w:tc>
+        <w:tc>
+          <w:tcPr>
+            <w:tcW w:w="1768" w:type="dxa"/>
+            <w:tcBorders>
+              <w:top w:val="single" w:sz="12" w:space="0" w:color="auto"/>
+              <w:bottom w:val="single" w:sz="4" w:space="0" w:color="auto"/>
+            </w:tcBorders>
+          </w:tcPr>
+          <w:p>
+            <w:pPr>
+              <w:spacing w:after="120" w:line="360" w:lineRule="auto"/>
+              <w:jc w:val="center"/>
+              <w:rPr>
+                <w:b/>
+                <w:bCs/>
+                <w:i/>
+                <w:iCs/>
+              </w:rPr>
+            </w:pPr>
+            <w:r>
+              <w:rPr>
+                <w:rFonts w:hint="eastAsia"/>
+                <w:b/>
+                <w:bCs/>
+              </w:rPr>
+              <w:t>Hedges</w:t>
+            </w:r>
+            <w:r>
+              <w:rPr>
+                <w:b/>
+                <w:bCs/>
+              </w:rPr>
+              <w:t>’</w:t>
+            </w:r>
+            <w:r>
+              <w:rPr>
                 <w:rFonts w:hint="eastAsia"/>
                 <w:b/>
                 <w:bCs/>
                 <w:i/>
                 <w:iCs/>
               </w:rPr>
-            </w:pPr>
-            <w:r>
-              <w:rPr>
-                <w:b/>
-                <w:bCs/>
-              </w:rPr>
-              <w:t>I</w:t>
-            </w:r>
-            <w:r>
-              <w:rPr>
-                <w:rFonts w:hint="eastAsia"/>
-                <w:b/>
-                <w:bCs/>
-              </w:rPr>
-              <w:t>mputed k</w:t>
-            </w:r>
-          </w:p>
-        </w:tc>
-        <w:tc>
-          <w:tcPr>
-            <w:tcW w:w="1768" w:type="dxa"/>
-            <w:tcBorders>
-              <w:top w:val="single" w:sz="12" w:space="0" w:color="auto"/>
-              <w:bottom w:val="single" w:sz="4" w:space="0" w:color="auto"/>
-            </w:tcBorders>
-          </w:tcPr>
-          <w:p>
-            <w:pPr>
-              <w:spacing w:after="120" w:line="360" w:lineRule="auto"/>
-              <w:jc w:val="center"/>
-              <w:rPr>
-                <w:rFonts w:hint="eastAsia"/>
-                <w:b/>
-                <w:bCs/>
-                <w:i/>
-                <w:iCs/>
-              </w:rPr>
-            </w:pPr>
-            <w:r>
-              <w:rPr>
-                <w:rFonts w:hint="eastAsia"/>
-                <w:b/>
-                <w:bCs/>
-              </w:rPr>
-              <w:t>Hedges</w:t>
-            </w:r>
-            <w:r>
-              <w:rPr>
-                <w:b/>
-                <w:bCs/>
-              </w:rPr>
-              <w:t>’</w:t>
-            </w:r>
-            <w:r>
-              <w:rPr>
-                <w:rFonts w:hint="eastAsia"/>
-                <w:b/>
-                <w:bCs/>
-                <w:i/>
-                <w:iCs/>
-              </w:rPr>
               <w:t xml:space="preserve"> g</w:t>
             </w:r>
           </w:p>
@@ -12101,9 +12412,6 @@
             <w:pPr>
               <w:spacing w:after="120" w:line="360" w:lineRule="auto"/>
               <w:jc w:val="center"/>
-              <w:rPr>
-                <w:rFonts w:hint="eastAsia"/>
-              </w:rPr>
             </w:pPr>
             <w:r>
               <w:rPr>
@@ -12143,9 +12451,6 @@
             <w:pPr>
               <w:spacing w:after="120" w:line="360" w:lineRule="auto"/>
               <w:jc w:val="center"/>
-              <w:rPr>
-                <w:rFonts w:hint="eastAsia"/>
-              </w:rPr>
             </w:pPr>
             <w:r>
               <w:rPr>
@@ -12205,7 +12510,16 @@
               <w:jc w:val="center"/>
             </w:pPr>
             <w:r>
-              <w:t>35.34 (13)</w:t>
+              <w:t>35.</w:t>
+            </w:r>
+            <w:r>
+              <w:rPr>
+                <w:rFonts w:hint="eastAsia"/>
+              </w:rPr>
+              <w:t>19</w:t>
+            </w:r>
+            <w:r>
+              <w:t xml:space="preserve"> (13)</w:t>
             </w:r>
           </w:p>
         </w:tc>
@@ -12225,9 +12539,6 @@
             <w:pPr>
               <w:spacing w:after="120" w:line="360" w:lineRule="auto"/>
               <w:jc w:val="center"/>
-              <w:rPr>
-                <w:rFonts w:hint="eastAsia"/>
-              </w:rPr>
             </w:pPr>
             <w:r>
               <w:rPr>
@@ -12248,9 +12559,6 @@
             <w:pPr>
               <w:spacing w:after="120" w:line="360" w:lineRule="auto"/>
               <w:jc w:val="center"/>
-              <w:rPr>
-                <w:rFonts w:hint="eastAsia"/>
-              </w:rPr>
             </w:pPr>
             <w:r>
               <w:rPr>
@@ -12271,9 +12579,6 @@
             <w:pPr>
               <w:spacing w:after="120" w:line="360" w:lineRule="auto"/>
               <w:jc w:val="center"/>
-              <w:rPr>
-                <w:rFonts w:hint="eastAsia"/>
-              </w:rPr>
             </w:pPr>
             <w:r>
               <w:rPr>
@@ -12313,7 +12618,16 @@
               <w:jc w:val="center"/>
             </w:pPr>
             <w:r>
-              <w:t>[−0.50, 0.93]</w:t>
+              <w:t>[−0.50, 0.9</w:t>
+            </w:r>
+            <w:r>
+              <w:rPr>
+                <w:rFonts w:hint="eastAsia"/>
+              </w:rPr>
+              <w:t>2</w:t>
+            </w:r>
+            <w:r>
+              <w:t>]</w:t>
             </w:r>
           </w:p>
         </w:tc>
@@ -12330,7 +12644,25 @@
               <w:jc w:val="center"/>
             </w:pPr>
             <w:r>
-              <w:t>48.14 (15)</w:t>
+              <w:t>4</w:t>
+            </w:r>
+            <w:r>
+              <w:rPr>
+                <w:rFonts w:hint="eastAsia"/>
+              </w:rPr>
+              <w:t>7</w:t>
+            </w:r>
+            <w:r>
+              <w:t>.</w:t>
+            </w:r>
+            <w:r>
+              <w:rPr>
+                <w:rFonts w:hint="eastAsia"/>
+              </w:rPr>
+              <w:t>97</w:t>
+            </w:r>
+            <w:r>
+              <w:t xml:space="preserve"> (15)</w:t>
             </w:r>
           </w:p>
         </w:tc>
@@ -12353,61 +12685,137 @@
         <w:spacing w:after="120" w:line="360" w:lineRule="auto"/>
         <w:jc w:val="both"/>
         <w:rPr>
+          <w:b/>
+          <w:bCs/>
+          <w:noProof/>
+        </w:rPr>
+      </w:pPr>
+      <w:r>
+        <w:rPr>
+          <w:i/>
+          <w:iCs/>
+        </w:rPr>
+        <w:t xml:space="preserve">Note. </w:t>
+      </w:r>
+      <w:r>
+        <w:t>Trim-and-fill (L₀ estimator) imputed two hypothetical studies on the negative tail (g = −0.61, mirror of Ackerson 1998; g = −1.10, mirror of Fleming 2012). Adjusted estimates were based on a random-effects model with the REML estimator and Hartung–Knapp adjustment. PI = prediction interval.</w:t>
+      </w:r>
+    </w:p>
+    <w:p>
+      <w:pPr>
+        <w:spacing w:after="120" w:line="360" w:lineRule="auto"/>
+        <w:jc w:val="both"/>
+        <w:rPr>
+          <w:b/>
+          <w:bCs/>
+          <w:noProof/>
+        </w:rPr>
+      </w:pPr>
+    </w:p>
+    <w:p>
+      <w:pPr>
+        <w:spacing w:after="120" w:line="360" w:lineRule="auto"/>
+        <w:jc w:val="both"/>
+        <w:rPr>
+          <w:b/>
+          <w:bCs/>
+          <w:noProof/>
+        </w:rPr>
+      </w:pPr>
+    </w:p>
+    <w:p>
+      <w:pPr>
+        <w:spacing w:after="120" w:line="360" w:lineRule="auto"/>
+        <w:jc w:val="both"/>
+        <w:rPr>
+          <w:b/>
+          <w:bCs/>
+          <w:noProof/>
+        </w:rPr>
+      </w:pPr>
+    </w:p>
+    <w:p>
+      <w:pPr>
+        <w:spacing w:after="120" w:line="360" w:lineRule="auto"/>
+        <w:jc w:val="both"/>
+        <w:rPr>
+          <w:b/>
+          <w:bCs/>
+          <w:noProof/>
+        </w:rPr>
+      </w:pPr>
+    </w:p>
+    <w:p>
+      <w:pPr>
+        <w:spacing w:after="120" w:line="360" w:lineRule="auto"/>
+        <w:jc w:val="both"/>
+        <w:rPr>
+          <w:b/>
+          <w:bCs/>
+          <w:noProof/>
+        </w:rPr>
+      </w:pPr>
+    </w:p>
+    <w:p>
+      <w:pPr>
+        <w:spacing w:after="120" w:line="360" w:lineRule="auto"/>
+        <w:jc w:val="both"/>
+        <w:rPr>
+          <w:b/>
+          <w:bCs/>
+          <w:noProof/>
+        </w:rPr>
+      </w:pPr>
+    </w:p>
+    <w:p>
+      <w:pPr>
+        <w:spacing w:after="120" w:line="360" w:lineRule="auto"/>
+        <w:jc w:val="both"/>
+        <w:rPr>
+          <w:b/>
+          <w:bCs/>
+          <w:noProof/>
+        </w:rPr>
+      </w:pPr>
+    </w:p>
+    <w:p>
+      <w:pPr>
+        <w:spacing w:after="120" w:line="360" w:lineRule="auto"/>
+        <w:jc w:val="both"/>
+        <w:rPr>
+          <w:b/>
+          <w:bCs/>
+          <w:noProof/>
+        </w:rPr>
+      </w:pPr>
+    </w:p>
+    <w:p>
+      <w:pPr>
+        <w:spacing w:after="120" w:line="360" w:lineRule="auto"/>
+        <w:jc w:val="both"/>
+        <w:rPr>
+          <w:b/>
+          <w:bCs/>
+          <w:noProof/>
+        </w:rPr>
+      </w:pPr>
+      <w:r>
+        <w:rPr>
           <w:rFonts w:hint="eastAsia"/>
           <w:b/>
           <w:bCs/>
           <w:noProof/>
         </w:rPr>
-      </w:pPr>
-      <w:r>
-        <w:rPr>
-          <w:i/>
-          <w:iCs/>
-        </w:rPr>
-        <w:t xml:space="preserve">Note. </w:t>
-      </w:r>
-      <w:r>
-        <w:t>Trim-and-fill (L₀ estimator) imputed two hypothetical studies on the negative tail (g = −0.61, mirror of Ackerson 1998; g = −1.10, mirror of Fleming 2012). Adjusted estimate based on k = 16 (14 observed + 2 imputed) using a random-effects model with Hartung–Knapp adjustment. PI = prediction interval.</w:t>
-      </w:r>
-    </w:p>
-    <w:p>
-      <w:pPr>
-        <w:spacing w:after="120" w:line="360" w:lineRule="auto"/>
-        <w:jc w:val="both"/>
-        <w:rPr>
-          <w:b/>
-          <w:bCs/>
-          <w:noProof/>
-        </w:rPr>
-      </w:pPr>
-    </w:p>
-    <w:p>
-      <w:pPr>
-        <w:spacing w:after="120" w:line="360" w:lineRule="auto"/>
-        <w:jc w:val="both"/>
+        <w:lastRenderedPageBreak/>
+        <w:t xml:space="preserve">Figure X. </w:t>
+      </w:r>
+      <w:r>
         <w:rPr>
           <w:rFonts w:hint="eastAsia"/>
           <w:b/>
           <w:bCs/>
           <w:noProof/>
         </w:rPr>
-      </w:pPr>
-      <w:r>
-        <w:rPr>
-          <w:rFonts w:hint="eastAsia"/>
-          <w:b/>
-          <w:bCs/>
-          <w:noProof/>
-        </w:rPr>
-        <w:t xml:space="preserve">Figure X. </w:t>
-      </w:r>
-      <w:r>
-        <w:rPr>
-          <w:rFonts w:hint="eastAsia"/>
-          <w:b/>
-          <w:bCs/>
-          <w:noProof/>
-        </w:rPr>
         <w:t>Trim-and-Fill Funnel Plot</w:t>
       </w:r>
     </w:p>
@@ -12418,14 +12826,13 @@
       </w:pPr>
       <w:r>
         <w:rPr>
-          <w:rFonts w:hint="eastAsia"/>
           <w:noProof/>
         </w:rPr>
         <w:drawing>
-          <wp:inline distT="0" distB="0" distL="0" distR="0" wp14:anchorId="3D921315" wp14:editId="2A82D29F">
-            <wp:extent cx="4754880" cy="3962400"/>
-            <wp:effectExtent l="0" t="0" r="7620" b="0"/>
-            <wp:docPr id="1477968769" name="图片 2" descr="图表&#10;&#10;描述已自动生成"/>
+          <wp:inline distT="0" distB="0" distL="0" distR="0" wp14:anchorId="0F0CB9F3" wp14:editId="5229A6F3">
+            <wp:extent cx="5943600" cy="4953000"/>
+            <wp:effectExtent l="0" t="0" r="0" b="0"/>
+            <wp:docPr id="232148321" name="图片 12" descr="图表&#10;&#10;描述已自动生成"/>
             <wp:cNvGraphicFramePr>
               <a:graphicFrameLocks xmlns:a="http://schemas.openxmlformats.org/drawingml/2006/main" noChangeAspect="1"/>
             </wp:cNvGraphicFramePr>
@@ -12433,7 +12840,7 @@
               <a:graphicData uri="http://schemas.openxmlformats.org/drawingml/2006/picture">
                 <pic:pic xmlns:pic="http://schemas.openxmlformats.org/drawingml/2006/picture">
                   <pic:nvPicPr>
-                    <pic:cNvPr id="1477968769" name="图片 2" descr="图表&#10;&#10;描述已自动生成"/>
+                    <pic:cNvPr id="232148321" name="图片 12" descr="图表&#10;&#10;描述已自动生成"/>
                     <pic:cNvPicPr/>
                   </pic:nvPicPr>
                   <pic:blipFill>
@@ -12451,7 +12858,7 @@
                   <pic:spPr>
                     <a:xfrm>
                       <a:off x="0" y="0"/>
-                      <a:ext cx="4755725" cy="3963104"/>
+                      <a:ext cx="5943600" cy="4953000"/>
                     </a:xfrm>
                     <a:prstGeom prst="rect">
                       <a:avLst/>
@@ -12467,9 +12874,6 @@
     <w:p>
       <w:pPr>
         <w:spacing w:after="120" w:line="360" w:lineRule="auto"/>
-        <w:rPr>
-          <w:rFonts w:hint="eastAsia"/>
-        </w:rPr>
       </w:pPr>
       <w:r>
         <w:rPr>
@@ -12479,29 +12883,32 @@
         <w:t>Note</w:t>
       </w:r>
       <w:r>
-        <w:t xml:space="preserve">. Grey circles indicate observed studies, and open circles indicate studies imputed by the trim-and-fill procedure. The x-axis shows the standardized mean difference, with positive values favoring unguided self-help CBT; the y-axis shows the standard error. The vertical dotted line represents the trim-and-fill </w:t>
-      </w:r>
-      <w:r>
-        <w:lastRenderedPageBreak/>
-        <w:t>adjusted pooled estimate. Shaded contours indicate regions of statistical significance for a two-sided test against the null effect.</w:t>
-      </w:r>
-    </w:p>
-    <w:p>
-      <w:pPr>
-        <w:pStyle w:val="1"/>
-        <w:pageBreakBefore/>
-      </w:pPr>
-      <w:r>
-        <w:lastRenderedPageBreak/>
-        <w:t>Chapter 5. Discussion and Conclusion</w:t>
-      </w:r>
+        <w:t>. Grey circles indicate observed studies, and open circles indicate studies imputed by the trim-and-fill procedure. The x-axis shows the standardized mean difference, with positive values favoring unguided self-help CBT; the y-axis shows the standard error. The vertical dotted line represents the trim-and-fill adjusted pooled estimate. Shaded contours indicate regions of statistical significance for a two-sided test against the null effect.</w:t>
+      </w:r>
+    </w:p>
+    <w:p>
+      <w:pPr>
+        <w:spacing w:after="120" w:line="360" w:lineRule="auto"/>
+      </w:pPr>
     </w:p>
     <w:p>
       <w:pPr>
         <w:pStyle w:val="2"/>
       </w:pPr>
       <w:r>
-        <w:t>5.1. Summary of Findings</w:t>
+        <w:t>4.</w:t>
+      </w:r>
+      <w:r>
+        <w:rPr>
+          <w:rFonts w:eastAsiaTheme="minorEastAsia" w:hint="eastAsia"/>
+        </w:rPr>
+        <w:t>8</w:t>
+      </w:r>
+      <w:r>
+        <w:t xml:space="preserve">. </w:t>
+      </w:r>
+      <w:r>
+        <w:t>Acceptability (Differential Dropout)</w:t>
       </w:r>
     </w:p>
     <w:p>
@@ -12514,7 +12921,22 @@
         <w:rPr>
           <w:rFonts w:eastAsia="Times New Roman"/>
         </w:rPr>
-        <w:t>[Placeholder: principal findings mapped to research questions.]</w:t>
+        <w:t>[Placeholder for differential dropout analysis.]</w:t>
+      </w:r>
+    </w:p>
+    <w:p>
+      <w:pPr>
+        <w:spacing w:after="120" w:line="360" w:lineRule="auto"/>
+      </w:pPr>
+    </w:p>
+    <w:p>
+      <w:pPr>
+        <w:pStyle w:val="1"/>
+        <w:pageBreakBefore/>
+      </w:pPr>
+      <w:r>
+        <w:lastRenderedPageBreak/>
+        <w:t>Chapter 5. Discussion and Conclusion</w:t>
       </w:r>
     </w:p>
     <w:p>
@@ -12522,7 +12944,7 @@
         <w:pStyle w:val="2"/>
       </w:pPr>
       <w:r>
-        <w:t>5.2. Comparison with Prior Reviews</w:t>
+        <w:t>5.1. Summary of Findings</w:t>
       </w:r>
     </w:p>
     <w:p>
@@ -12535,7 +12957,7 @@
         <w:rPr>
           <w:rFonts w:eastAsia="Times New Roman"/>
         </w:rPr>
-        <w:t>[Placeholder: comparison with Bjornstad et al. (2024), Furukawa et al. (2021), and Tong et al. (2024).]</w:t>
+        <w:t>[Placeholder: principal findings mapped to research questions.]</w:t>
       </w:r>
     </w:p>
     <w:p>
@@ -12543,18 +12965,7 @@
         <w:pStyle w:val="2"/>
       </w:pPr>
       <w:r>
-        <w:t>5.3. Interpretation of Subgroup, Sensitivity, and Meta-Regression Findings</w:t>
-      </w:r>
-    </w:p>
-    <w:p>
-      <w:pPr>
-        <w:pStyle w:val="3"/>
-        <w:rPr>
-          <w:rFonts w:eastAsiaTheme="minorEastAsia"/>
-        </w:rPr>
-      </w:pPr>
-      <w:r>
-        <w:t xml:space="preserve">5.3.1 Subgroup findings (control type, baseline severity, age, human contact) </w:t>
+        <w:t>5.2. Comparison with Prior Reviews</w:t>
       </w:r>
     </w:p>
     <w:p>
@@ -12564,40 +12975,29 @@
         <w:jc w:val="both"/>
       </w:pPr>
       <w:r>
-        <w:t>These analyses were interpreted as exploratory because CBT components co-occurred within multi-component intervention packages and therefore cannot be interpreted as estimates of the independent causal effect of individual components.</w:t>
+        <w:rPr>
+          <w:rFonts w:eastAsia="Times New Roman"/>
+        </w:rPr>
+        <w:t>[Placeholder: comparison with Bjornstad et al. (2024), Furukawa et al. (2021), and Tong et al. (2024).]</w:t>
+      </w:r>
+    </w:p>
+    <w:p>
+      <w:pPr>
+        <w:pStyle w:val="2"/>
+      </w:pPr>
+      <w:r>
+        <w:t>5.3. Interpretation of Subgroup, Sensitivity, and Meta-Regression Findings</w:t>
       </w:r>
     </w:p>
     <w:p>
       <w:pPr>
         <w:pStyle w:val="3"/>
-      </w:pPr>
-      <w:r>
-        <w:t xml:space="preserve">5.3.2 Sensitivity analyses (publication type, strict cutoff, treatment vs. prevention, depression primary vs. secondary, dose intensity, </w:t>
-      </w:r>
-      <w:r>
-        <w:rPr>
-          <w:rFonts w:eastAsiaTheme="minorEastAsia" w:hint="eastAsia"/>
-        </w:rPr>
-        <w:t xml:space="preserve">effect size format, </w:t>
-      </w:r>
-      <w:r>
-        <w:t xml:space="preserve">leave-one-out) </w:t>
-      </w:r>
-    </w:p>
-    <w:p>
-      <w:pPr>
-        <w:pStyle w:val="3"/>
-      </w:pPr>
-      <w:r>
-        <w:t>5.3.3 Meta-regression and descriptive characterization (component count, total dose, delivery modality, component configuration)</w:t>
-      </w:r>
-    </w:p>
-    <w:p>
-      <w:pPr>
-        <w:pStyle w:val="2"/>
-      </w:pPr>
-      <w:r>
-        <w:t>5.4. Limitations</w:t>
+        <w:rPr>
+          <w:rFonts w:eastAsiaTheme="minorEastAsia"/>
+        </w:rPr>
+      </w:pPr>
+      <w:r>
+        <w:t xml:space="preserve">5.3.1 Subgroup findings (control type, baseline severity, age, human contact) </w:t>
       </w:r>
     </w:p>
     <w:p>
@@ -12607,24 +13007,53 @@
         <w:jc w:val="both"/>
       </w:pPr>
       <w:r>
-        <w:rPr>
-          <w:rFonts w:eastAsia="Times New Roman"/>
-        </w:rPr>
-        <w:t xml:space="preserve">[Placeholder for limitations, </w:t>
-      </w:r>
-      <w:proofErr w:type="gramStart"/>
-      <w:r>
-        <w:rPr>
-          <w:rFonts w:eastAsia="Times New Roman"/>
-        </w:rPr>
-        <w:t>including:</w:t>
-      </w:r>
-      <w:proofErr w:type="gramEnd"/>
-      <w:r>
-        <w:rPr>
-          <w:rFonts w:eastAsia="Times New Roman"/>
-        </w:rPr>
-        <w:t xml:space="preserve"> small number of trials meeting the inactive-control criterion post-2023; heterogeneity in support-level reporting; reliance on back-calculated SDs for some trials; and use of study-level subgroup analysis rather than individual participant data.]</w:t>
+        <w:t>These analyses were interpreted as exploratory because CBT components co-occurred within multi-component intervention packages and therefore cannot be interpreted as estimates of the independent causal effect of individual components.</w:t>
+      </w:r>
+    </w:p>
+    <w:p>
+      <w:pPr>
+        <w:pStyle w:val="3"/>
+      </w:pPr>
+      <w:r>
+        <w:t xml:space="preserve">5.3.2 Sensitivity analyses (publication type, strict cutoff, treatment vs. prevention, depression primary vs. secondary, dose intensity, </w:t>
+      </w:r>
+      <w:r>
+        <w:rPr>
+          <w:rFonts w:eastAsiaTheme="minorEastAsia" w:hint="eastAsia"/>
+        </w:rPr>
+        <w:t xml:space="preserve">effect size format, </w:t>
+      </w:r>
+      <w:r>
+        <w:t xml:space="preserve">leave-one-out) </w:t>
+      </w:r>
+    </w:p>
+    <w:p>
+      <w:pPr>
+        <w:pStyle w:val="3"/>
+      </w:pPr>
+      <w:r>
+        <w:t>5.3.3 Meta-regression and descriptive characterization (component count, total dose, delivery modality, component configuration)</w:t>
+      </w:r>
+    </w:p>
+    <w:p>
+      <w:pPr>
+        <w:pStyle w:val="2"/>
+      </w:pPr>
+      <w:r>
+        <w:t>5.4. Limitations</w:t>
+      </w:r>
+    </w:p>
+    <w:p>
+      <w:pPr>
+        <w:spacing w:after="120" w:line="360" w:lineRule="auto"/>
+        <w:ind w:firstLine="360"/>
+        <w:jc w:val="both"/>
+      </w:pPr>
+      <w:r>
+        <w:rPr>
+          <w:rFonts w:eastAsia="Times New Roman"/>
+        </w:rPr>
+        <w:t>[Placeholder for limitations, including: small number of trials meeting the inactive-control criterion post-2023; heterogeneity in support-level reporting; reliance on back-calculated SDs for some trials; and use of study-level subgroup analysis rather than individual participant data.]</w:t>
       </w:r>
     </w:p>
     <w:p>
@@ -13348,21 +13777,7 @@
         <w:rPr>
           <w:rFonts w:eastAsia="Times New Roman"/>
         </w:rPr>
-        <w:t xml:space="preserve">McFadden, L., Seidman, E., &amp; Rappaport, J. (1992). A comparison of espoused theories of self- and </w:t>
-      </w:r>
-      <w:proofErr w:type="gramStart"/>
-      <w:r>
-        <w:rPr>
-          <w:rFonts w:eastAsia="Times New Roman"/>
-        </w:rPr>
-        <w:t>mutual-help</w:t>
-      </w:r>
-      <w:proofErr w:type="gramEnd"/>
-      <w:r>
-        <w:rPr>
-          <w:rFonts w:eastAsia="Times New Roman"/>
-        </w:rPr>
-        <w:t xml:space="preserve">: Implications for mental health professionals. </w:t>
+        <w:t xml:space="preserve">McFadden, L., Seidman, E., &amp; Rappaport, J. (1992). A comparison of espoused theories of self- and mutual-help: Implications for mental health professionals. </w:t>
       </w:r>
       <w:r>
         <w:rPr>
@@ -14204,21 +14619,7 @@
         <w:rPr>
           <w:rFonts w:eastAsia="Times New Roman"/>
         </w:rPr>
-        <w:t xml:space="preserve">] OR </w:t>
-      </w:r>
-      <w:proofErr w:type="gramStart"/>
-      <w:r>
-        <w:rPr>
-          <w:rFonts w:eastAsia="Times New Roman"/>
-        </w:rPr>
-        <w:t>adolescent[</w:t>
-      </w:r>
-      <w:proofErr w:type="gramEnd"/>
-      <w:r>
-        <w:rPr>
-          <w:rFonts w:eastAsia="Times New Roman"/>
-        </w:rPr>
-        <w:t>Title/Abstract] OR adolescents[Title/Abstract] OR adolescence[Title/Abstract] OR youth[Title/Abstract] OR youths[Title/Abstract] OR teen[Title/Abstract] OR teens[Title/Abstract] OR teenager[Title/Abstract] OR teenagers[Title/Abstract]</w:t>
+        <w:t>] OR adolescent[Title/Abstract] OR adolescents[Title/Abstract] OR adolescence[Title/Abstract] OR youth[Title/Abstract] OR youths[Title/Abstract] OR teen[Title/Abstract] OR teens[Title/Abstract] OR teenager[Title/Abstract] OR teenagers[Title/Abstract]</w:t>
       </w:r>
     </w:p>
     <w:p>
@@ -14267,21 +14668,7 @@
         <w:rPr>
           <w:rFonts w:eastAsia="Times New Roman"/>
         </w:rPr>
-        <w:t xml:space="preserve">] OR </w:t>
-      </w:r>
-      <w:proofErr w:type="gramStart"/>
-      <w:r>
-        <w:rPr>
-          <w:rFonts w:eastAsia="Times New Roman"/>
-        </w:rPr>
-        <w:t>depression[</w:t>
-      </w:r>
-      <w:proofErr w:type="gramEnd"/>
-      <w:r>
-        <w:rPr>
-          <w:rFonts w:eastAsia="Times New Roman"/>
-        </w:rPr>
-        <w:t>Title/Abstract] OR depressive[Title/Abstract] OR dysthymia[Title/Abstract] OR "mood disorder"[Title/Abstract] OR "affective disorder"[Title/Abstract]</w:t>
+        <w:t>] OR depression[Title/Abstract] OR depressive[Title/Abstract] OR dysthymia[Title/Abstract] OR "mood disorder"[Title/Abstract] OR "affective disorder"[Title/Abstract]</w:t>
       </w:r>
     </w:p>
     <w:p>
@@ -14761,15 +15148,7 @@
               <w:t>T</w:t>
             </w:r>
             <w:r>
-              <w:t xml:space="preserve">he integrated process of identifying, evaluating, and modifying maladaptive thoughts. The three steps form a single skill sequence rather than separable </w:t>
-            </w:r>
-            <w:proofErr w:type="gramStart"/>
-            <w:r>
-              <w:t>components, and</w:t>
-            </w:r>
-            <w:proofErr w:type="gramEnd"/>
-            <w:r>
-              <w:t xml:space="preserve"> are typically taught and practiced together using techniques such as Socratic questioning, thought records, and guided imagery.</w:t>
+              <w:t>he integrated process of identifying, evaluating, and modifying maladaptive thoughts. The three steps form a single skill sequence rather than separable components, and are typically taught and practiced together using techniques such as Socratic questioning, thought records, and guided imagery.</w:t>
             </w:r>
           </w:p>
         </w:tc>
@@ -20255,25 +20634,7 @@
                 <w:sz w:val="20"/>
                 <w:szCs w:val="20"/>
               </w:rPr>
-              <w:t xml:space="preserve">Blueblaster is an interactive depression education program consisting of 6 modules with 5 daily </w:t>
-            </w:r>
-            <w:proofErr w:type="gramStart"/>
-            <w:r>
-              <w:rPr>
-                <w:rFonts w:eastAsia="Times New Roman"/>
-                <w:sz w:val="20"/>
-                <w:szCs w:val="20"/>
-              </w:rPr>
-              <w:t>mini-sessions</w:t>
-            </w:r>
-            <w:proofErr w:type="gramEnd"/>
-            <w:r>
-              <w:rPr>
-                <w:rFonts w:eastAsia="Times New Roman"/>
-                <w:sz w:val="20"/>
-                <w:szCs w:val="20"/>
-              </w:rPr>
-              <w:t xml:space="preserve"> each. </w:t>
+              <w:t xml:space="preserve">Blueblaster is an interactive depression education program consisting of 6 modules with 5 daily mini-sessions each. </w:t>
             </w:r>
             <w:r>
               <w:rPr>
@@ -20751,25 +21112,7 @@
                 <w:sz w:val="20"/>
                 <w:szCs w:val="20"/>
               </w:rPr>
-              <w:t xml:space="preserve">Creating Opportunities for Personal Empowerment (COPE) teaches users to reframe negative beliefs into positive ones </w:t>
-            </w:r>
-            <w:proofErr w:type="gramStart"/>
-            <w:r>
-              <w:rPr>
-                <w:rFonts w:eastAsia="Times New Roman"/>
-                <w:sz w:val="20"/>
-                <w:szCs w:val="20"/>
-              </w:rPr>
-              <w:t>in order to</w:t>
-            </w:r>
-            <w:proofErr w:type="gramEnd"/>
-            <w:r>
-              <w:rPr>
-                <w:rFonts w:eastAsia="Times New Roman"/>
-                <w:sz w:val="20"/>
-                <w:szCs w:val="20"/>
-              </w:rPr>
-              <w:t xml:space="preserve"> feel better and behave more healthily. The program covers: an introduction to the COPE program and the thinking-feeling-behaving triangle (ABC model) with positive self-talk; self-esteem and positive self-talk; stress and coping, including signs of anxiety and depression; problem-solving and goal-setting (a four-step process); managing emotions through positive thinking and communication, including mental imagery and guided visualization; coping with stressful situations; and a concluding integration session.</w:t>
+              <w:t>Creating Opportunities for Personal Empowerment (COPE) teaches users to reframe negative beliefs into positive ones in order to feel better and behave more healthily. The program covers: an introduction to the COPE program and the thinking-feeling-behaving triangle (ABC model) with positive self-talk; self-esteem and positive self-talk; stress and coping, including signs of anxiety and depression; problem-solving and goal-setting (a four-step process); managing emotions through positive thinking and communication, including mental imagery and guided visualization; coping with stressful situations; and a concluding integration session.</w:t>
             </w:r>
           </w:p>
         </w:tc>
@@ -20866,25 +21209,7 @@
                 <w:sz w:val="20"/>
                 <w:szCs w:val="20"/>
               </w:rPr>
-              <w:t xml:space="preserve">Feeling Good is a bibliotherapy intervention based on Burns' self-help book. It provides practical tools and techniques empowering readers to manage their own mental health. Through real-life stories it illustrates how distorted thinking affects emotion and how to challenge and reframe such thoughts. Key ideas </w:t>
-            </w:r>
-            <w:proofErr w:type="gramStart"/>
-            <w:r>
-              <w:rPr>
-                <w:rFonts w:eastAsia="Times New Roman"/>
-                <w:sz w:val="20"/>
-                <w:szCs w:val="20"/>
-              </w:rPr>
-              <w:t>include:</w:t>
-            </w:r>
-            <w:proofErr w:type="gramEnd"/>
-            <w:r>
-              <w:rPr>
-                <w:rFonts w:eastAsia="Times New Roman"/>
-                <w:sz w:val="20"/>
-                <w:szCs w:val="20"/>
-              </w:rPr>
-              <w:t xml:space="preserve"> feelings are dictated by thoughts; shifting thought patterns promotes mental clarity; recognizing cognitive distortions allows one to regain control over emotional health; the triple-column technique challenges negative thinking; and structuring daily goals rebuilds confidence and disrupts depressive cycles.</w:t>
+              <w:t>Feeling Good is a bibliotherapy intervention based on Burns' self-help book. It provides practical tools and techniques empowering readers to manage their own mental health. Through real-life stories it illustrates how distorted thinking affects emotion and how to challenge and reframe such thoughts. Key ideas include: feelings are dictated by thoughts; shifting thought patterns promotes mental clarity; recognizing cognitive distortions allows one to regain control over emotional health; the triple-column technique challenges negative thinking; and structuring daily goals rebuilds confidence and disrupts depressive cycles.</w:t>
             </w:r>
           </w:p>
         </w:tc>
@@ -21098,25 +21423,7 @@
                 <w:sz w:val="20"/>
                 <w:szCs w:val="20"/>
               </w:rPr>
-              <w:t xml:space="preserve"> intervention combines group education with computer-based CBT training. The group education lecture covers the relationship between cognition, mood, and behavior; introduces CBT; and presents its benefits as stress-management skills with real-life examples. Group work and discussion focus on cognitive restructuring, with participants completing column worksheets to identify their own automatic thoughts and discussing </w:t>
-            </w:r>
-            <w:proofErr w:type="gramStart"/>
-            <w:r>
-              <w:rPr>
-                <w:rFonts w:eastAsia="Times New Roman"/>
-                <w:sz w:val="20"/>
-                <w:szCs w:val="20"/>
-              </w:rPr>
-              <w:t>counter-evidence</w:t>
-            </w:r>
-            <w:proofErr w:type="gramEnd"/>
-            <w:r>
-              <w:rPr>
-                <w:rFonts w:eastAsia="Times New Roman"/>
-                <w:sz w:val="20"/>
-                <w:szCs w:val="20"/>
-              </w:rPr>
-              <w:t xml:space="preserve"> and adaptive thoughts. The </w:t>
+              <w:t xml:space="preserve"> intervention combines group education with computer-based CBT training. The group education lecture covers the relationship between cognition, mood, and behavior; introduces CBT; and presents its benefits as stress-management skills with real-life examples. Group work and discussion focus on cognitive restructuring, with participants completing column worksheets to identify their own automatic thoughts and discussing counter-evidence and adaptive thoughts. The </w:t>
             </w:r>
             <w:proofErr w:type="spellStart"/>
             <w:r>
@@ -21261,25 +21568,7 @@
                 <w:sz w:val="20"/>
                 <w:szCs w:val="20"/>
               </w:rPr>
-              <w:t xml:space="preserve"> program is a computerized intervention for adolescents recruited from a pediatric emergency department with peer violence exposure and depressive symptoms. It begins with a brief (15–20 minute) computer-guided session in the Emergency Department, followed by an 8-week automated text-message curriculum. The initial face-to-face session includes motivational interviewing and CBT-informed feedback, feedback on peer violence and depressive symptoms, encouragement of </w:t>
-            </w:r>
-            <w:proofErr w:type="gramStart"/>
-            <w:r>
-              <w:rPr>
-                <w:rFonts w:eastAsia="Times New Roman"/>
-                <w:sz w:val="20"/>
-                <w:szCs w:val="20"/>
-              </w:rPr>
-              <w:t>goal-setting</w:t>
-            </w:r>
-            <w:proofErr w:type="gramEnd"/>
-            <w:r>
-              <w:rPr>
-                <w:rFonts w:eastAsia="Times New Roman"/>
-                <w:sz w:val="20"/>
-                <w:szCs w:val="20"/>
-              </w:rPr>
-              <w:t xml:space="preserve"> and self-reflection, an introduction to basic CBT concepts and their relation to the participant's experience of peer violence and depression, and an overview of the text-message component. The follow-up SMS messages include daily mood check-ins, psychoeducational content, reminders, crisis support, and behavioral prompts or motivational messages.</w:t>
+              <w:t xml:space="preserve"> program is a computerized intervention for adolescents recruited from a pediatric emergency department with peer violence exposure and depressive symptoms. It begins with a brief (15–20 minute) computer-guided session in the Emergency Department, followed by an 8-week automated text-message curriculum. The initial face-to-face session includes motivational interviewing and CBT-informed feedback, feedback on peer violence and depressive symptoms, encouragement of goal-setting and self-reflection, an introduction to basic CBT concepts and their relation to the participant's experience of peer violence and depression, and an overview of the text-message component. The follow-up SMS messages include daily mood check-ins, psychoeducational content, reminders, crisis support, and behavioral prompts or motivational messages.</w:t>
             </w:r>
           </w:p>
         </w:tc>
@@ -21473,25 +21762,7 @@
                 <w:sz w:val="20"/>
                 <w:szCs w:val="20"/>
               </w:rPr>
-              <w:t xml:space="preserve">Mello offers real-time assessment and tailored intervention strategies to disrupt repetitive negative thinking (RNT) in young people with depression and anxiety. Key features </w:t>
-            </w:r>
-            <w:proofErr w:type="gramStart"/>
-            <w:r>
-              <w:rPr>
-                <w:rFonts w:eastAsia="Times New Roman"/>
-                <w:sz w:val="20"/>
-                <w:szCs w:val="20"/>
-              </w:rPr>
-              <w:t>include:</w:t>
-            </w:r>
-            <w:proofErr w:type="gramEnd"/>
-            <w:r>
-              <w:rPr>
-                <w:rFonts w:eastAsia="Times New Roman"/>
-                <w:sz w:val="20"/>
-                <w:szCs w:val="20"/>
-              </w:rPr>
-              <w:t xml:space="preserve"> randomized notifications three times daily (9am–9pm); check-ins assessing current RNT levels, mood state, ongoing activities, and location; algorithmic recommendation of appropriate CBT activities based on level of stuck thinking, current mood, context, and activity </w:t>
+              <w:t xml:space="preserve">Mello offers real-time assessment and tailored intervention strategies to disrupt repetitive negative thinking (RNT) in young people with depression and anxiety. Key features include: randomized notifications three times daily (9am–9pm); check-ins assessing current RNT levels, mood state, ongoing activities, and location; algorithmic recommendation of appropriate CBT activities based on level of stuck thinking, current mood, context, and activity </w:t>
             </w:r>
             <w:r>
               <w:rPr>
@@ -21734,25 +22005,7 @@
                 <w:szCs w:val="20"/>
               </w:rPr>
               <w:lastRenderedPageBreak/>
-              <w:t xml:space="preserve">Note: Reframe-IT includes therapist interaction via the message board and is therefore evaluated for eligibility </w:t>
-            </w:r>
-            <w:proofErr w:type="gramStart"/>
-            <w:r>
-              <w:rPr>
-                <w:rFonts w:eastAsia="Times New Roman"/>
-                <w:sz w:val="20"/>
-                <w:szCs w:val="20"/>
-              </w:rPr>
-              <w:t>on the basis of</w:t>
-            </w:r>
-            <w:proofErr w:type="gramEnd"/>
-            <w:r>
-              <w:rPr>
-                <w:rFonts w:eastAsia="Times New Roman"/>
-                <w:sz w:val="20"/>
-                <w:szCs w:val="20"/>
-              </w:rPr>
-              <w:t xml:space="preserve"> whether that interaction constitutes therapeutic guidance.</w:t>
+              <w:t>Note: Reframe-IT includes therapist interaction via the message board and is therefore evaluated for eligibility on the basis of whether that interaction constitutes therapeutic guidance.</w:t>
             </w:r>
           </w:p>
         </w:tc>
@@ -22266,25 +22519,7 @@
                 <w:sz w:val="20"/>
                 <w:szCs w:val="20"/>
               </w:rPr>
-              <w:t xml:space="preserve">The Journey is a fantasy game-based intervention in which players select and customize their avatars and embark on an immersive quest through enchanted lands. CBT content is systematically integrated into the game; module completion awards points and </w:t>
-            </w:r>
-            <w:proofErr w:type="gramStart"/>
-            <w:r>
-              <w:rPr>
-                <w:rFonts w:eastAsia="Times New Roman"/>
-                <w:sz w:val="20"/>
-                <w:szCs w:val="20"/>
-              </w:rPr>
-              <w:t>mini-games</w:t>
-            </w:r>
-            <w:proofErr w:type="gramEnd"/>
-            <w:r>
-              <w:rPr>
-                <w:rFonts w:eastAsia="Times New Roman"/>
-                <w:sz w:val="20"/>
-                <w:szCs w:val="20"/>
-              </w:rPr>
-              <w:t xml:space="preserve"> serve as post-section rewards. The program consists of seven modules of 25–30 minutes each, each focusing on a distinct CBT topic: Introduction to the CBT Model; Behavioral Activation; Problem Solving; Cognitive Restructuring I; Cognitive Restructuring II; Cognitive Restructuring III; and Summary and Relapse Prevention. Each module begins with a mood assessment, followed by a quiz on the previous module, goal-setting, and interactive elements including exercises, animations, and instructional videos; it concludes with a content summary and a challenge (homework) assignment. </w:t>
+              <w:t xml:space="preserve">The Journey is a fantasy game-based intervention in which players select and customize their avatars and embark on an immersive quest through enchanted lands. CBT content is systematically integrated into the game; module completion awards points and mini-games serve as post-section rewards. The program consists of seven modules of 25–30 minutes each, each focusing on a distinct CBT topic: Introduction to the CBT Model; Behavioral Activation; Problem Solving; Cognitive Restructuring I; Cognitive Restructuring II; Cognitive Restructuring III; and Summary and Relapse Prevention. Each module begins with a mood assessment, followed by a quiz on the previous module, goal-setting, and interactive elements including exercises, animations, and instructional videos; it concludes with a content summary and a challenge (homework) assignment. </w:t>
             </w:r>
             <w:r>
               <w:rPr>
@@ -22293,25 +22528,7 @@
                 <w:szCs w:val="20"/>
               </w:rPr>
               <w:lastRenderedPageBreak/>
-              <w:t xml:space="preserve">A comprehensive guidebook provides module summaries, space for </w:t>
-            </w:r>
-            <w:proofErr w:type="gramStart"/>
-            <w:r>
-              <w:rPr>
-                <w:rFonts w:eastAsia="Times New Roman"/>
-                <w:sz w:val="20"/>
-                <w:szCs w:val="20"/>
-              </w:rPr>
-              <w:t>goal-setting</w:t>
-            </w:r>
-            <w:proofErr w:type="gramEnd"/>
-            <w:r>
-              <w:rPr>
-                <w:rFonts w:eastAsia="Times New Roman"/>
-                <w:sz w:val="20"/>
-                <w:szCs w:val="20"/>
-              </w:rPr>
-              <w:t>, reflection questions, and weekly journaling-based challenges.</w:t>
+              <w:t>A comprehensive guidebook provides module summaries, space for goal-setting, reflection questions, and weekly journaling-based challenges.</w:t>
             </w:r>
           </w:p>
         </w:tc>

</xml_diff>

<commit_message>
acceptability revised + dropout data correction
</commit_message>
<xml_diff>
--- a/thesis/Thesis_Final.docx
+++ b/thesis/Thesis_Final.docx
@@ -840,7 +840,15 @@
         <w:jc w:val="both"/>
       </w:pPr>
       <w:r>
-        <w:t>While adolescent mental health needs have risen sharply, the capacity of conventional services has remained limited. Within one year after the onset of COVID-19, the global prevalence of MDD and anxiety disorders increased by approximately 28% and 26% respectively, with the impact most pronounced among young people (COVID-19 Mental Disorders Collaborators, 2021). Three persistent barriers limit adolescent access to care. The first is workforce shortage. According to the WHO Mental Health Atlas, the global median number of child and adolescent psychiatrists is only 0.3 per 100,000 population, and falls below 0.1 per 100,000 in low-income countries (World Health Organization, 2021). The second is economic disadvantage. Global evidence shows that treatment coverage for MDD is especially low in low- and lower-middle-income settings, while adolescents from lower socioeconomic backgrounds also report higher levels of depressive symptoms (Moitra et al., 2022; Zhou et al., 2018). The third is stigma, which restricts help-seeking, since adolescents with mental health conditions may be perceived as lazy, weak, or socially undesirable (World Health Organization, 2022). The result is a structural mismatch. Adolescents are among those most affected by post-pandemic increases in depression, but many cannot access timely, affordable, and acceptable care.</w:t>
+        <w:t xml:space="preserve">While adolescent mental health needs have risen sharply, the capacity of conventional services has remained limited. Within one year after the onset of COVID-19, the global prevalence of MDD and anxiety disorders increased by approximately 28% and 26% respectively, with the impact most pronounced among young people (COVID-19 Mental Disorders Collaborators, 2021). Three persistent barriers limit adolescent access to care. The first is workforce shortage. According to the WHO Mental Health Atlas, the global median number of child and adolescent psychiatrists is only 0.3 per 100,000 </w:t>
+      </w:r>
+      <w:proofErr w:type="gramStart"/>
+      <w:r>
+        <w:t>population, and</w:t>
+      </w:r>
+      <w:proofErr w:type="gramEnd"/>
+      <w:r>
+        <w:t xml:space="preserve"> falls below 0.1 per 100,000 in low-income countries (World Health Organization, 2021). The second is economic disadvantage. Global evidence shows that treatment coverage for MDD is especially low in low- and lower-middle-income settings, while adolescents from lower socioeconomic backgrounds also report higher levels of depressive symptoms (Moitra et al., 2022; Zhou et al., 2018). The third is stigma, which restricts help-seeking, since adolescents with mental health conditions may be perceived as lazy, weak, or socially undesirable (World Health Organization, 2022). The result is a structural mismatch. Adolescents are among those most affected by post-pandemic increases in depression, but many cannot access timely, affordable, and acceptable care.</w:t>
       </w:r>
     </w:p>
     <w:p>
@@ -851,7 +859,15 @@
       </w:pPr>
       <w:r>
         <w:lastRenderedPageBreak/>
-        <w:t>Self-help interventions can help to address these three barriers. They require little or no direct therapist time, which reduces demand on the limited specialist workforce. They can also reach a large number of users at low cost, which may improve access for adolescents with limited financial resources. Since they can be used in private, they may also make stigma less of a barrier to seeking help. Self-help interventions can therefore reach adolescents who might otherwise stay outside the conventional treatment system. This direction is consistent with the WHO World Mental Health Report, which calls for accessible and scalable mental health support in settings where existing services are insufficient (World Health Organization, 2022).</w:t>
+        <w:t xml:space="preserve">Self-help interventions can help to address these three barriers. They require little or no direct therapist time, which reduces demand on the limited specialist workforce. They can also reach </w:t>
+      </w:r>
+      <w:proofErr w:type="gramStart"/>
+      <w:r>
+        <w:t>a large number of</w:t>
+      </w:r>
+      <w:proofErr w:type="gramEnd"/>
+      <w:r>
+        <w:t xml:space="preserve"> users at low cost, which may improve access for adolescents with limited financial resources. Since they can be used in private, they may also make stigma less of a barrier to seeking help. Self-help interventions can therefore reach adolescents who might otherwise stay outside the conventional treatment system. This direction is consistent with the WHO World Mental Health Report, which calls for accessible and scalable mental health support in settings where existing services are insufficient (World Health Organization, 2022).</w:t>
       </w:r>
     </w:p>
     <w:p>
@@ -884,7 +900,15 @@
         <w:jc w:val="both"/>
       </w:pPr>
       <w:r>
-        <w:t>These barriers are not only practical but also relational. Family involvement is not always a neutral pathway to care. Family processes, including low parental warmth, inter-parental conflict, over-involvement, aversiveness, and limited autonomy granting, have been associated with depression and anxiety in young people (Yap et al., 2014). Parents may therefore function not only as facilitators of care, but in some circumstances also as barriers to access (Platell et al., 2023). In such contexts, unguided self-help CBT may provide a practical route to structured psychological support when access through families or formal services is difficult. The ecological constraints of adolescent help-seeking, together with the developmental capacities discussed above, support examining unguided self-help CBT as a clinically and developmentally meaningful intervention format in its own right.</w:t>
+        <w:t xml:space="preserve">These barriers are not only practical but also relational. Family involvement is not always a neutral pathway to care. Family processes, including low parental warmth, inter-parental conflict, over-involvement, aversiveness, and limited autonomy granting, have been associated with depression and anxiety in young people (Yap et al., 2014). Parents may therefore function not only as facilitators of care, but in some circumstances also as barriers to access (Platell et al., 2023). In such contexts, unguided self-help CBT may provide a practical route to structured psychological support when access through families or formal services is difficult. The ecological constraints of adolescent help-seeking, together with the developmental capacities discussed above, support examining unguided self-help CBT as a clinically and developmentally meaningful intervention </w:t>
+      </w:r>
+      <w:proofErr w:type="gramStart"/>
+      <w:r>
+        <w:t>format in its own right</w:t>
+      </w:r>
+      <w:proofErr w:type="gramEnd"/>
+      <w:r>
+        <w:t>.</w:t>
       </w:r>
     </w:p>
     <w:p>
@@ -1125,7 +1149,15 @@
       </w:r>
       <w:r>
         <w:lastRenderedPageBreak/>
-        <w:t>individuals show characteristic patterns of negative automatic thoughts and dysfunctional beliefs about the self, the world, and the future. These cognitive patterns are activated under stress and serve to maintain depressive mood and behavior (Beck, 1967; Beck, Rush, Shaw, &amp; Emery, 1979). Behavior therapy, which developed in parallel, applied principles of reinforcement, punishment, and extinction in order to modify maladaptive behavioral patterns and to increase engagement in activities likely to produce positive reinforcement. The integration of these two traditions, together with the addition of emotion as a central variable, gave rise to CBT. In the CBT framework, cognition, behavior, and emotion are understood as three components that interact reciprocally, so that a change in any one of them influences the others.</w:t>
+        <w:t xml:space="preserve">individuals show characteristic patterns of negative automatic thoughts and dysfunctional beliefs about the self, the world, and the future. These cognitive patterns are activated under stress and serve to maintain depressive mood and behavior (Beck, 1967; Beck, Rush, Shaw, &amp; Emery, 1979). Behavior therapy, which developed in parallel, applied principles of reinforcement, punishment, and extinction </w:t>
+      </w:r>
+      <w:proofErr w:type="gramStart"/>
+      <w:r>
+        <w:t>in order to</w:t>
+      </w:r>
+      <w:proofErr w:type="gramEnd"/>
+      <w:r>
+        <w:t xml:space="preserve"> modify maladaptive behavioral patterns and to increase engagement in activities likely to produce positive reinforcement. The integration of these two traditions, together with the addition of emotion as a central variable, gave rise to CBT. In the CBT framework, cognition, behavior, and emotion are understood as three components that interact reciprocally, so that a change in any one of them influences the others.</w:t>
       </w:r>
     </w:p>
     <w:p>
@@ -1183,7 +1215,15 @@
       </w:r>
       <w:r>
         <w:lastRenderedPageBreak/>
-        <w:t>improving sleep hygiene, practicing relaxation, taking up new hobbies, or spending time in nature. Self-support refers to situations in which a professional provides some degree of suggestion, monitoring, or guidance in order to help the individual sustain new practices. Self-change refers to situations in which an individual in a harmful state decides, with or without external assistance, to relinquish destructive behavior and adopt more adaptive alternatives.</w:t>
+        <w:t xml:space="preserve">improving sleep hygiene, practicing relaxation, taking up new hobbies, or spending time in nature. Self-support refers to situations in which a professional provides some degree of suggestion, monitoring, or guidance </w:t>
+      </w:r>
+      <w:proofErr w:type="gramStart"/>
+      <w:r>
+        <w:t>in order to</w:t>
+      </w:r>
+      <w:proofErr w:type="gramEnd"/>
+      <w:r>
+        <w:t xml:space="preserve"> help the individual sustain new practices. Self-change refers to situations in which an individual in a harmful state decides, with or without external assistance, to relinquish destructive behavior and adopt more adaptive alternatives.</w:t>
       </w:r>
     </w:p>
     <w:p>
@@ -1255,7 +1295,15 @@
         <w:jc w:val="both"/>
       </w:pPr>
       <w:r>
-        <w:t>Automated encouragement refers to pre-scripted, fixed prompts or messages that are generated by the program itself in order to encourage continued engagement. These prompts must not include guidance on therapeutic content.</w:t>
+        <w:t xml:space="preserve">Automated encouragement refers to pre-scripted, fixed prompts or messages that are generated by the program itself </w:t>
+      </w:r>
+      <w:proofErr w:type="gramStart"/>
+      <w:r>
+        <w:t>in order to</w:t>
+      </w:r>
+      <w:proofErr w:type="gramEnd"/>
+      <w:r>
+        <w:t xml:space="preserve"> encourage continued engagement. These prompts must not include guidance on therapeutic content.</w:t>
       </w:r>
     </w:p>
     <w:p>
@@ -1265,7 +1313,15 @@
         <w:jc w:val="both"/>
       </w:pPr>
       <w:r>
-        <w:t>Human encouragement refers to prompts or messages that are prepared and delivered by a person, for example through email, SMS, or telephone, in order to encourage engagement. Like automated encouragement, these prompts must not include guidance on therapeutic content. Peer support delivered through moderated discussion groups is also classified as human encouragement.</w:t>
+        <w:t xml:space="preserve">Human encouragement refers to prompts or messages that are prepared and delivered by a person, for example through email, SMS, or telephone, </w:t>
+      </w:r>
+      <w:proofErr w:type="gramStart"/>
+      <w:r>
+        <w:t>in order to</w:t>
+      </w:r>
+      <w:proofErr w:type="gramEnd"/>
+      <w:r>
+        <w:t xml:space="preserve"> encourage engagement. Like automated encouragement, these prompts must not include guidance on therapeutic content. Peer support delivered through moderated discussion groups is also classified as human encouragement.</w:t>
       </w:r>
     </w:p>
     <w:p>
@@ -1361,7 +1417,15 @@
         <w:jc w:val="both"/>
       </w:pPr>
       <w:r>
-        <w:t>The three reviews together point to several remaining gaps that the present meta-analysis aims to address. First, adolescent-specific evidence on unguided self-help CBT has not been comprehensively synthesized using a support-level framework that is independent from the guided/unguided distinction. Second, existing syntheses have generally not examined whether effect sizes differ systematically by control type, specifically between passive controls (waitlist, TAU, no treatment) and minimally active controls (attention or information-only), even though the choice of comparator can substantially shape apparent effect sizes. Third, depression in adolescence often overlaps with adjacent presentations such as suicidality, self-harm, and bereavement-related emotional difficulties (Herrman et al., 2022). Suicidal ideation is a recognized component of depressive symptomatology, self-harm frequently co-occurs with depressive disorders, and bereavement-related presentations may overlap with or precipitate depressive episodes. By including trials in which depression was assessed as a central outcome alongside these presentations, the present study aims to characterize the reach of unguided self-help CBT across the clinically proximal range in which it is actually deployed.</w:t>
+        <w:t xml:space="preserve">The three reviews together point to several remaining gaps that the present meta-analysis aims to address. First, adolescent-specific evidence on unguided self-help CBT has not been comprehensively synthesized using a support-level framework that is independent from the guided/unguided distinction. Second, existing syntheses have generally not examined whether effect sizes differ systematically by control type, specifically between passive controls (waitlist, TAU, no treatment) and minimally active controls (attention or information-only), even though the choice of comparator can substantially shape apparent effect sizes. Third, depression in adolescence often overlaps with adjacent presentations such as suicidality, self-harm, and bereavement-related emotional difficulties (Herrman et al., 2022). Suicidal ideation is a recognized component of depressive symptomatology, self-harm frequently co-occurs with depressive disorders, and bereavement-related presentations may overlap with or precipitate depressive episodes. By including trials in which depression was assessed as a central outcome alongside these presentations, the present study aims to characterize the reach of unguided self-help CBT across the clinically proximal range in which it is </w:t>
+      </w:r>
+      <w:proofErr w:type="gramStart"/>
+      <w:r>
+        <w:t>actually deployed</w:t>
+      </w:r>
+      <w:proofErr w:type="gramEnd"/>
+      <w:r>
+        <w:t>.</w:t>
       </w:r>
     </w:p>
     <w:bookmarkEnd w:id="2"/>
@@ -1447,6 +1511,7 @@
         <w:t xml:space="preserve">The search strategy was constructed from four concept blocks combined with the Boolean AND operator: (1) adolescent population, (2) depression, (3) cognitive behavioral therapy, and (4) unguided self-help and digital delivery modalities. Within each block, </w:t>
       </w:r>
       <w:proofErr w:type="spellStart"/>
+      <w:proofErr w:type="gramStart"/>
       <w:r>
         <w:rPr>
           <w:rFonts w:eastAsia="Times New Roman"/>
@@ -1454,6 +1519,7 @@
         <w:t>MeSH</w:t>
       </w:r>
       <w:proofErr w:type="spellEnd"/>
+      <w:proofErr w:type="gramEnd"/>
       <w:r>
         <w:rPr>
           <w:rFonts w:eastAsia="Times New Roman"/>
@@ -1471,7 +1537,21 @@
         <w:rPr>
           <w:rFonts w:eastAsia="Times New Roman"/>
         </w:rPr>
-        <w:t>No restrictions were placed on language at the search stage, and non-English records were screened with translation support where feasible. No restrictions were placed on publication status. Grey literature, including doctoral dissertations and preprints, was retained at the search stage in order to enhance the comprehensiveness of the review and to reduce the risk of publication bias (</w:t>
+        <w:t xml:space="preserve">No restrictions were placed on language at the search stage, and non-English records were screened with translation support where feasible. No restrictions were placed on publication status. Grey literature, including doctoral dissertations and preprints, was retained at the search stage </w:t>
+      </w:r>
+      <w:proofErr w:type="gramStart"/>
+      <w:r>
+        <w:rPr>
+          <w:rFonts w:eastAsia="Times New Roman"/>
+        </w:rPr>
+        <w:t>in order to</w:t>
+      </w:r>
+      <w:proofErr w:type="gramEnd"/>
+      <w:r>
+        <w:rPr>
+          <w:rFonts w:eastAsia="Times New Roman"/>
+        </w:rPr>
+        <w:t xml:space="preserve"> enhance the comprehensiveness of the review and to reduce the risk of publication bias (</w:t>
       </w:r>
       <w:proofErr w:type="spellStart"/>
       <w:r>
@@ -1576,7 +1656,21 @@
         <w:rPr>
           <w:rFonts w:eastAsia="Times New Roman"/>
         </w:rPr>
-        <w:t>Studies were eligible for inclusion when they satisfied all of the following criteria.</w:t>
+        <w:t xml:space="preserve">Studies were eligible for inclusion when they satisfied </w:t>
+      </w:r>
+      <w:proofErr w:type="gramStart"/>
+      <w:r>
+        <w:rPr>
+          <w:rFonts w:eastAsia="Times New Roman"/>
+        </w:rPr>
+        <w:t>all of</w:t>
+      </w:r>
+      <w:proofErr w:type="gramEnd"/>
+      <w:r>
+        <w:rPr>
+          <w:rFonts w:eastAsia="Times New Roman"/>
+        </w:rPr>
+        <w:t xml:space="preserve"> the following criteria.</w:t>
       </w:r>
     </w:p>
     <w:p>
@@ -1683,7 +1777,15 @@
       </w:r>
       <w:r>
         <w:lastRenderedPageBreak/>
-        <w:t>component (behavioral activation, problem-solving). Component definitions followed the framework summarized in Section 2.4 and Appendix B. Interventions delivered through artificial-intelligence chatbots that autonomously deliver CBT content without human therapist involvement were eligible as a form of unguided self-help.</w:t>
+        <w:t xml:space="preserve">component (behavioral activation, problem-solving). Component definitions followed the framework summarized in Section 2.4 and Appendix B. Interventions delivered through </w:t>
+      </w:r>
+      <w:proofErr w:type="gramStart"/>
+      <w:r>
+        <w:t>artificial-intelligence</w:t>
+      </w:r>
+      <w:proofErr w:type="gramEnd"/>
+      <w:r>
+        <w:t xml:space="preserve"> chatbots that autonomously deliver CBT content without human therapist involvement were eligible as a form of unguided self-help.</w:t>
       </w:r>
     </w:p>
     <w:p>
@@ -1707,7 +1809,21 @@
         <w:rPr>
           <w:rFonts w:eastAsia="Times New Roman"/>
         </w:rPr>
-        <w:t xml:space="preserve"> The comparator arm was required to be a non-active control condition. Non-active controls included waitlist, treatment-as-usual (TAU), no treatment, attention control, and information-only control. TAU was interpreted as the standard care that a participant would have received regardless of trial participation, and was therefore treated as non-active. For subgroup analysis, the comparator was further classified as passive (waitlist, TAU, no treatment) or minimally active (attention control, information-only control), reflecting evidence that the choice of comparator can substantially shape apparent effect sizes.</w:t>
+        <w:t xml:space="preserve"> The comparator arm was required to be a non-active control condition. Non-active controls included waitlist, treatment-as-usual (TAU), no treatment, attention control, and information-only control. TAU was interpreted as the standard care that a participant would have received regardless of trial </w:t>
+      </w:r>
+      <w:proofErr w:type="gramStart"/>
+      <w:r>
+        <w:rPr>
+          <w:rFonts w:eastAsia="Times New Roman"/>
+        </w:rPr>
+        <w:t>participation, and</w:t>
+      </w:r>
+      <w:proofErr w:type="gramEnd"/>
+      <w:r>
+        <w:rPr>
+          <w:rFonts w:eastAsia="Times New Roman"/>
+        </w:rPr>
+        <w:t xml:space="preserve"> was therefore treated as non-active. For subgroup analysis, the comparator was further classified as passive (waitlist, TAU, no treatment) or minimally active (attention control, information-only control), reflecting evidence that the choice of comparator can substantially shape apparent effect sizes.</w:t>
       </w:r>
     </w:p>
     <w:p>
@@ -5973,7 +6089,25 @@
           <w:sz w:val="20"/>
           <w:szCs w:val="20"/>
         </w:rPr>
-        <w:t>-dash (—) indicates that the measure is typically used with a single validated cutoff rather than with graduated severity bands. Where multiple cutoffs are in use, the most commonly cited is listed first, with alternatives in parentheses. The Clinical Cutoff column reflects the threshold used for establishing baseline eligibility; baseline severity for subgroup analysis (Subclinical, Mild-to-Moderate, Moderate, Severe) is classified using these cutoffs together with the reported baseline mean and standard deviation.</w:t>
+        <w:t xml:space="preserve">-dash (—) indicates that the measure is typically used with a single validated cutoff rather than with graduated severity bands. Where multiple cutoffs are in use, the </w:t>
+      </w:r>
+      <w:proofErr w:type="gramStart"/>
+      <w:r>
+        <w:rPr>
+          <w:rFonts w:eastAsia="Times New Roman"/>
+          <w:sz w:val="20"/>
+          <w:szCs w:val="20"/>
+        </w:rPr>
+        <w:t>most commonly cited</w:t>
+      </w:r>
+      <w:proofErr w:type="gramEnd"/>
+      <w:r>
+        <w:rPr>
+          <w:rFonts w:eastAsia="Times New Roman"/>
+          <w:sz w:val="20"/>
+          <w:szCs w:val="20"/>
+        </w:rPr>
+        <w:t xml:space="preserve"> is listed first, with alternatives in parentheses. The Clinical Cutoff column reflects the threshold used for establishing baseline eligibility; baseline severity for subgroup analysis (Subclinical, Mild-to-Moderate, Moderate, Severe) is classified using these cutoffs together with the reported baseline mean and standard deviation.</w:t>
       </w:r>
     </w:p>
     <w:p>
@@ -6471,7 +6605,15 @@
         <w:jc w:val="both"/>
       </w:pPr>
       <w:r>
-        <w:t>When a single trial reported multiple follow-up assessments within the same window, one assessment was selected for each window according to the following rules. For the short- and medium-term windows, the assessment closest to the midpoint of the window was retained. For the long-term window, the 12-month assessment was prioritized; when 12-month data were not available, the available long-term assessment closest to 12 months was used. The remaining assessments were retained in the database for descriptive reporting but were not entered into the corresponding pooled analysis, in order to avoid unit-of-analysis errors arising from the inclusion of multiple non-independent estimates from a single trial.</w:t>
+        <w:t xml:space="preserve">When a single trial reported multiple follow-up assessments within the same window, one assessment was selected for each window according to the following rules. For the short- and medium-term windows, the assessment closest to the midpoint of the window was retained. For the long-term window, the 12-month assessment was prioritized; when 12-month data were not available, the available long-term assessment closest to 12 months was used. The remaining assessments were retained in the database for descriptive reporting but were not entered into the corresponding pooled analysis, </w:t>
+      </w:r>
+      <w:proofErr w:type="gramStart"/>
+      <w:r>
+        <w:t>in order to</w:t>
+      </w:r>
+      <w:proofErr w:type="gramEnd"/>
+      <w:r>
+        <w:t xml:space="preserve"> avoid unit-of-analysis errors arising from the inclusion of multiple non-independent estimates from a single trial.</w:t>
       </w:r>
     </w:p>
     <w:bookmarkEnd w:id="3"/>
@@ -6674,7 +6816,15 @@
       </w:r>
       <w:proofErr w:type="spellEnd"/>
       <w:r>
-        <w:t xml:space="preserve"> activation was not examined as a single-component contrast because it was present in the substantial majority of included programs, leaving the absent subgroup with </w:t>
+        <w:t xml:space="preserve"> activation was not examined as a single-component contrast because it was present in </w:t>
+      </w:r>
+      <w:proofErr w:type="gramStart"/>
+      <w:r>
+        <w:t>the substantial majority of</w:t>
+      </w:r>
+      <w:proofErr w:type="gramEnd"/>
+      <w:r>
+        <w:t xml:space="preserve"> included programs, leaving the absent subgroup with </w:t>
       </w:r>
       <w:r>
         <w:lastRenderedPageBreak/>
@@ -6707,7 +6857,23 @@
         <w:jc w:val="both"/>
       </w:pPr>
       <w:r>
-        <w:t>Five sensitivity analyses were pre-specified to examine the robustness of the main findings. First, the pooled estimate was recomputed restricting to peer-reviewed journal articles, in order to examine the influence of including dissertations and preprints. Second, the pooled estimate was recomputed under a clinically restricted subset, defined as the subset of trials with baseline severity meeting an established clinical cutoff and with a treatment-focused rather than indicated-prevention intent; trials failing either condition were excluded. Third, the pooled estimate was recomputed restricting to trials in which depressive symptoms were the primary treatment target, with trials in which depression was assessed alongside another primary target (such as self-harm, suicidal ideation, peer violence, or insomnia) excluded. Fourth, the pooled estimate was recomputed excluding minimal-intensity programs, defined as those with an estimated intended weekly dose of 15 minutes per week or less. Self-paced or on-demand interventions without a fixed intended weekly dose were retained in this analysis rather than excluded, on the basis that not estimable does not equate to low dose. Fifth, a leave-one-out sensitivity analysis was conducted to identify any single study disproportionately influencing the pooled effect.</w:t>
+        <w:t xml:space="preserve">Five sensitivity analyses were pre-specified to examine the robustness of the main findings. First, the pooled estimate was recomputed restricting to peer-reviewed journal articles, </w:t>
+      </w:r>
+      <w:proofErr w:type="gramStart"/>
+      <w:r>
+        <w:t>in order to</w:t>
+      </w:r>
+      <w:proofErr w:type="gramEnd"/>
+      <w:r>
+        <w:t xml:space="preserve"> examine the influence of including dissertations and preprints. Second, the pooled estimate was recomputed under a clinically restricted subset, defined as the subset of trials with baseline severity meeting an established clinical cutoff and with a treatment-focused rather than indicated-prevention intent; trials failing either condition </w:t>
+      </w:r>
+      <w:proofErr w:type="gramStart"/>
+      <w:r>
+        <w:t>were</w:t>
+      </w:r>
+      <w:proofErr w:type="gramEnd"/>
+      <w:r>
+        <w:t xml:space="preserve"> excluded. Third, the pooled estimate was recomputed restricting to trials in which depressive symptoms were the primary treatment target, with trials in which depression was assessed alongside another primary target (such as self-harm, suicidal ideation, peer violence, or insomnia) excluded. Fourth, the pooled estimate was recomputed excluding minimal-intensity programs, defined as those with an estimated intended weekly dose of 15 minutes per week or less. Self-paced or on-demand interventions without a fixed intended weekly dose were retained in this analysis rather than excluded, on the basis that not estimable does not equate to low dose. Fifth, a leave-one-out sensitivity analysis was conducted to identify any single study disproportionately influencing the pooled effect.</w:t>
       </w:r>
     </w:p>
     <w:p>
@@ -7163,7 +7329,15 @@
       </w:r>
       <w:proofErr w:type="spellEnd"/>
       <w:r>
-        <w:t xml:space="preserve"> recruited on the basis of general adolescent mental health concerns without a depression severity threshold (O'Dea et al., 2020). Most other trials neither targeted nor systematically excluded comorbidity, recruiting on the basis of elevated depressive symptoms regardless of co-occurring anxiety or other internalizing symptoms. Active psychosis, bipolar disorder, current acute suicidality, and ongoing concurrent psychotherapy were the most consistently applied exclusion criteria.</w:t>
+        <w:t xml:space="preserve"> recruited on the basis of general adolescent mental health concerns without a depression severity threshold (O'Dea et al., 2020). Most other trials neither targeted nor systematically excluded comorbidity, recruiting </w:t>
+      </w:r>
+      <w:proofErr w:type="gramStart"/>
+      <w:r>
+        <w:t>on the basis of</w:t>
+      </w:r>
+      <w:proofErr w:type="gramEnd"/>
+      <w:r>
+        <w:t xml:space="preserve"> elevated depressive symptoms regardless of co-occurring anxiety or other internalizing symptoms. Active psychosis, bipolar disorder, current acute suicidality, and ongoing concurrent psychotherapy were the most consistently applied exclusion criteria.</w:t>
       </w:r>
     </w:p>
     <w:p>
@@ -7260,7 +7434,15 @@
       </w:r>
       <w:proofErr w:type="spellEnd"/>
       <w:r>
-        <w:t>) to 8 months of web-based modules (Grasp the Opportunity). Most programs were designed to be completed within a 4–8 week window, although several mobile-app interventions (</w:t>
+        <w:t>) to 8 months of web-based modules (Grasp the Opportunity). Most programs were designed to be completed within a 4–</w:t>
+      </w:r>
+      <w:proofErr w:type="gramStart"/>
+      <w:r>
+        <w:t>8 week</w:t>
+      </w:r>
+      <w:proofErr w:type="gramEnd"/>
+      <w:r>
+        <w:t xml:space="preserve"> window, although several mobile-app interventions (</w:t>
       </w:r>
       <w:proofErr w:type="spellStart"/>
       <w:r>
@@ -7709,7 +7891,15 @@
         <w:t>69</w:t>
       </w:r>
       <w:r>
-        <w:t xml:space="preserve"> in the control conditions. Under a random-effects model using the REML estimator and Hartung-Knapp adjustment, the pooled Hedges’ g was 0.27, 95% CI [0.06, 0.47], t(13) = 2.8</w:t>
+        <w:t xml:space="preserve"> in the control conditions. Under a random-effects model using the REML estimator and Hartung-Knapp adjustment, the pooled Hedges’ g was 0.27, 95% CI [0.06, 0.47], </w:t>
+      </w:r>
+      <w:proofErr w:type="gramStart"/>
+      <w:r>
+        <w:t>t(</w:t>
+      </w:r>
+      <w:proofErr w:type="gramEnd"/>
+      <w:r>
+        <w:t>13) = 2.8</w:t>
       </w:r>
       <w:r>
         <w:rPr>
@@ -8115,7 +8305,15 @@
       </w:pPr>
       <w:bookmarkStart w:id="13" w:name="OLE_LINK13"/>
       <w:r>
-        <w:t>Between-study heterogeneity was moderate to high, Q(13) = 35.</w:t>
+        <w:t xml:space="preserve">Between-study heterogeneity was moderate to high, </w:t>
+      </w:r>
+      <w:proofErr w:type="gramStart"/>
+      <w:r>
+        <w:t>Q(</w:t>
+      </w:r>
+      <w:proofErr w:type="gramEnd"/>
+      <w:r>
+        <w:t>13) = 35.</w:t>
       </w:r>
       <w:r>
         <w:rPr>
@@ -8937,7 +9135,29 @@
           <w:sz w:val="24"/>
           <w:szCs w:val="24"/>
         </w:rPr>
-        <w:t>4.4.2 Overall Effects for different Lengths of  follow-up</w:t>
+        <w:t xml:space="preserve">4.4.2 Overall Effects for different Lengths </w:t>
+      </w:r>
+      <w:proofErr w:type="gramStart"/>
+      <w:r>
+        <w:rPr>
+          <w:rFonts w:hint="eastAsia"/>
+          <w:b/>
+          <w:bCs/>
+          <w:sz w:val="24"/>
+          <w:szCs w:val="24"/>
+        </w:rPr>
+        <w:t>of  follow</w:t>
+      </w:r>
+      <w:proofErr w:type="gramEnd"/>
+      <w:r>
+        <w:rPr>
+          <w:rFonts w:hint="eastAsia"/>
+          <w:b/>
+          <w:bCs/>
+          <w:sz w:val="24"/>
+          <w:szCs w:val="24"/>
+        </w:rPr>
+        <w:t>-up</w:t>
       </w:r>
     </w:p>
     <w:p>
@@ -9025,7 +9245,15 @@
         <w:t>8</w:t>
       </w:r>
       <w:r>
-        <w:t>], t(2) = 0.</w:t>
+        <w:t xml:space="preserve">], </w:t>
+      </w:r>
+      <w:proofErr w:type="gramStart"/>
+      <w:r>
+        <w:t>t(</w:t>
+      </w:r>
+      <w:proofErr w:type="gramEnd"/>
+      <w:r>
+        <w:t>2) = 0.</w:t>
       </w:r>
       <w:r>
         <w:rPr>
@@ -9059,7 +9287,15 @@
         <w:jc w:val="both"/>
       </w:pPr>
       <w:r>
-        <w:t>Between-study heterogeneity was negligible (Q(2) = 0.8</w:t>
+        <w:t>Between-study heterogeneity was negligible (</w:t>
+      </w:r>
+      <w:proofErr w:type="gramStart"/>
+      <w:r>
+        <w:t>Q(</w:t>
+      </w:r>
+      <w:proofErr w:type="gramEnd"/>
+      <w:r>
+        <w:t>2) = 0.8</w:t>
       </w:r>
       <w:r>
         <w:rPr>
@@ -9151,7 +9387,16 @@
           <w:bCs/>
           <w:noProof/>
         </w:rPr>
-        <w:t xml:space="preserve">Forest Plot of Studies at </w:t>
+        <w:t xml:space="preserve">Forest Plot of Studies </w:t>
+      </w:r>
+      <w:proofErr w:type="gramStart"/>
+      <w:r>
+        <w:rPr>
+          <w:b/>
+          <w:bCs/>
+          <w:noProof/>
+        </w:rPr>
+        <w:t xml:space="preserve">at </w:t>
       </w:r>
       <w:r>
         <w:rPr>
@@ -9166,7 +9411,15 @@
           <w:b/>
           <w:bCs/>
         </w:rPr>
-        <w:t xml:space="preserve">Short-Term </w:t>
+        <w:t>Short</w:t>
+      </w:r>
+      <w:proofErr w:type="gramEnd"/>
+      <w:r>
+        <w:rPr>
+          <w:b/>
+          <w:bCs/>
+        </w:rPr>
+        <w:t xml:space="preserve">-Term </w:t>
       </w:r>
       <w:proofErr w:type="spellStart"/>
       <w:r>
@@ -9199,10 +9452,10 @@
           <w:szCs w:val="24"/>
         </w:rPr>
         <w:drawing>
-          <wp:inline distT="0" distB="0" distL="0" distR="0" wp14:anchorId="2218540E" wp14:editId="55F21EC3">
+          <wp:inline distT="0" distB="0" distL="0" distR="0" wp14:anchorId="46CE642D" wp14:editId="054DAB1A">
             <wp:extent cx="5943600" cy="2773680"/>
             <wp:effectExtent l="0" t="0" r="0" b="7620"/>
-            <wp:docPr id="295007338" name="图片 8" descr="图表, 箱线图&#10;&#10;描述已自动生成"/>
+            <wp:docPr id="73682158" name="图片 2" descr="图表, 箱线图&#10;&#10;描述已自动生成"/>
             <wp:cNvGraphicFramePr>
               <a:graphicFrameLocks xmlns:a="http://schemas.openxmlformats.org/drawingml/2006/main" noChangeAspect="1"/>
             </wp:cNvGraphicFramePr>
@@ -9210,7 +9463,7 @@
               <a:graphicData uri="http://schemas.openxmlformats.org/drawingml/2006/picture">
                 <pic:pic xmlns:pic="http://schemas.openxmlformats.org/drawingml/2006/picture">
                   <pic:nvPicPr>
-                    <pic:cNvPr id="295007338" name="图片 8" descr="图表, 箱线图&#10;&#10;描述已自动生成"/>
+                    <pic:cNvPr id="73682158" name="图片 2" descr="图表, 箱线图&#10;&#10;描述已自动生成"/>
                     <pic:cNvPicPr/>
                   </pic:nvPicPr>
                   <pic:blipFill>
@@ -9482,11 +9735,19 @@
       <w:r>
         <w:t xml:space="preserve"> </w:t>
       </w:r>
+      <w:proofErr w:type="gramStart"/>
       <w:r>
         <w:rPr>
           <w:rFonts w:hint="eastAsia"/>
         </w:rPr>
-        <w:t xml:space="preserve">( 95% CI </w:t>
+        <w:t>( 95</w:t>
+      </w:r>
+      <w:proofErr w:type="gramEnd"/>
+      <w:r>
+        <w:rPr>
+          <w:rFonts w:hint="eastAsia"/>
+        </w:rPr>
+        <w:t xml:space="preserve">% CI </w:t>
       </w:r>
       <w:r>
         <w:t>[</w:t>
@@ -9645,7 +9906,15 @@
         <w:jc w:val="both"/>
       </w:pPr>
       <w:r>
-        <w:t>Between-study heterogeneity was low across all three indicators, Q(6) = 3.4</w:t>
+        <w:t xml:space="preserve">Between-study heterogeneity was low across all three indicators, </w:t>
+      </w:r>
+      <w:proofErr w:type="gramStart"/>
+      <w:r>
+        <w:t>Q(</w:t>
+      </w:r>
+      <w:proofErr w:type="gramEnd"/>
+      <w:r>
+        <w:t>6) = 3.4</w:t>
       </w:r>
       <w:r>
         <w:rPr>
@@ -9792,10 +10061,10 @@
           <w:szCs w:val="24"/>
         </w:rPr>
         <w:drawing>
-          <wp:inline distT="0" distB="0" distL="0" distR="0" wp14:anchorId="05E3921F" wp14:editId="75EB34C9">
+          <wp:inline distT="0" distB="0" distL="0" distR="0" wp14:anchorId="2D0C883E" wp14:editId="36355A30">
             <wp:extent cx="5943600" cy="4358640"/>
             <wp:effectExtent l="0" t="0" r="0" b="3810"/>
-            <wp:docPr id="1582559487" name="图片 9" descr="文本&#10;&#10;中度可信度描述已自动生成"/>
+            <wp:docPr id="201664340" name="图片 3" descr="文本&#10;&#10;中度可信度描述已自动生成"/>
             <wp:cNvGraphicFramePr>
               <a:graphicFrameLocks xmlns:a="http://schemas.openxmlformats.org/drawingml/2006/main" noChangeAspect="1"/>
             </wp:cNvGraphicFramePr>
@@ -9803,7 +10072,7 @@
               <a:graphicData uri="http://schemas.openxmlformats.org/drawingml/2006/picture">
                 <pic:pic xmlns:pic="http://schemas.openxmlformats.org/drawingml/2006/picture">
                   <pic:nvPicPr>
-                    <pic:cNvPr id="1582559487" name="图片 9" descr="文本&#10;&#10;中度可信度描述已自动生成"/>
+                    <pic:cNvPr id="201664340" name="图片 3" descr="文本&#10;&#10;中度可信度描述已自动生成"/>
                     <pic:cNvPicPr/>
                   </pic:nvPicPr>
                   <pic:blipFill>
@@ -9966,6 +10235,7 @@
       <w:r>
         <w:t xml:space="preserve"> </w:t>
       </w:r>
+      <w:proofErr w:type="gramStart"/>
       <w:r>
         <w:rPr>
           <w:i/>
@@ -9974,7 +10244,11 @@
         <w:t>t</w:t>
       </w:r>
       <w:r>
-        <w:t>(4) = 1.</w:t>
+        <w:t>(</w:t>
+      </w:r>
+      <w:proofErr w:type="gramEnd"/>
+      <w:r>
+        <w:t>4) = 1.</w:t>
       </w:r>
       <w:r>
         <w:rPr>
@@ -10022,7 +10296,15 @@
         <w:jc w:val="both"/>
       </w:pPr>
       <w:r>
-        <w:t xml:space="preserve">Between-study heterogeneity was low to moderate, Q(4) = </w:t>
+        <w:t xml:space="preserve">Between-study heterogeneity was low to moderate, </w:t>
+      </w:r>
+      <w:proofErr w:type="gramStart"/>
+      <w:r>
+        <w:t>Q(</w:t>
+      </w:r>
+      <w:proofErr w:type="gramEnd"/>
+      <w:r>
+        <w:t xml:space="preserve">4) = </w:t>
       </w:r>
       <w:r>
         <w:t>5.</w:t>
@@ -10133,7 +10415,16 @@
           <w:bCs/>
           <w:noProof/>
         </w:rPr>
-        <w:t xml:space="preserve">Forest Plot of Studies at </w:t>
+        <w:t xml:space="preserve">Forest Plot of Studies </w:t>
+      </w:r>
+      <w:proofErr w:type="gramStart"/>
+      <w:r>
+        <w:rPr>
+          <w:b/>
+          <w:bCs/>
+          <w:noProof/>
+        </w:rPr>
+        <w:t xml:space="preserve">at </w:t>
       </w:r>
       <w:r>
         <w:rPr>
@@ -10143,6 +10434,7 @@
         </w:rPr>
         <w:t xml:space="preserve"> Long</w:t>
       </w:r>
+      <w:proofErr w:type="gramEnd"/>
       <w:r>
         <w:rPr>
           <w:b/>
@@ -10181,10 +10473,10 @@
         </w:rPr>
         <w:lastRenderedPageBreak/>
         <w:drawing>
-          <wp:inline distT="0" distB="0" distL="0" distR="0" wp14:anchorId="1817AA2E" wp14:editId="4FB9D2D0">
+          <wp:inline distT="0" distB="0" distL="0" distR="0" wp14:anchorId="5E1FCA69" wp14:editId="778E876E">
             <wp:extent cx="5943600" cy="3566160"/>
             <wp:effectExtent l="0" t="0" r="0" b="0"/>
-            <wp:docPr id="260028480" name="图片 10" descr="图表, 箱线图&#10;&#10;描述已自动生成"/>
+            <wp:docPr id="1228157735" name="图片 4" descr="图表, 箱线图&#10;&#10;描述已自动生成"/>
             <wp:cNvGraphicFramePr>
               <a:graphicFrameLocks xmlns:a="http://schemas.openxmlformats.org/drawingml/2006/main" noChangeAspect="1"/>
             </wp:cNvGraphicFramePr>
@@ -10192,7 +10484,7 @@
               <a:graphicData uri="http://schemas.openxmlformats.org/drawingml/2006/picture">
                 <pic:pic xmlns:pic="http://schemas.openxmlformats.org/drawingml/2006/picture">
                   <pic:nvPicPr>
-                    <pic:cNvPr id="260028480" name="图片 10" descr="图表, 箱线图&#10;&#10;描述已自动生成"/>
+                    <pic:cNvPr id="1228157735" name="图片 4" descr="图表, 箱线图&#10;&#10;描述已自动生成"/>
                     <pic:cNvPicPr/>
                   </pic:nvPicPr>
                   <pic:blipFill>
@@ -11918,7 +12210,15 @@
         <w:jc w:val="both"/>
       </w:pPr>
       <w:r>
-        <w:t>A contour-enhanced funnel plot was constructed to assess potential small-study effects at post-intervention (Figure X). Visual inspection suggested some asymmetry: the more precise studies clustered around the pooled estimate, whereas the least precise trials, particularly Fleming (2012), Ackerson (1998), and Stasiak (2014), were located on the positive side of the plot, with no clearly comparable small-sample studies on the negative side. The contour shading indicated that the corresponding mirror region on the left would fall mainly within the non-significant zone (</w:t>
+        <w:t xml:space="preserve">A contour-enhanced funnel plot was constructed to assess potential small-study effects at post-intervention (Figure X). Visual inspection suggested some asymmetry: the more precise studies clustered around the pooled estimate, whereas the least precise trials, particularly Fleming (2012), Ackerson (1998), and Stasiak (2014), were located on the positive side of the plot, with </w:t>
+      </w:r>
+      <w:proofErr w:type="gramStart"/>
+      <w:r>
+        <w:t>no</w:t>
+      </w:r>
+      <w:proofErr w:type="gramEnd"/>
+      <w:r>
+        <w:t xml:space="preserve"> clearly comparable small-sample studies on the negative side. The contour shading indicated that the corresponding mirror region on the left would fall mainly within the non-significant zone (</w:t>
       </w:r>
       <w:r>
         <w:rPr>
@@ -11944,6 +12244,7 @@
       <w:r>
         <w:t xml:space="preserve">Egger’s regression test indicated a non-significant trend toward funnel plot asymmetry, </w:t>
       </w:r>
+      <w:proofErr w:type="gramStart"/>
       <w:r>
         <w:rPr>
           <w:i/>
@@ -11952,7 +12253,11 @@
         <w:t>t</w:t>
       </w:r>
       <w:r>
-        <w:t xml:space="preserve">(12) = 1.82, </w:t>
+        <w:t>(</w:t>
+      </w:r>
+      <w:proofErr w:type="gramEnd"/>
+      <w:r>
+        <w:t xml:space="preserve">12) = 1.82, </w:t>
       </w:r>
       <w:r>
         <w:rPr>
@@ -11964,6 +12269,7 @@
       <w:r>
         <w:t xml:space="preserve"> = .093. Because the pooled effect size was a standardized mean difference (SMD), a modified test proposed by Pustejovsky and Rodgers (2019), which adjusts for the artifactual dependence between SMDs and their standard errors, was also conducted. This modified test was likewise non-significant, </w:t>
       </w:r>
+      <w:proofErr w:type="gramStart"/>
       <w:r>
         <w:rPr>
           <w:i/>
@@ -11972,7 +12278,11 @@
         <w:t>t</w:t>
       </w:r>
       <w:r>
-        <w:t xml:space="preserve">(12) = 1.66, </w:t>
+        <w:t>(</w:t>
+      </w:r>
+      <w:proofErr w:type="gramEnd"/>
+      <w:r>
+        <w:t xml:space="preserve">12) = 1.66, </w:t>
       </w:r>
       <w:r>
         <w:rPr>
@@ -13053,7 +13363,21 @@
         <w:rPr>
           <w:rFonts w:eastAsia="Times New Roman"/>
         </w:rPr>
-        <w:t>[Placeholder for limitations, including: small number of trials meeting the inactive-control criterion post-2023; heterogeneity in support-level reporting; reliance on back-calculated SDs for some trials; and use of study-level subgroup analysis rather than individual participant data.]</w:t>
+        <w:t xml:space="preserve">[Placeholder for limitations, </w:t>
+      </w:r>
+      <w:proofErr w:type="gramStart"/>
+      <w:r>
+        <w:rPr>
+          <w:rFonts w:eastAsia="Times New Roman"/>
+        </w:rPr>
+        <w:t>including:</w:t>
+      </w:r>
+      <w:proofErr w:type="gramEnd"/>
+      <w:r>
+        <w:rPr>
+          <w:rFonts w:eastAsia="Times New Roman"/>
+        </w:rPr>
+        <w:t xml:space="preserve"> small number of trials meeting the inactive-control criterion post-2023; heterogeneity in support-level reporting; reliance on back-calculated SDs for some trials; and use of study-level subgroup analysis rather than individual participant data.]</w:t>
       </w:r>
     </w:p>
     <w:p>
@@ -13777,7 +14101,21 @@
         <w:rPr>
           <w:rFonts w:eastAsia="Times New Roman"/>
         </w:rPr>
-        <w:t xml:space="preserve">McFadden, L., Seidman, E., &amp; Rappaport, J. (1992). A comparison of espoused theories of self- and mutual-help: Implications for mental health professionals. </w:t>
+        <w:t xml:space="preserve">McFadden, L., Seidman, E., &amp; Rappaport, J. (1992). A comparison of espoused theories of self- and </w:t>
+      </w:r>
+      <w:proofErr w:type="gramStart"/>
+      <w:r>
+        <w:rPr>
+          <w:rFonts w:eastAsia="Times New Roman"/>
+        </w:rPr>
+        <w:t>mutual-help</w:t>
+      </w:r>
+      <w:proofErr w:type="gramEnd"/>
+      <w:r>
+        <w:rPr>
+          <w:rFonts w:eastAsia="Times New Roman"/>
+        </w:rPr>
+        <w:t xml:space="preserve">: Implications for mental health professionals. </w:t>
       </w:r>
       <w:r>
         <w:rPr>
@@ -14619,7 +14957,21 @@
         <w:rPr>
           <w:rFonts w:eastAsia="Times New Roman"/>
         </w:rPr>
-        <w:t>] OR adolescent[Title/Abstract] OR adolescents[Title/Abstract] OR adolescence[Title/Abstract] OR youth[Title/Abstract] OR youths[Title/Abstract] OR teen[Title/Abstract] OR teens[Title/Abstract] OR teenager[Title/Abstract] OR teenagers[Title/Abstract]</w:t>
+        <w:t xml:space="preserve">] OR </w:t>
+      </w:r>
+      <w:proofErr w:type="gramStart"/>
+      <w:r>
+        <w:rPr>
+          <w:rFonts w:eastAsia="Times New Roman"/>
+        </w:rPr>
+        <w:t>adolescent[</w:t>
+      </w:r>
+      <w:proofErr w:type="gramEnd"/>
+      <w:r>
+        <w:rPr>
+          <w:rFonts w:eastAsia="Times New Roman"/>
+        </w:rPr>
+        <w:t>Title/Abstract] OR adolescents[Title/Abstract] OR adolescence[Title/Abstract] OR youth[Title/Abstract] OR youths[Title/Abstract] OR teen[Title/Abstract] OR teens[Title/Abstract] OR teenager[Title/Abstract] OR teenagers[Title/Abstract]</w:t>
       </w:r>
     </w:p>
     <w:p>
@@ -14668,7 +15020,21 @@
         <w:rPr>
           <w:rFonts w:eastAsia="Times New Roman"/>
         </w:rPr>
-        <w:t>] OR depression[Title/Abstract] OR depressive[Title/Abstract] OR dysthymia[Title/Abstract] OR "mood disorder"[Title/Abstract] OR "affective disorder"[Title/Abstract]</w:t>
+        <w:t xml:space="preserve">] OR </w:t>
+      </w:r>
+      <w:proofErr w:type="gramStart"/>
+      <w:r>
+        <w:rPr>
+          <w:rFonts w:eastAsia="Times New Roman"/>
+        </w:rPr>
+        <w:t>depression[</w:t>
+      </w:r>
+      <w:proofErr w:type="gramEnd"/>
+      <w:r>
+        <w:rPr>
+          <w:rFonts w:eastAsia="Times New Roman"/>
+        </w:rPr>
+        <w:t>Title/Abstract] OR depressive[Title/Abstract] OR dysthymia[Title/Abstract] OR "mood disorder"[Title/Abstract] OR "affective disorder"[Title/Abstract]</w:t>
       </w:r>
     </w:p>
     <w:p>
@@ -15148,7 +15514,15 @@
               <w:t>T</w:t>
             </w:r>
             <w:r>
-              <w:t>he integrated process of identifying, evaluating, and modifying maladaptive thoughts. The three steps form a single skill sequence rather than separable components, and are typically taught and practiced together using techniques such as Socratic questioning, thought records, and guided imagery.</w:t>
+              <w:t xml:space="preserve">he integrated process of identifying, evaluating, and modifying maladaptive thoughts. The three steps form a single skill sequence rather than separable </w:t>
+            </w:r>
+            <w:proofErr w:type="gramStart"/>
+            <w:r>
+              <w:t>components, and</w:t>
+            </w:r>
+            <w:proofErr w:type="gramEnd"/>
+            <w:r>
+              <w:t xml:space="preserve"> are typically taught and practiced together using techniques such as Socratic questioning, thought records, and guided imagery.</w:t>
             </w:r>
           </w:p>
         </w:tc>
@@ -20634,7 +21008,25 @@
                 <w:sz w:val="20"/>
                 <w:szCs w:val="20"/>
               </w:rPr>
-              <w:t xml:space="preserve">Blueblaster is an interactive depression education program consisting of 6 modules with 5 daily mini-sessions each. </w:t>
+              <w:t xml:space="preserve">Blueblaster is an interactive depression education program consisting of 6 modules with 5 daily </w:t>
+            </w:r>
+            <w:proofErr w:type="gramStart"/>
+            <w:r>
+              <w:rPr>
+                <w:rFonts w:eastAsia="Times New Roman"/>
+                <w:sz w:val="20"/>
+                <w:szCs w:val="20"/>
+              </w:rPr>
+              <w:t>mini-sessions</w:t>
+            </w:r>
+            <w:proofErr w:type="gramEnd"/>
+            <w:r>
+              <w:rPr>
+                <w:rFonts w:eastAsia="Times New Roman"/>
+                <w:sz w:val="20"/>
+                <w:szCs w:val="20"/>
+              </w:rPr>
+              <w:t xml:space="preserve"> each. </w:t>
             </w:r>
             <w:r>
               <w:rPr>
@@ -21112,7 +21504,25 @@
                 <w:sz w:val="20"/>
                 <w:szCs w:val="20"/>
               </w:rPr>
-              <w:t>Creating Opportunities for Personal Empowerment (COPE) teaches users to reframe negative beliefs into positive ones in order to feel better and behave more healthily. The program covers: an introduction to the COPE program and the thinking-feeling-behaving triangle (ABC model) with positive self-talk; self-esteem and positive self-talk; stress and coping, including signs of anxiety and depression; problem-solving and goal-setting (a four-step process); managing emotions through positive thinking and communication, including mental imagery and guided visualization; coping with stressful situations; and a concluding integration session.</w:t>
+              <w:t xml:space="preserve">Creating Opportunities for Personal Empowerment (COPE) teaches users to reframe negative beliefs into positive ones </w:t>
+            </w:r>
+            <w:proofErr w:type="gramStart"/>
+            <w:r>
+              <w:rPr>
+                <w:rFonts w:eastAsia="Times New Roman"/>
+                <w:sz w:val="20"/>
+                <w:szCs w:val="20"/>
+              </w:rPr>
+              <w:t>in order to</w:t>
+            </w:r>
+            <w:proofErr w:type="gramEnd"/>
+            <w:r>
+              <w:rPr>
+                <w:rFonts w:eastAsia="Times New Roman"/>
+                <w:sz w:val="20"/>
+                <w:szCs w:val="20"/>
+              </w:rPr>
+              <w:t xml:space="preserve"> feel better and behave more healthily. The program covers: an introduction to the COPE program and the thinking-feeling-behaving triangle (ABC model) with positive self-talk; self-esteem and positive self-talk; stress and coping, including signs of anxiety and depression; problem-solving and goal-setting (a four-step process); managing emotions through positive thinking and communication, including mental imagery and guided visualization; coping with stressful situations; and a concluding integration session.</w:t>
             </w:r>
           </w:p>
         </w:tc>
@@ -21209,7 +21619,25 @@
                 <w:sz w:val="20"/>
                 <w:szCs w:val="20"/>
               </w:rPr>
-              <w:t>Feeling Good is a bibliotherapy intervention based on Burns' self-help book. It provides practical tools and techniques empowering readers to manage their own mental health. Through real-life stories it illustrates how distorted thinking affects emotion and how to challenge and reframe such thoughts. Key ideas include: feelings are dictated by thoughts; shifting thought patterns promotes mental clarity; recognizing cognitive distortions allows one to regain control over emotional health; the triple-column technique challenges negative thinking; and structuring daily goals rebuilds confidence and disrupts depressive cycles.</w:t>
+              <w:t xml:space="preserve">Feeling Good is a bibliotherapy intervention based on Burns' self-help book. It provides practical tools and techniques empowering readers to manage their own mental health. Through real-life stories it illustrates how distorted thinking affects emotion and how to challenge and reframe such thoughts. Key ideas </w:t>
+            </w:r>
+            <w:proofErr w:type="gramStart"/>
+            <w:r>
+              <w:rPr>
+                <w:rFonts w:eastAsia="Times New Roman"/>
+                <w:sz w:val="20"/>
+                <w:szCs w:val="20"/>
+              </w:rPr>
+              <w:t>include:</w:t>
+            </w:r>
+            <w:proofErr w:type="gramEnd"/>
+            <w:r>
+              <w:rPr>
+                <w:rFonts w:eastAsia="Times New Roman"/>
+                <w:sz w:val="20"/>
+                <w:szCs w:val="20"/>
+              </w:rPr>
+              <w:t xml:space="preserve"> feelings are dictated by thoughts; shifting thought patterns promotes mental clarity; recognizing cognitive distortions allows one to regain control over emotional health; the triple-column technique challenges negative thinking; and structuring daily goals rebuilds confidence and disrupts depressive cycles.</w:t>
             </w:r>
           </w:p>
         </w:tc>
@@ -21423,7 +21851,25 @@
                 <w:sz w:val="20"/>
                 <w:szCs w:val="20"/>
               </w:rPr>
-              <w:t xml:space="preserve"> intervention combines group education with computer-based CBT training. The group education lecture covers the relationship between cognition, mood, and behavior; introduces CBT; and presents its benefits as stress-management skills with real-life examples. Group work and discussion focus on cognitive restructuring, with participants completing column worksheets to identify their own automatic thoughts and discussing counter-evidence and adaptive thoughts. The </w:t>
+              <w:t xml:space="preserve"> intervention combines group education with computer-based CBT training. The group education lecture covers the relationship between cognition, mood, and behavior; introduces CBT; and presents its benefits as stress-management skills with real-life examples. Group work and discussion focus on cognitive restructuring, with participants completing column worksheets to identify their own automatic thoughts and discussing </w:t>
+            </w:r>
+            <w:proofErr w:type="gramStart"/>
+            <w:r>
+              <w:rPr>
+                <w:rFonts w:eastAsia="Times New Roman"/>
+                <w:sz w:val="20"/>
+                <w:szCs w:val="20"/>
+              </w:rPr>
+              <w:t>counter-evidence</w:t>
+            </w:r>
+            <w:proofErr w:type="gramEnd"/>
+            <w:r>
+              <w:rPr>
+                <w:rFonts w:eastAsia="Times New Roman"/>
+                <w:sz w:val="20"/>
+                <w:szCs w:val="20"/>
+              </w:rPr>
+              <w:t xml:space="preserve"> and adaptive thoughts. The </w:t>
             </w:r>
             <w:proofErr w:type="spellStart"/>
             <w:r>
@@ -21568,7 +22014,25 @@
                 <w:sz w:val="20"/>
                 <w:szCs w:val="20"/>
               </w:rPr>
-              <w:t xml:space="preserve"> program is a computerized intervention for adolescents recruited from a pediatric emergency department with peer violence exposure and depressive symptoms. It begins with a brief (15–20 minute) computer-guided session in the Emergency Department, followed by an 8-week automated text-message curriculum. The initial face-to-face session includes motivational interviewing and CBT-informed feedback, feedback on peer violence and depressive symptoms, encouragement of goal-setting and self-reflection, an introduction to basic CBT concepts and their relation to the participant's experience of peer violence and depression, and an overview of the text-message component. The follow-up SMS messages include daily mood check-ins, psychoeducational content, reminders, crisis support, and behavioral prompts or motivational messages.</w:t>
+              <w:t xml:space="preserve"> program is a computerized intervention for adolescents recruited from a pediatric emergency department with peer violence exposure and depressive symptoms. It begins with a brief (15–20 minute) computer-guided session in the Emergency Department, followed by an 8-week automated text-message curriculum. The initial face-to-face session includes motivational interviewing and CBT-informed feedback, feedback on peer violence and depressive symptoms, encouragement of </w:t>
+            </w:r>
+            <w:proofErr w:type="gramStart"/>
+            <w:r>
+              <w:rPr>
+                <w:rFonts w:eastAsia="Times New Roman"/>
+                <w:sz w:val="20"/>
+                <w:szCs w:val="20"/>
+              </w:rPr>
+              <w:t>goal-setting</w:t>
+            </w:r>
+            <w:proofErr w:type="gramEnd"/>
+            <w:r>
+              <w:rPr>
+                <w:rFonts w:eastAsia="Times New Roman"/>
+                <w:sz w:val="20"/>
+                <w:szCs w:val="20"/>
+              </w:rPr>
+              <w:t xml:space="preserve"> and self-reflection, an introduction to basic CBT concepts and their relation to the participant's experience of peer violence and depression, and an overview of the text-message component. The follow-up SMS messages include daily mood check-ins, psychoeducational content, reminders, crisis support, and behavioral prompts or motivational messages.</w:t>
             </w:r>
           </w:p>
         </w:tc>
@@ -21762,7 +22226,25 @@
                 <w:sz w:val="20"/>
                 <w:szCs w:val="20"/>
               </w:rPr>
-              <w:t xml:space="preserve">Mello offers real-time assessment and tailored intervention strategies to disrupt repetitive negative thinking (RNT) in young people with depression and anxiety. Key features include: randomized notifications three times daily (9am–9pm); check-ins assessing current RNT levels, mood state, ongoing activities, and location; algorithmic recommendation of appropriate CBT activities based on level of stuck thinking, current mood, context, and activity </w:t>
+              <w:t xml:space="preserve">Mello offers real-time assessment and tailored intervention strategies to disrupt repetitive negative thinking (RNT) in young people with depression and anxiety. Key features </w:t>
+            </w:r>
+            <w:proofErr w:type="gramStart"/>
+            <w:r>
+              <w:rPr>
+                <w:rFonts w:eastAsia="Times New Roman"/>
+                <w:sz w:val="20"/>
+                <w:szCs w:val="20"/>
+              </w:rPr>
+              <w:t>include:</w:t>
+            </w:r>
+            <w:proofErr w:type="gramEnd"/>
+            <w:r>
+              <w:rPr>
+                <w:rFonts w:eastAsia="Times New Roman"/>
+                <w:sz w:val="20"/>
+                <w:szCs w:val="20"/>
+              </w:rPr>
+              <w:t xml:space="preserve"> randomized notifications three times daily (9am–9pm); check-ins assessing current RNT levels, mood state, ongoing activities, and location; algorithmic recommendation of appropriate CBT activities based on level of stuck thinking, current mood, context, and activity </w:t>
             </w:r>
             <w:r>
               <w:rPr>
@@ -22005,7 +22487,25 @@
                 <w:szCs w:val="20"/>
               </w:rPr>
               <w:lastRenderedPageBreak/>
-              <w:t>Note: Reframe-IT includes therapist interaction via the message board and is therefore evaluated for eligibility on the basis of whether that interaction constitutes therapeutic guidance.</w:t>
+              <w:t xml:space="preserve">Note: Reframe-IT includes therapist interaction via the message board and is therefore evaluated for eligibility </w:t>
+            </w:r>
+            <w:proofErr w:type="gramStart"/>
+            <w:r>
+              <w:rPr>
+                <w:rFonts w:eastAsia="Times New Roman"/>
+                <w:sz w:val="20"/>
+                <w:szCs w:val="20"/>
+              </w:rPr>
+              <w:t>on the basis of</w:t>
+            </w:r>
+            <w:proofErr w:type="gramEnd"/>
+            <w:r>
+              <w:rPr>
+                <w:rFonts w:eastAsia="Times New Roman"/>
+                <w:sz w:val="20"/>
+                <w:szCs w:val="20"/>
+              </w:rPr>
+              <w:t xml:space="preserve"> whether that interaction constitutes therapeutic guidance.</w:t>
             </w:r>
           </w:p>
         </w:tc>
@@ -22519,7 +23019,25 @@
                 <w:sz w:val="20"/>
                 <w:szCs w:val="20"/>
               </w:rPr>
-              <w:t xml:space="preserve">The Journey is a fantasy game-based intervention in which players select and customize their avatars and embark on an immersive quest through enchanted lands. CBT content is systematically integrated into the game; module completion awards points and mini-games serve as post-section rewards. The program consists of seven modules of 25–30 minutes each, each focusing on a distinct CBT topic: Introduction to the CBT Model; Behavioral Activation; Problem Solving; Cognitive Restructuring I; Cognitive Restructuring II; Cognitive Restructuring III; and Summary and Relapse Prevention. Each module begins with a mood assessment, followed by a quiz on the previous module, goal-setting, and interactive elements including exercises, animations, and instructional videos; it concludes with a content summary and a challenge (homework) assignment. </w:t>
+              <w:t xml:space="preserve">The Journey is a fantasy game-based intervention in which players select and customize their avatars and embark on an immersive quest through enchanted lands. CBT content is systematically integrated into the game; module completion awards points and </w:t>
+            </w:r>
+            <w:proofErr w:type="gramStart"/>
+            <w:r>
+              <w:rPr>
+                <w:rFonts w:eastAsia="Times New Roman"/>
+                <w:sz w:val="20"/>
+                <w:szCs w:val="20"/>
+              </w:rPr>
+              <w:t>mini-games</w:t>
+            </w:r>
+            <w:proofErr w:type="gramEnd"/>
+            <w:r>
+              <w:rPr>
+                <w:rFonts w:eastAsia="Times New Roman"/>
+                <w:sz w:val="20"/>
+                <w:szCs w:val="20"/>
+              </w:rPr>
+              <w:t xml:space="preserve"> serve as post-section rewards. The program consists of seven modules of 25–30 minutes each, each focusing on a distinct CBT topic: Introduction to the CBT Model; Behavioral Activation; Problem Solving; Cognitive Restructuring I; Cognitive Restructuring II; Cognitive Restructuring III; and Summary and Relapse Prevention. Each module begins with a mood assessment, followed by a quiz on the previous module, goal-setting, and interactive elements including exercises, animations, and instructional videos; it concludes with a content summary and a challenge (homework) assignment. </w:t>
             </w:r>
             <w:r>
               <w:rPr>
@@ -22528,7 +23046,25 @@
                 <w:szCs w:val="20"/>
               </w:rPr>
               <w:lastRenderedPageBreak/>
-              <w:t>A comprehensive guidebook provides module summaries, space for goal-setting, reflection questions, and weekly journaling-based challenges.</w:t>
+              <w:t xml:space="preserve">A comprehensive guidebook provides module summaries, space for </w:t>
+            </w:r>
+            <w:proofErr w:type="gramStart"/>
+            <w:r>
+              <w:rPr>
+                <w:rFonts w:eastAsia="Times New Roman"/>
+                <w:sz w:val="20"/>
+                <w:szCs w:val="20"/>
+              </w:rPr>
+              <w:t>goal-setting</w:t>
+            </w:r>
+            <w:proofErr w:type="gramEnd"/>
+            <w:r>
+              <w:rPr>
+                <w:rFonts w:eastAsia="Times New Roman"/>
+                <w:sz w:val="20"/>
+                <w:szCs w:val="20"/>
+              </w:rPr>
+              <w:t>, reflection questions, and weekly journaling-based challenges.</w:t>
             </w:r>
           </w:p>
         </w:tc>

</xml_diff>

<commit_message>
dropouts varies, considering hanlding zero cells might not enough -> clarify the heterogenity source accdording to the advice of PKU stranger, remember her name is moki
</commit_message>
<xml_diff>
--- a/thesis/Thesis_Final.docx
+++ b/thesis/Thesis_Final.docx
@@ -13224,20 +13224,72 @@
     <w:p>
       <w:pPr>
         <w:spacing w:after="120" w:line="360" w:lineRule="auto"/>
-        <w:ind w:firstLine="360"/>
-        <w:jc w:val="both"/>
-      </w:pPr>
-      <w:r>
-        <w:rPr>
-          <w:rFonts w:eastAsia="Times New Roman"/>
-        </w:rPr>
-        <w:t>[Placeholder for differential dropout analysis.]</w:t>
-      </w:r>
+      </w:pPr>
     </w:p>
     <w:p>
       <w:pPr>
         <w:spacing w:after="120" w:line="360" w:lineRule="auto"/>
       </w:pPr>
+    </w:p>
+    <w:p>
+      <w:pPr>
+        <w:spacing w:after="120" w:line="360" w:lineRule="auto"/>
+      </w:pPr>
+    </w:p>
+    <w:p>
+      <w:pPr>
+        <w:spacing w:after="120" w:line="360" w:lineRule="auto"/>
+        <w:rPr>
+          <w:rFonts w:hint="eastAsia"/>
+        </w:rPr>
+      </w:pPr>
+      <w:r>
+        <w:rPr>
+          <w:rFonts w:hint="eastAsia"/>
+          <w:noProof/>
+        </w:rPr>
+        <w:drawing>
+          <wp:inline distT="0" distB="0" distL="0" distR="0" wp14:anchorId="4036770A" wp14:editId="7876C205">
+            <wp:extent cx="5943600" cy="4754880"/>
+            <wp:effectExtent l="0" t="0" r="0" b="7620"/>
+            <wp:docPr id="1768322724" name="图片 5" descr="图示&#10;&#10;描述已自动生成"/>
+            <wp:cNvGraphicFramePr>
+              <a:graphicFrameLocks xmlns:a="http://schemas.openxmlformats.org/drawingml/2006/main" noChangeAspect="1"/>
+            </wp:cNvGraphicFramePr>
+            <a:graphic xmlns:a="http://schemas.openxmlformats.org/drawingml/2006/main">
+              <a:graphicData uri="http://schemas.openxmlformats.org/drawingml/2006/picture">
+                <pic:pic xmlns:pic="http://schemas.openxmlformats.org/drawingml/2006/picture">
+                  <pic:nvPicPr>
+                    <pic:cNvPr id="1768322724" name="图片 5" descr="图示&#10;&#10;描述已自动生成"/>
+                    <pic:cNvPicPr/>
+                  </pic:nvPicPr>
+                  <pic:blipFill>
+                    <a:blip r:embed="rId16" cstate="print">
+                      <a:extLst>
+                        <a:ext uri="{28A0092B-C50C-407E-A947-70E740481C1C}">
+                          <a14:useLocalDpi xmlns:a14="http://schemas.microsoft.com/office/drawing/2010/main" val="0"/>
+                        </a:ext>
+                      </a:extLst>
+                    </a:blip>
+                    <a:stretch>
+                      <a:fillRect/>
+                    </a:stretch>
+                  </pic:blipFill>
+                  <pic:spPr>
+                    <a:xfrm>
+                      <a:off x="0" y="0"/>
+                      <a:ext cx="5943600" cy="4754880"/>
+                    </a:xfrm>
+                    <a:prstGeom prst="rect">
+                      <a:avLst/>
+                    </a:prstGeom>
+                  </pic:spPr>
+                </pic:pic>
+              </a:graphicData>
+            </a:graphic>
+          </wp:inline>
+        </w:drawing>
+      </w:r>
     </w:p>
     <w:p>
       <w:pPr>
@@ -13869,7 +13921,7 @@
       <w:r>
         <w:t xml:space="preserve">, Article 113. </w:t>
       </w:r>
-      <w:hyperlink r:id="rId16" w:tgtFrame="_new" w:history="1">
+      <w:hyperlink r:id="rId17" w:tgtFrame="_new" w:history="1">
         <w:r>
           <w:rPr>
             <w:rStyle w:val="a5"/>
@@ -23232,8 +23284,8 @@
     </w:tbl>
     <w:p/>
     <w:sectPr>
-      <w:headerReference w:type="default" r:id="rId17"/>
-      <w:footerReference w:type="default" r:id="rId18"/>
+      <w:headerReference w:type="default" r:id="rId18"/>
+      <w:footerReference w:type="default" r:id="rId19"/>
       <w:pgSz w:w="12240" w:h="15840"/>
       <w:pgMar w:top="1440" w:right="1440" w:bottom="1440" w:left="1440" w:header="708" w:footer="708" w:gutter="0"/>
       <w:pgNumType w:start="1"/>

</xml_diff>

<commit_message>
second draft with references
</commit_message>
<xml_diff>
--- a/thesis/Thesis_Final.docx
+++ b/thesis/Thesis_Final.docx
@@ -44358,7 +44358,17 @@
       </w:r>
       <w:proofErr w:type="spellEnd"/>
       <w:r>
-        <w:t xml:space="preserve"> plot, and removing it left near-zero between-trial variance (RR = 1.18, I² = 13.6%). Reading the trials in context, the highest differential dropout occurred in the recent, large, naturalistic mobile trials, of which O'Dea et al. (2025) is the clearest example. By contrast, trials conducted in </w:t>
+        <w:t xml:space="preserve"> plot, and removing it left near-zero between-trial variance (RR = 1.18, </w:t>
+      </w:r>
+      <w:r>
+        <w:rPr>
+          <w:i/>
+          <w:iCs/>
+        </w:rPr>
+        <w:t>I</w:t>
+      </w:r>
+      <w:r>
+        <w:t xml:space="preserve">² = 13.6%). Reading the trials in context, the highest differential dropout occurred in the recent, large, naturalistic mobile trials, of which O'Dea et al. (2025) is the clearest example. By contrast, trials conducted in </w:t>
       </w:r>
       <w:proofErr w:type="gramStart"/>
       <w:r>
@@ -45246,24 +45256,66 @@
       <w:pPr>
         <w:spacing w:after="120" w:line="360" w:lineRule="auto"/>
         <w:ind w:left="720" w:hanging="720"/>
-      </w:pPr>
-      <w:r>
-        <w:t xml:space="preserve">Borenstein, M., Higgins, J. P. T., Hedges, L. V., &amp; Rothstein, H. R. (2017). </w:t>
-      </w:r>
-      <w:r>
-        <w:t xml:space="preserve">Basics of meta-analysis: I² is not an absolute measure of heterogeneity. </w:t>
+        <w:rPr>
+          <w:rFonts w:hint="eastAsia"/>
+        </w:rPr>
+      </w:pPr>
+      <w:r>
+        <w:t xml:space="preserve">Bohr, Y., Litwin, L., Hankey, J. R., McCague, H., </w:t>
+      </w:r>
+      <w:proofErr w:type="spellStart"/>
+      <w:r>
+        <w:t>Singoorie</w:t>
+      </w:r>
+      <w:proofErr w:type="spellEnd"/>
+      <w:r>
+        <w:t xml:space="preserve">, C., Lucassen, M. F. G., Shepherd, M., &amp; Barnhardt, J. (2023). Evaluating the utility of a psychoeducational serious game (SPARX) in protecting Inuit youth from depression: Pilot randomized controlled trial. </w:t>
       </w:r>
       <w:r>
         <w:rPr>
           <w:i/>
           <w:iCs/>
         </w:rPr>
+        <w:t>JMIR Serious Games, 11</w:t>
+      </w:r>
+      <w:r>
+        <w:t xml:space="preserve">, Article e38493. </w:t>
+      </w:r>
+      <w:hyperlink r:id="rId23" w:tgtFrame="_new" w:history="1">
+        <w:r>
+          <w:rPr>
+            <w:rStyle w:val="a5"/>
+          </w:rPr>
+          <w:t>https://doi.org/10.2196/38493</w:t>
+        </w:r>
+      </w:hyperlink>
+    </w:p>
+    <w:p>
+      <w:pPr>
+        <w:spacing w:after="120" w:line="360" w:lineRule="auto"/>
+        <w:ind w:left="720" w:hanging="720"/>
+      </w:pPr>
+      <w:r>
+        <w:t xml:space="preserve">Borenstein, M., Higgins, J. P. T., Hedges, L. V., &amp; Rothstein, H. R. (2017). </w:t>
+      </w:r>
+      <w:r>
+        <w:t xml:space="preserve">Basics of meta-analysis: I² is </w:t>
+      </w:r>
+      <w:r>
+        <w:lastRenderedPageBreak/>
+        <w:t xml:space="preserve">not an absolute measure of heterogeneity. </w:t>
+      </w:r>
+      <w:r>
+        <w:rPr>
+          <w:i/>
+          <w:iCs/>
+        </w:rPr>
         <w:t>Research Synthesis Methods, 8</w:t>
       </w:r>
       <w:r>
         <w:t xml:space="preserve">(1), 5–18. </w:t>
       </w:r>
-      <w:hyperlink r:id="rId23" w:history="1">
+      <w:hyperlink r:id="rId24" w:history="1">
         <w:r>
           <w:rPr>
             <w:rStyle w:val="a5"/>
@@ -45300,7 +45352,6 @@
         <w:rPr>
           <w:rFonts w:eastAsia="Times New Roman"/>
         </w:rPr>
-        <w:lastRenderedPageBreak/>
         <w:t xml:space="preserve">Cohen, J. (1988). </w:t>
       </w:r>
       <w:r>
@@ -45563,9 +45614,46 @@
         <w:ind w:left="720" w:hanging="720"/>
       </w:pPr>
       <w:r>
+        <w:t xml:space="preserve">Fleming, T., Dixon, R., Frampton, C., &amp; Merry, S. (2012). A pragmatic randomized controlled trial of computerized CBT (SPARX) for symptoms of depression among adolescents excluded from mainstream education. </w:t>
+      </w:r>
+      <w:proofErr w:type="spellStart"/>
+      <w:r>
+        <w:rPr>
+          <w:i/>
+          <w:iCs/>
+        </w:rPr>
+        <w:t>Behavioural</w:t>
+      </w:r>
+      <w:proofErr w:type="spellEnd"/>
+      <w:r>
+        <w:rPr>
+          <w:i/>
+          <w:iCs/>
+        </w:rPr>
+        <w:t xml:space="preserve"> and Cognitive Psychotherapy, 40</w:t>
+      </w:r>
+      <w:r>
+        <w:t xml:space="preserve">(5), 529–541. </w:t>
+      </w:r>
+      <w:hyperlink r:id="rId25" w:tgtFrame="_new" w:history="1">
+        <w:r>
+          <w:rPr>
+            <w:rStyle w:val="a5"/>
+          </w:rPr>
+          <w:t>https://doi.org/10.1017/S1352465811000695</w:t>
+        </w:r>
+      </w:hyperlink>
+    </w:p>
+    <w:p>
+      <w:pPr>
+        <w:spacing w:after="120" w:line="360" w:lineRule="auto"/>
+        <w:ind w:left="720" w:hanging="720"/>
+      </w:pPr>
+      <w:r>
         <w:rPr>
           <w:rFonts w:eastAsia="Times New Roman"/>
         </w:rPr>
+        <w:lastRenderedPageBreak/>
         <w:t xml:space="preserve">Furukawa, T. A., Suganuma, A., </w:t>
       </w:r>
       <w:proofErr w:type="spellStart"/>
@@ -45689,7 +45777,7 @@
       <w:r>
         <w:t xml:space="preserve">(3), 181–192. </w:t>
       </w:r>
-      <w:hyperlink r:id="rId24" w:history="1">
+      <w:hyperlink r:id="rId26" w:history="1">
         <w:r>
           <w:rPr>
             <w:rStyle w:val="a5"/>
@@ -45704,7 +45792,6 @@
         <w:ind w:left="720" w:hanging="720"/>
       </w:pPr>
       <w:r>
-        <w:lastRenderedPageBreak/>
         <w:t xml:space="preserve">Grist, R., Croker, A., Denne, M., &amp; Stallard, P. (2019). Technology delivered interventions for depression and anxiety in children and adolescents: A systematic review and meta-analysis. </w:t>
       </w:r>
       <w:r>
@@ -45717,7 +45804,7 @@
       <w:r>
         <w:t xml:space="preserve">, 147–171. </w:t>
       </w:r>
-      <w:hyperlink r:id="rId25" w:history="1">
+      <w:hyperlink r:id="rId27" w:history="1">
         <w:r>
           <w:rPr>
             <w:rStyle w:val="a5"/>
@@ -45744,7 +45831,7 @@
       <w:r>
         <w:t xml:space="preserve">, Article 113. </w:t>
       </w:r>
-      <w:hyperlink r:id="rId26" w:tgtFrame="_new" w:history="1">
+      <w:hyperlink r:id="rId28" w:tgtFrame="_new" w:history="1">
         <w:r>
           <w:rPr>
             <w:rStyle w:val="a5"/>
@@ -45838,7 +45925,7 @@
       <w:r>
         <w:t xml:space="preserve">(7), Article e0000347. </w:t>
       </w:r>
-      <w:hyperlink r:id="rId27" w:tgtFrame="_new" w:history="1">
+      <w:hyperlink r:id="rId29" w:tgtFrame="_new" w:history="1">
         <w:r>
           <w:rPr>
             <w:rStyle w:val="a5"/>
@@ -45951,6 +46038,7 @@
         <w:rPr>
           <w:rFonts w:eastAsia="Times New Roman"/>
         </w:rPr>
+        <w:lastRenderedPageBreak/>
         <w:t xml:space="preserve">Higgins, J. P. T., Thompson, S. G., Deeks, J. J., &amp; Altman, D. G. (2003). Measuring inconsistency in meta-analyses. </w:t>
       </w:r>
       <w:r>
@@ -46007,7 +46095,7 @@
       <w:r>
         <w:t xml:space="preserve">, Article 25. </w:t>
       </w:r>
-      <w:hyperlink r:id="rId28" w:tgtFrame="_new" w:history="1">
+      <w:hyperlink r:id="rId30" w:tgtFrame="_new" w:history="1">
         <w:r>
           <w:rPr>
             <w:rStyle w:val="a5"/>
@@ -46039,7 +46127,7 @@
       <w:r>
         <w:t xml:space="preserve">(7), Article e010247. </w:t>
       </w:r>
-      <w:hyperlink r:id="rId29" w:history="1">
+      <w:hyperlink r:id="rId31" w:history="1">
         <w:r>
           <w:rPr>
             <w:rStyle w:val="a5"/>
@@ -46054,6 +46142,25 @@
         <w:ind w:left="720" w:hanging="720"/>
       </w:pPr>
       <w:r>
+        <w:t xml:space="preserve">Ip, P., Chim, D., Chan, K. L., Li, T. M. H., Ho, F. K. W., Van Voorhees, B. W., Tiwari, A., Tsang, A., Chan, C. W. L., Ho, M., Tso, W., &amp; Wong, W. H. S. (2016). Effectiveness of a culturally attuned internet-based depression prevention program for Chinese adolescents: A randomized controlled trial. </w:t>
+      </w:r>
+      <w:r>
+        <w:rPr>
+          <w:i/>
+          <w:iCs/>
+        </w:rPr>
+        <w:t>Depression and Anxiety, 33</w:t>
+      </w:r>
+      <w:r>
+        <w:t>(12), 1123–1131. https://doi.org/10.1002/da.22554</w:t>
+      </w:r>
+    </w:p>
+    <w:p>
+      <w:pPr>
+        <w:spacing w:after="120" w:line="360" w:lineRule="auto"/>
+        <w:ind w:left="720" w:hanging="720"/>
+      </w:pPr>
+      <w:r>
         <w:rPr>
           <w:rFonts w:eastAsia="Times New Roman"/>
         </w:rPr>
@@ -46181,7 +46288,7 @@
       <w:r>
         <w:t xml:space="preserve">(1), 83–98. </w:t>
       </w:r>
-      <w:hyperlink r:id="rId30" w:history="1">
+      <w:hyperlink r:id="rId32" w:history="1">
         <w:r>
           <w:rPr>
             <w:rStyle w:val="a5"/>
@@ -46195,9 +46302,6 @@
       <w:pPr>
         <w:spacing w:after="120" w:line="360" w:lineRule="auto"/>
         <w:ind w:left="720" w:hanging="720"/>
-        <w:rPr>
-          <w:rFonts w:hint="eastAsia"/>
-        </w:rPr>
       </w:pPr>
       <w:r>
         <w:rPr>
@@ -46232,24 +46336,63 @@
       <w:pPr>
         <w:spacing w:after="120" w:line="360" w:lineRule="auto"/>
         <w:ind w:left="720" w:hanging="720"/>
-      </w:pPr>
-      <w:r>
-        <w:t xml:space="preserve">Ma, Q., Shi, Y., Zhao, W., Zhang, H., Tan, D., Ji, C., &amp; Liu, L. (2024). </w:t>
-      </w:r>
-      <w:r>
-        <w:t xml:space="preserve">Effectiveness of internet-based self-help interventions for depression in adolescents and young adults: A systematic review and meta-analysis. </w:t>
+        <w:rPr>
+          <w:rFonts w:hint="eastAsia"/>
+        </w:rPr>
+      </w:pPr>
+      <w:proofErr w:type="spellStart"/>
+      <w:r>
+        <w:t>Makarushka</w:t>
+      </w:r>
+      <w:proofErr w:type="spellEnd"/>
+      <w:r>
+        <w:t xml:space="preserve">, M. M. (2011). </w:t>
       </w:r>
       <w:r>
         <w:rPr>
           <w:i/>
           <w:iCs/>
         </w:rPr>
+        <w:t>Efficacy of an internet-based intervention targeted to adolescents with subthreshold depression</w:t>
+      </w:r>
+      <w:r>
+        <w:t xml:space="preserve"> [Doctoral dissertation, University of Oregon]. University of Oregon </w:t>
+      </w:r>
+      <w:r>
+        <w:lastRenderedPageBreak/>
+        <w:t xml:space="preserve">Scholars’ Bank. </w:t>
+      </w:r>
+      <w:hyperlink r:id="rId33" w:tgtFrame="_new" w:history="1">
+        <w:r>
+          <w:rPr>
+            <w:rStyle w:val="a5"/>
+          </w:rPr>
+          <w:t>https://scholarsbank.uoregon.edu/items/e471dd46-3322-4abc-91fa-b12a59a5be7b</w:t>
+        </w:r>
+      </w:hyperlink>
+    </w:p>
+    <w:p>
+      <w:pPr>
+        <w:spacing w:after="120" w:line="360" w:lineRule="auto"/>
+        <w:ind w:left="720" w:hanging="720"/>
+      </w:pPr>
+      <w:r>
+        <w:t xml:space="preserve">Ma, Q., Shi, Y., Zhao, W., Zhang, H., Tan, D., Ji, C., &amp; Liu, L. (2024). </w:t>
+      </w:r>
+      <w:r>
+        <w:t xml:space="preserve">Effectiveness of internet-based self-help interventions for depression in adolescents and young adults: A systematic review and meta-analysis. </w:t>
+      </w:r>
+      <w:r>
+        <w:rPr>
+          <w:i/>
+          <w:iCs/>
+        </w:rPr>
         <w:t>BMC Psychiatry, 24</w:t>
       </w:r>
       <w:r>
         <w:t xml:space="preserve">, Article 604. </w:t>
       </w:r>
-      <w:hyperlink r:id="rId31" w:history="1">
+      <w:hyperlink r:id="rId34" w:history="1">
         <w:r>
           <w:rPr>
             <w:rStyle w:val="a5"/>
@@ -46330,7 +46473,7 @@
       <w:r>
         <w:t xml:space="preserve">. </w:t>
       </w:r>
-      <w:hyperlink r:id="rId32" w:history="1">
+      <w:hyperlink r:id="rId35" w:history="1">
         <w:r>
           <w:rPr>
             <w:rStyle w:val="a5"/>
@@ -46407,7 +46550,6 @@
         <w:ind w:left="720" w:hanging="720"/>
       </w:pPr>
       <w:r>
-        <w:lastRenderedPageBreak/>
         <w:t xml:space="preserve">Nordahl-Hansen, A., Cogo-Moreira, H., Panjeh, S., &amp; </w:t>
       </w:r>
       <w:proofErr w:type="spellStart"/>
@@ -46416,8 +46558,193 @@
       </w:r>
       <w:proofErr w:type="spellEnd"/>
       <w:r>
-        <w:t>, D. S. (2024). Redefining effect size interpretations for psychotherapy RCTs in depression. Journal of Psychiatric Research, 169, 38–41. https://doi.org/10.1016/j.jpsychires.2023.11.009</w:t>
-      </w:r>
+        <w:t xml:space="preserve">, D. S. (2024). Redefining effect size interpretations for psychotherapy RCTs in depression. Journal of Psychiatric Research, 169, 38–41. </w:t>
+      </w:r>
+      <w:hyperlink r:id="rId36" w:history="1">
+        <w:r>
+          <w:rPr>
+            <w:rStyle w:val="a5"/>
+          </w:rPr>
+          <w:t>https://doi.org/10.1016/j.jpsychires.2023.11.009</w:t>
+        </w:r>
+      </w:hyperlink>
+    </w:p>
+    <w:p>
+      <w:pPr>
+        <w:spacing w:after="120" w:line="360" w:lineRule="auto"/>
+        <w:ind w:left="720" w:hanging="720"/>
+      </w:pPr>
+      <w:r>
+        <w:t xml:space="preserve">O’Dea, B., Han, J., </w:t>
+      </w:r>
+      <w:proofErr w:type="spellStart"/>
+      <w:r>
+        <w:t>Batterham</w:t>
+      </w:r>
+      <w:proofErr w:type="spellEnd"/>
+      <w:r>
+        <w:t xml:space="preserve">, P. J., Achilles, M. R., </w:t>
+      </w:r>
+      <w:proofErr w:type="spellStart"/>
+      <w:r>
+        <w:t>Calear</w:t>
+      </w:r>
+      <w:proofErr w:type="spellEnd"/>
+      <w:r>
+        <w:t xml:space="preserve">, A. L., Werner-Seidler, A., Parker, B., Shand, F., &amp; Christensen, H. (2020). A </w:t>
+      </w:r>
+      <w:proofErr w:type="spellStart"/>
+      <w:r>
+        <w:t>randomised</w:t>
+      </w:r>
+      <w:proofErr w:type="spellEnd"/>
+      <w:r>
+        <w:t xml:space="preserve"> controlled trial of a relationship-</w:t>
+      </w:r>
+      <w:proofErr w:type="spellStart"/>
+      <w:r>
+        <w:t>focussed</w:t>
+      </w:r>
+      <w:proofErr w:type="spellEnd"/>
+      <w:r>
+        <w:t xml:space="preserve"> mobile phone application for improving adolescents’ mental health. </w:t>
+      </w:r>
+      <w:r>
+        <w:rPr>
+          <w:i/>
+          <w:iCs/>
+        </w:rPr>
+        <w:t>Journal of Child Psychology and Psychiatry, 61</w:t>
+      </w:r>
+      <w:r>
+        <w:t xml:space="preserve">(8), 899–913. </w:t>
+      </w:r>
+      <w:hyperlink r:id="rId37" w:tgtFrame="_new" w:history="1">
+        <w:r>
+          <w:rPr>
+            <w:rStyle w:val="a5"/>
+          </w:rPr>
+          <w:t>https://doi.org/10.1111/jcpp.13294</w:t>
+        </w:r>
+      </w:hyperlink>
+    </w:p>
+    <w:p>
+      <w:pPr>
+        <w:spacing w:after="120" w:line="360" w:lineRule="auto"/>
+        <w:ind w:left="720" w:hanging="720"/>
+        <w:rPr>
+          <w:rFonts w:hint="eastAsia"/>
+        </w:rPr>
+      </w:pPr>
+      <w:r>
+        <w:t xml:space="preserve">O’Dea, B., Li, S. H., Subotic-Kerry, M., Achilles, M. R., Mackinnon, A. J., </w:t>
+      </w:r>
+      <w:proofErr w:type="spellStart"/>
+      <w:r>
+        <w:t>Batterham</w:t>
+      </w:r>
+      <w:proofErr w:type="spellEnd"/>
+      <w:r>
+        <w:t xml:space="preserve">, P. J., Christensen, H., Roberts, A., </w:t>
+      </w:r>
+      <w:proofErr w:type="spellStart"/>
+      <w:r>
+        <w:t>Nagendraprasad</w:t>
+      </w:r>
+      <w:proofErr w:type="spellEnd"/>
+      <w:r>
+        <w:t xml:space="preserve">, K., Dudley, Z., Gillham, B., &amp; Werner-Seidler, A. (2025). </w:t>
+      </w:r>
+      <w:r>
+        <w:rPr>
+          <w:i/>
+          <w:iCs/>
+        </w:rPr>
+        <w:t xml:space="preserve">The </w:t>
+      </w:r>
+      <w:proofErr w:type="spellStart"/>
+      <w:r>
+        <w:rPr>
+          <w:i/>
+          <w:iCs/>
+        </w:rPr>
+        <w:t>MobiliseMe</w:t>
+      </w:r>
+      <w:proofErr w:type="spellEnd"/>
+      <w:r>
+        <w:rPr>
+          <w:i/>
+          <w:iCs/>
+        </w:rPr>
+        <w:t xml:space="preserve"> study: A </w:t>
+      </w:r>
+      <w:proofErr w:type="spellStart"/>
+      <w:r>
+        <w:rPr>
+          <w:i/>
+          <w:iCs/>
+        </w:rPr>
+        <w:t>randomised</w:t>
+      </w:r>
+      <w:proofErr w:type="spellEnd"/>
+      <w:r>
+        <w:rPr>
+          <w:i/>
+          <w:iCs/>
+        </w:rPr>
+        <w:t xml:space="preserve"> controlled efficacy trial of a cognitive </w:t>
+      </w:r>
+      <w:proofErr w:type="spellStart"/>
+      <w:r>
+        <w:rPr>
+          <w:i/>
+          <w:iCs/>
+        </w:rPr>
+        <w:t>behavioural</w:t>
+      </w:r>
+      <w:proofErr w:type="spellEnd"/>
+      <w:r>
+        <w:rPr>
+          <w:i/>
+          <w:iCs/>
+        </w:rPr>
+        <w:t xml:space="preserve"> therapy smartphone application (</w:t>
+      </w:r>
+      <w:proofErr w:type="spellStart"/>
+      <w:r>
+        <w:rPr>
+          <w:i/>
+          <w:iCs/>
+        </w:rPr>
+        <w:t>ClearlyMe</w:t>
+      </w:r>
+      <w:proofErr w:type="spellEnd"/>
+      <w:r>
+        <w:rPr>
+          <w:i/>
+          <w:iCs/>
+        </w:rPr>
+        <w:t>®) for reducing depressive symptoms in adolescents</w:t>
+      </w:r>
+      <w:r>
+        <w:t xml:space="preserve">. </w:t>
+      </w:r>
+      <w:proofErr w:type="spellStart"/>
+      <w:r>
+        <w:t>medRxiv</w:t>
+      </w:r>
+      <w:proofErr w:type="spellEnd"/>
+      <w:r>
+        <w:t xml:space="preserve">. </w:t>
+      </w:r>
+      <w:hyperlink r:id="rId38" w:tgtFrame="_new" w:history="1">
+        <w:r>
+          <w:rPr>
+            <w:rStyle w:val="a5"/>
+          </w:rPr>
+          <w:t>https://doi.org/10.1101/2024.11.17.24317363</w:t>
+        </w:r>
+      </w:hyperlink>
     </w:p>
     <w:p>
       <w:pPr>
@@ -46476,7 +46803,14 @@
         <w:rPr>
           <w:rFonts w:eastAsia="Times New Roman"/>
         </w:rPr>
-        <w:t xml:space="preserve">, I., Hoffmann, T. C., Mulrow, C. D., … Moher, D. (2021). The PRISMA 2020 statement: An updated guideline for reporting systematic reviews. </w:t>
+        <w:t xml:space="preserve">, I., Hoffmann, T. C., Mulrow, C. D., … Moher, D. </w:t>
+      </w:r>
+      <w:r>
+        <w:rPr>
+          <w:rFonts w:eastAsia="Times New Roman"/>
+        </w:rPr>
+        <w:lastRenderedPageBreak/>
+        <w:t xml:space="preserve">(2021). The PRISMA 2020 statement: An updated guideline for reporting systematic reviews. </w:t>
       </w:r>
       <w:r>
         <w:rPr>
@@ -46536,7 +46870,7 @@
       <w:r>
         <w:t xml:space="preserve">, 1–18. </w:t>
       </w:r>
-      <w:hyperlink r:id="rId33" w:history="1">
+      <w:hyperlink r:id="rId39" w:history="1">
         <w:r>
           <w:rPr>
             <w:rStyle w:val="a5"/>
@@ -46563,7 +46897,7 @@
       <w:r>
         <w:t xml:space="preserve">(10), 991–996. </w:t>
       </w:r>
-      <w:hyperlink r:id="rId34" w:history="1">
+      <w:hyperlink r:id="rId40" w:history="1">
         <w:r>
           <w:rPr>
             <w:rStyle w:val="a5"/>
@@ -46647,19 +46981,57 @@
         <w:spacing w:after="120" w:line="360" w:lineRule="auto"/>
         <w:ind w:left="720" w:hanging="720"/>
       </w:pPr>
-      <w:r>
-        <w:t xml:space="preserve">Poznanski, E. Q., &amp; Mokros, H. B. (1996). </w:t>
-      </w:r>
+      <w:proofErr w:type="spellStart"/>
+      <w:r>
+        <w:t>Poppelaars</w:t>
+      </w:r>
+      <w:proofErr w:type="spellEnd"/>
+      <w:r>
+        <w:t xml:space="preserve">, M., Tak, Y. R., </w:t>
+      </w:r>
+      <w:proofErr w:type="spellStart"/>
+      <w:r>
+        <w:t>Lichtwarck</w:t>
+      </w:r>
+      <w:proofErr w:type="spellEnd"/>
+      <w:r>
+        <w:t xml:space="preserve">-Aschoff, A., Engels, R. C. M. E., Lobel, A., Merry, S. N., Lucassen, M. F. G., &amp; </w:t>
+      </w:r>
+      <w:proofErr w:type="spellStart"/>
+      <w:r>
+        <w:t>Granic</w:t>
+      </w:r>
+      <w:proofErr w:type="spellEnd"/>
+      <w:r>
+        <w:t xml:space="preserve">, I. (2016). A randomized controlled trial comparing two cognitive-behavioral programs for adolescent girls with subclinical depression: A school-based program (Op Volle Kracht) and a computerized program (SPARX). </w:t>
+      </w:r>
+      <w:proofErr w:type="spellStart"/>
       <w:r>
         <w:rPr>
           <w:i/>
           <w:iCs/>
         </w:rPr>
-        <w:t>Children's Depression Rating Scale, Revised (CDRS-R): Manual</w:t>
-      </w:r>
-      <w:r>
-        <w:t>. Los Angeles, CA: Western Psychological Services.</w:t>
-      </w:r>
+        <w:t>Behaviour</w:t>
+      </w:r>
+      <w:proofErr w:type="spellEnd"/>
+      <w:r>
+        <w:rPr>
+          <w:i/>
+          <w:iCs/>
+        </w:rPr>
+        <w:t xml:space="preserve"> Research and Therapy, 80</w:t>
+      </w:r>
+      <w:r>
+        <w:t xml:space="preserve">, 33–42. </w:t>
+      </w:r>
+      <w:hyperlink r:id="rId41" w:tgtFrame="_new" w:history="1">
+        <w:r>
+          <w:rPr>
+            <w:rStyle w:val="a5"/>
+          </w:rPr>
+          <w:t>https://doi.org/10.1016/j.brat.2016.03.005</w:t>
+        </w:r>
+      </w:hyperlink>
     </w:p>
     <w:p>
       <w:pPr>
@@ -46667,7 +47039,17 @@
         <w:ind w:left="720" w:hanging="720"/>
       </w:pPr>
       <w:r>
-        <w:t>Pustejovsky, J. E., &amp; Rodgers, M. A. (2019). Testing for funnel plot asymmetry of standardized mean differences. Research Synthesis Methods, 10(1), 57–71. https://doi.org/10.1002/jrsm.1332</w:t>
+        <w:t xml:space="preserve">Poznanski, E. Q., &amp; Mokros, H. B. (1996). </w:t>
+      </w:r>
+      <w:r>
+        <w:rPr>
+          <w:i/>
+          <w:iCs/>
+        </w:rPr>
+        <w:t>Children's Depression Rating Scale, Revised (CDRS-R): Manual</w:t>
+      </w:r>
+      <w:r>
+        <w:t>. Los Angeles, CA: Western Psychological Services.</w:t>
       </w:r>
     </w:p>
     <w:p>
@@ -46675,6 +47057,15 @@
         <w:spacing w:after="120" w:line="360" w:lineRule="auto"/>
         <w:ind w:left="720" w:hanging="720"/>
       </w:pPr>
+      <w:r>
+        <w:t>Pustejovsky, J. E., &amp; Rodgers, M. A. (2019). Testing for funnel plot asymmetry of standardized mean differences. Research Synthesis Methods, 10(1), 57–71. https://doi.org/10.1002/jrsm.1332</w:t>
+      </w:r>
+    </w:p>
+    <w:p>
+      <w:pPr>
+        <w:spacing w:after="120" w:line="360" w:lineRule="auto"/>
+        <w:ind w:left="720" w:hanging="720"/>
+      </w:pPr>
       <w:proofErr w:type="spellStart"/>
       <w:r>
         <w:t>Radez</w:t>
@@ -46707,59 +47098,95 @@
         <w:spacing w:after="120" w:line="360" w:lineRule="auto"/>
         <w:ind w:left="720" w:hanging="720"/>
       </w:pPr>
+      <w:r>
+        <w:t xml:space="preserve">Ranney, M. L., Pittman, S. K., </w:t>
+      </w:r>
       <w:proofErr w:type="spellStart"/>
       <w:r>
-        <w:t>Raksilp</w:t>
+        <w:t>Dunsiger</w:t>
       </w:r>
       <w:proofErr w:type="spellEnd"/>
       <w:r>
-        <w:t xml:space="preserve">, M., </w:t>
-      </w:r>
-      <w:proofErr w:type="spellStart"/>
-      <w:r>
-        <w:t>Krongyudh</w:t>
-      </w:r>
-      <w:proofErr w:type="spellEnd"/>
-      <w:r>
-        <w:t xml:space="preserve">, S., </w:t>
-      </w:r>
-      <w:proofErr w:type="spellStart"/>
-      <w:r>
-        <w:t>Songserm</w:t>
-      </w:r>
-      <w:proofErr w:type="spellEnd"/>
-      <w:r>
-        <w:t xml:space="preserve">, N., &amp; </w:t>
-      </w:r>
-      <w:proofErr w:type="spellStart"/>
-      <w:r>
-        <w:t>Bussahong</w:t>
-      </w:r>
-      <w:proofErr w:type="spellEnd"/>
-      <w:r>
-        <w:t xml:space="preserve">, S. (2025). Effectiveness of depression prevention programs in adolescents: A systematic review and meta-analysis. </w:t>
+        <w:t xml:space="preserve">, S., Guthrie, K. M., Spirito, A., Boyer, E. W., &amp; Cunningham, R. M. (2018). Emergency department text messaging for adolescent violence and depression prevention: A pilot randomized controlled trial. </w:t>
       </w:r>
       <w:r>
         <w:rPr>
           <w:i/>
           <w:iCs/>
         </w:rPr>
-        <w:t>National Journal of Community Medicine</w:t>
-      </w:r>
-      <w:r>
-        <w:t xml:space="preserve">, </w:t>
+        <w:t>Psychological Services, 15</w:t>
+      </w:r>
+      <w:r>
+        <w:t xml:space="preserve">(4), 419–428. </w:t>
+      </w:r>
+      <w:hyperlink r:id="rId42" w:tgtFrame="_new" w:history="1">
+        <w:r>
+          <w:rPr>
+            <w:rStyle w:val="a5"/>
+          </w:rPr>
+          <w:t>https://doi.org/10.1037/ser0000193</w:t>
+        </w:r>
+      </w:hyperlink>
+    </w:p>
+    <w:p>
+      <w:pPr>
+        <w:spacing w:after="120" w:line="360" w:lineRule="auto"/>
+        <w:ind w:left="720" w:hanging="720"/>
+      </w:pPr>
+      <w:proofErr w:type="spellStart"/>
+      <w:r>
+        <w:lastRenderedPageBreak/>
+        <w:t>Raksilp</w:t>
+      </w:r>
+      <w:proofErr w:type="spellEnd"/>
+      <w:r>
+        <w:t xml:space="preserve">, M., </w:t>
+      </w:r>
+      <w:proofErr w:type="spellStart"/>
+      <w:r>
+        <w:t>Krongyudh</w:t>
+      </w:r>
+      <w:proofErr w:type="spellEnd"/>
+      <w:r>
+        <w:t xml:space="preserve">, S., </w:t>
+      </w:r>
+      <w:proofErr w:type="spellStart"/>
+      <w:r>
+        <w:t>Songserm</w:t>
+      </w:r>
+      <w:proofErr w:type="spellEnd"/>
+      <w:r>
+        <w:t xml:space="preserve">, N., &amp; </w:t>
+      </w:r>
+      <w:proofErr w:type="spellStart"/>
+      <w:r>
+        <w:t>Bussahong</w:t>
+      </w:r>
+      <w:proofErr w:type="spellEnd"/>
+      <w:r>
+        <w:t xml:space="preserve">, S. (2025). Effectiveness of depression prevention programs in adolescents: A systematic review and meta-analysis. </w:t>
       </w:r>
       <w:r>
         <w:rPr>
           <w:i/>
           <w:iCs/>
         </w:rPr>
+        <w:t>National Journal of Community Medicine</w:t>
+      </w:r>
+      <w:r>
+        <w:t xml:space="preserve">, </w:t>
+      </w:r>
+      <w:r>
+        <w:rPr>
+          <w:i/>
+          <w:iCs/>
+        </w:rPr>
         <w:t>16</w:t>
       </w:r>
       <w:r>
         <w:t xml:space="preserve">(3), 283-294. </w:t>
       </w:r>
-      <w:hyperlink r:id="rId35" w:history="1">
+      <w:hyperlink r:id="rId43" w:history="1">
         <w:r>
           <w:rPr>
             <w:rStyle w:val="a5"/>
@@ -46775,7 +47202,6 @@
       </w:pPr>
       <w:proofErr w:type="spellStart"/>
       <w:r>
-        <w:lastRenderedPageBreak/>
         <w:t>Reitegger</w:t>
       </w:r>
       <w:proofErr w:type="spellEnd"/>
@@ -46803,7 +47229,7 @@
       <w:r>
         <w:t xml:space="preserve">, 367–410. </w:t>
       </w:r>
-      <w:hyperlink r:id="rId36" w:history="1">
+      <w:hyperlink r:id="rId44" w:history="1">
         <w:r>
           <w:rPr>
             <w:rStyle w:val="a5"/>
@@ -46862,6 +47288,63 @@
         <w:spacing w:after="120" w:line="360" w:lineRule="auto"/>
         <w:ind w:left="720" w:hanging="720"/>
       </w:pPr>
+      <w:r>
+        <w:t xml:space="preserve">Rohde, P., Stice, E., Shaw, H., &amp; </w:t>
+      </w:r>
+      <w:proofErr w:type="spellStart"/>
+      <w:r>
+        <w:t>Brière</w:t>
+      </w:r>
+      <w:proofErr w:type="spellEnd"/>
+      <w:r>
+        <w:t xml:space="preserve">, F. N. (2014). Indicated cognitive behavioral group depression prevention compared to bibliotherapy and brochure control: Acute effects of an effectiveness trial with adolescents. </w:t>
+      </w:r>
+      <w:r>
+        <w:rPr>
+          <w:i/>
+          <w:iCs/>
+        </w:rPr>
+        <w:t>Journal of Consulting and Clinical Psychology, 82</w:t>
+      </w:r>
+      <w:r>
+        <w:t xml:space="preserve">(1), 65–74. </w:t>
+      </w:r>
+      <w:hyperlink r:id="rId45" w:history="1">
+        <w:r>
+          <w:rPr>
+            <w:rStyle w:val="a5"/>
+          </w:rPr>
+          <w:t>https://doi.org/10.1037/a0034640</w:t>
+        </w:r>
+      </w:hyperlink>
+    </w:p>
+    <w:p>
+      <w:pPr>
+        <w:spacing w:after="120" w:line="360" w:lineRule="auto"/>
+        <w:ind w:left="720" w:hanging="720"/>
+        <w:rPr>
+          <w:rFonts w:hint="eastAsia"/>
+        </w:rPr>
+      </w:pPr>
+      <w:r>
+        <w:t xml:space="preserve">Rohde, P., Stice, E., Shaw, H., &amp; Gau, J. M. (2015). Effectiveness trial of an indicated cognitive-behavioral group adolescent depression prevention program versus bibliotherapy and brochure control at 1- and 2-year follow-up. </w:t>
+      </w:r>
+      <w:r>
+        <w:rPr>
+          <w:i/>
+          <w:iCs/>
+        </w:rPr>
+        <w:t>Journal of Consulting and Clinical Psychology, 83</w:t>
+      </w:r>
+      <w:r>
+        <w:t>(4), 736–747. https://doi.org/10.1037/ccp0000022</w:t>
+      </w:r>
+    </w:p>
+    <w:p>
+      <w:pPr>
+        <w:spacing w:after="120" w:line="360" w:lineRule="auto"/>
+        <w:ind w:left="720" w:hanging="720"/>
+      </w:pPr>
       <w:proofErr w:type="spellStart"/>
       <w:r>
         <w:rPr>
@@ -46897,6 +47380,168 @@
         <w:ind w:left="720" w:hanging="720"/>
       </w:pPr>
       <w:r>
+        <w:t xml:space="preserve">Smith, P., Scott, R., </w:t>
+      </w:r>
+      <w:proofErr w:type="spellStart"/>
+      <w:r>
+        <w:t>Eshkevari</w:t>
+      </w:r>
+      <w:proofErr w:type="spellEnd"/>
+      <w:r>
+        <w:t xml:space="preserve">, E., Jatta, F., Leigh, E., Harris, V., Robinson, A., Abeles, P., Proudfoot, J., Verduyn, C., &amp; Yule, W. (2015). </w:t>
+      </w:r>
+      <w:proofErr w:type="spellStart"/>
+      <w:r>
+        <w:t>Computerised</w:t>
+      </w:r>
+      <w:proofErr w:type="spellEnd"/>
+      <w:r>
+        <w:t xml:space="preserve"> CBT for depressed adolescents: </w:t>
+      </w:r>
+      <w:proofErr w:type="spellStart"/>
+      <w:r>
+        <w:t>Randomised</w:t>
+      </w:r>
+      <w:proofErr w:type="spellEnd"/>
+      <w:r>
+        <w:t xml:space="preserve"> controlled trial. </w:t>
+      </w:r>
+      <w:proofErr w:type="spellStart"/>
+      <w:r>
+        <w:rPr>
+          <w:i/>
+          <w:iCs/>
+        </w:rPr>
+        <w:t>Behaviour</w:t>
+      </w:r>
+      <w:proofErr w:type="spellEnd"/>
+      <w:r>
+        <w:rPr>
+          <w:i/>
+          <w:iCs/>
+        </w:rPr>
+        <w:t xml:space="preserve"> Research and Therapy, 73</w:t>
+      </w:r>
+      <w:r>
+        <w:t xml:space="preserve">, 104–110. </w:t>
+      </w:r>
+      <w:hyperlink r:id="rId46" w:tgtFrame="_new" w:history="1">
+        <w:r>
+          <w:rPr>
+            <w:rStyle w:val="a5"/>
+          </w:rPr>
+          <w:t>https://doi.org/10.1016/j.brat.2015.07.009</w:t>
+        </w:r>
+      </w:hyperlink>
+    </w:p>
+    <w:p>
+      <w:pPr>
+        <w:spacing w:after="120" w:line="360" w:lineRule="auto"/>
+        <w:ind w:left="720" w:hanging="720"/>
+      </w:pPr>
+      <w:r>
+        <w:t>Stallard, P., Whittle, K., Moore, E., Medina-Lara, A., Morrish, N., Cliffe, B., Rhodes, S., &amp; Taylor, G. (2024). Clinical effectiveness and safety of adding a self-harm prevention app (</w:t>
+      </w:r>
+      <w:proofErr w:type="spellStart"/>
+      <w:r>
+        <w:t>BlueIce</w:t>
+      </w:r>
+      <w:proofErr w:type="spellEnd"/>
+      <w:r>
+        <w:t xml:space="preserve">) to specialist mental health care for adolescents who repeatedly self-harm: A single blind </w:t>
+      </w:r>
+      <w:proofErr w:type="spellStart"/>
+      <w:r>
+        <w:t>randomised</w:t>
+      </w:r>
+      <w:proofErr w:type="spellEnd"/>
+      <w:r>
+        <w:t xml:space="preserve"> controlled trial (the BASH study). </w:t>
+      </w:r>
+      <w:r>
+        <w:rPr>
+          <w:i/>
+          <w:iCs/>
+        </w:rPr>
+        <w:t>Psychiatry Research, 339</w:t>
+      </w:r>
+      <w:r>
+        <w:t xml:space="preserve">, Article 116017. </w:t>
+      </w:r>
+      <w:hyperlink r:id="rId47" w:tgtFrame="_new" w:history="1">
+        <w:r>
+          <w:rPr>
+            <w:rStyle w:val="a5"/>
+          </w:rPr>
+          <w:t>https://doi.org/10.1016/j.psychres.2024.116017</w:t>
+        </w:r>
+      </w:hyperlink>
+    </w:p>
+    <w:p>
+      <w:pPr>
+        <w:spacing w:after="120" w:line="360" w:lineRule="auto"/>
+        <w:ind w:left="720" w:hanging="720"/>
+        <w:rPr>
+          <w:rFonts w:hint="eastAsia"/>
+        </w:rPr>
+      </w:pPr>
+      <w:r>
+        <w:t xml:space="preserve">Stasiak, K., Hatcher, S., Frampton, C., &amp; Merry, S. N. (2014). A pilot double blind randomized </w:t>
+      </w:r>
+      <w:proofErr w:type="gramStart"/>
+      <w:r>
+        <w:t xml:space="preserve">placebo </w:t>
+      </w:r>
+      <w:r>
+        <w:lastRenderedPageBreak/>
+        <w:t>controlled</w:t>
+      </w:r>
+      <w:proofErr w:type="gramEnd"/>
+      <w:r>
+        <w:t xml:space="preserve"> trial of a prototype computer-based cognitive </w:t>
+      </w:r>
+      <w:proofErr w:type="spellStart"/>
+      <w:r>
+        <w:t>behavioural</w:t>
+      </w:r>
+      <w:proofErr w:type="spellEnd"/>
+      <w:r>
+        <w:t xml:space="preserve"> therapy program for adolescents with symptoms of depression. </w:t>
+      </w:r>
+      <w:proofErr w:type="spellStart"/>
+      <w:r>
+        <w:rPr>
+          <w:i/>
+          <w:iCs/>
+        </w:rPr>
+        <w:t>Behavioural</w:t>
+      </w:r>
+      <w:proofErr w:type="spellEnd"/>
+      <w:r>
+        <w:rPr>
+          <w:i/>
+          <w:iCs/>
+        </w:rPr>
+        <w:t xml:space="preserve"> and Cognitive Psychotherapy, 42</w:t>
+      </w:r>
+      <w:r>
+        <w:t xml:space="preserve">(4), 385–401. </w:t>
+      </w:r>
+      <w:hyperlink r:id="rId48" w:tgtFrame="_new" w:history="1">
+        <w:r>
+          <w:rPr>
+            <w:rStyle w:val="a5"/>
+          </w:rPr>
+          <w:t>https://doi.org/10.1017/S1352465812001087</w:t>
+        </w:r>
+      </w:hyperlink>
+    </w:p>
+    <w:p>
+      <w:pPr>
+        <w:spacing w:after="120" w:line="360" w:lineRule="auto"/>
+        <w:ind w:left="720" w:hanging="720"/>
+      </w:pPr>
+      <w:r>
         <w:rPr>
           <w:rFonts w:eastAsia="Times New Roman"/>
         </w:rPr>
@@ -46991,6 +47636,47 @@
         <w:ind w:left="720" w:hanging="720"/>
       </w:pPr>
       <w:r>
+        <w:t xml:space="preserve">Stice, E., Rohde, P., Seeley, J. R., &amp; Gau, J. M. (2008). Brief cognitive-behavioral depression prevention program for high-risk adolescents outperforms two alternative interventions: A randomized efficacy trial. </w:t>
+      </w:r>
+      <w:r>
+        <w:rPr>
+          <w:i/>
+          <w:iCs/>
+        </w:rPr>
+        <w:t>Journal of Consulting and Clinical Psychology, 76</w:t>
+      </w:r>
+      <w:r>
+        <w:t>(4), 595–606. https://doi.org/10.1037/a0012645</w:t>
+      </w:r>
+    </w:p>
+    <w:p>
+      <w:pPr>
+        <w:spacing w:after="120" w:line="360" w:lineRule="auto"/>
+        <w:ind w:left="720" w:hanging="720"/>
+        <w:rPr>
+          <w:rFonts w:hint="eastAsia"/>
+        </w:rPr>
+      </w:pPr>
+      <w:r>
+        <w:t xml:space="preserve">Stice, E., Rohde, P., Gau, J. M., &amp; Wade, E. (2010). Efficacy trial of a brief cognitive-behavioral depression prevention program for high-risk adolescents: Effects at 1- and 2-year follow-up. </w:t>
+      </w:r>
+      <w:r>
+        <w:rPr>
+          <w:i/>
+          <w:iCs/>
+        </w:rPr>
+        <w:t>Journal of Consulting and Clinical Psychology, 78</w:t>
+      </w:r>
+      <w:r>
+        <w:t>(6), 856–867. https://doi.org/10.1037/a0020544</w:t>
+      </w:r>
+    </w:p>
+    <w:p>
+      <w:pPr>
+        <w:spacing w:after="120" w:line="360" w:lineRule="auto"/>
+        <w:ind w:left="720" w:hanging="720"/>
+      </w:pPr>
+      <w:r>
         <w:t>Stockings, E. A., Degenhardt, L., Dobbins, T., Lee, Y. Y., Erskine, H. E., Whiteford, H. A., &amp; Patton, G. (2016). Preventing depression and anxiety in young people: A review of the joint efficacy of universal, selective and indicated prevention. Psychological Medicine, 46(1), 11–26</w:t>
       </w:r>
     </w:p>
@@ -47093,7 +47779,7 @@
       <w:r>
         <w:t xml:space="preserve">(3), 261–293. </w:t>
       </w:r>
-      <w:hyperlink r:id="rId37" w:history="1">
+      <w:hyperlink r:id="rId49" w:history="1">
         <w:r>
           <w:rPr>
             <w:rStyle w:val="a5"/>
@@ -47176,7 +47862,7 @@
       <w:r>
         <w:t xml:space="preserve">(2), 112–125. </w:t>
       </w:r>
-      <w:hyperlink r:id="rId38" w:tgtFrame="_new" w:history="1">
+      <w:hyperlink r:id="rId50" w:tgtFrame="_new" w:history="1">
         <w:r>
           <w:rPr>
             <w:rStyle w:val="a5"/>
@@ -47210,7 +47896,7 @@
       <w:r>
         <w:t xml:space="preserve">, Article 100690. </w:t>
       </w:r>
-      <w:hyperlink r:id="rId39" w:history="1">
+      <w:hyperlink r:id="rId51" w:history="1">
         <w:r>
           <w:rPr>
             <w:rStyle w:val="a5"/>
@@ -47288,6 +47974,136 @@
           <w:rFonts w:eastAsia="Times New Roman"/>
         </w:rPr>
         <w:t>. WHO.</w:t>
+      </w:r>
+    </w:p>
+    <w:p>
+      <w:pPr>
+        <w:spacing w:after="120" w:line="360" w:lineRule="auto"/>
+        <w:ind w:left="720" w:hanging="720"/>
+      </w:pPr>
+      <w:r>
+        <w:t xml:space="preserve">Wright, B., Tindall, L., Littlewood, E., Allgar, V., Abeles, P., </w:t>
+      </w:r>
+      <w:proofErr w:type="spellStart"/>
+      <w:r>
+        <w:t>Trépel</w:t>
+      </w:r>
+      <w:proofErr w:type="spellEnd"/>
+      <w:r>
+        <w:t xml:space="preserve">, D., &amp; Ali, S. (2017). </w:t>
+      </w:r>
+      <w:proofErr w:type="spellStart"/>
+      <w:r>
+        <w:t>Computerised</w:t>
+      </w:r>
+      <w:proofErr w:type="spellEnd"/>
+      <w:r>
+        <w:t xml:space="preserve"> cognitive–</w:t>
+      </w:r>
+      <w:proofErr w:type="spellStart"/>
+      <w:r>
+        <w:t>behavioural</w:t>
+      </w:r>
+      <w:proofErr w:type="spellEnd"/>
+      <w:r>
+        <w:t xml:space="preserve"> therapy for depression in adolescents: Feasibility results and 4-month outcomes of a UK </w:t>
+      </w:r>
+      <w:proofErr w:type="spellStart"/>
+      <w:r>
+        <w:t>randomised</w:t>
+      </w:r>
+      <w:proofErr w:type="spellEnd"/>
+      <w:r>
+        <w:t xml:space="preserve"> controlled trial. </w:t>
+      </w:r>
+      <w:r>
+        <w:rPr>
+          <w:i/>
+          <w:iCs/>
+        </w:rPr>
+        <w:t>BMJ Open, 7</w:t>
+      </w:r>
+      <w:r>
+        <w:t xml:space="preserve">(1), Article e012834. </w:t>
+      </w:r>
+      <w:hyperlink r:id="rId52" w:tgtFrame="_new" w:history="1">
+        <w:r>
+          <w:rPr>
+            <w:rStyle w:val="a5"/>
+          </w:rPr>
+          <w:t>https://doi.org/10.1136/bmjopen-2016-012834</w:t>
+        </w:r>
+      </w:hyperlink>
+    </w:p>
+    <w:p>
+      <w:pPr>
+        <w:spacing w:after="120" w:line="360" w:lineRule="auto"/>
+        <w:ind w:left="720" w:hanging="720"/>
+        <w:rPr>
+          <w:rFonts w:hint="eastAsia"/>
+        </w:rPr>
+      </w:pPr>
+      <w:r>
+        <w:t xml:space="preserve">Wright, B., Tindall, L., </w:t>
+      </w:r>
+      <w:proofErr w:type="spellStart"/>
+      <w:r>
+        <w:t>Hargate</w:t>
+      </w:r>
+      <w:proofErr w:type="spellEnd"/>
+      <w:r>
+        <w:t xml:space="preserve">, R., Allgar, V., </w:t>
+      </w:r>
+      <w:proofErr w:type="spellStart"/>
+      <w:r>
+        <w:t>Trépel</w:t>
+      </w:r>
+      <w:proofErr w:type="spellEnd"/>
+      <w:r>
+        <w:t xml:space="preserve">, D., &amp; Ali, S. (2020). </w:t>
+      </w:r>
+      <w:proofErr w:type="spellStart"/>
+      <w:r>
+        <w:t>Computerised</w:t>
+      </w:r>
+      <w:proofErr w:type="spellEnd"/>
+      <w:r>
+        <w:t xml:space="preserve"> cognitive–</w:t>
+      </w:r>
+      <w:proofErr w:type="spellStart"/>
+      <w:r>
+        <w:t>behavioural</w:t>
+      </w:r>
+      <w:proofErr w:type="spellEnd"/>
+      <w:r>
+        <w:t xml:space="preserve"> therapy for depression in adolescents: 12-month outcomes of a UK </w:t>
+      </w:r>
+      <w:proofErr w:type="spellStart"/>
+      <w:r>
+        <w:t>randomised</w:t>
+      </w:r>
+      <w:proofErr w:type="spellEnd"/>
+      <w:r>
+        <w:t xml:space="preserve"> controlled trial pilot study. </w:t>
+      </w:r>
+      <w:proofErr w:type="spellStart"/>
+      <w:r>
+        <w:rPr>
+          <w:i/>
+          <w:iCs/>
+        </w:rPr>
+        <w:t>BJPsych</w:t>
+      </w:r>
+      <w:proofErr w:type="spellEnd"/>
+      <w:r>
+        <w:rPr>
+          <w:i/>
+          <w:iCs/>
+        </w:rPr>
+        <w:t xml:space="preserve"> Open, 6</w:t>
+      </w:r>
+      <w:r>
+        <w:t>(1), Article e5. https://doi.org/10.1192/bjo.2019.91</w:t>
       </w:r>
     </w:p>
     <w:p>
@@ -54193,7 +55009,7 @@
             <w:r>
               <w:t>DOI:</w:t>
             </w:r>
-            <w:hyperlink r:id="rId40" w:tgtFrame="_blank" w:history="1">
+            <w:hyperlink r:id="rId53" w:tgtFrame="_blank" w:history="1">
               <w:r>
                 <w:rPr>
                   <w:rStyle w:val="a5"/>
@@ -55871,7 +56687,7 @@
                     <pic:cNvPicPr/>
                   </pic:nvPicPr>
                   <pic:blipFill>
-                    <a:blip r:embed="rId41" cstate="print">
+                    <a:blip r:embed="rId54" cstate="print">
                       <a:extLst>
                         <a:ext uri="{28A0092B-C50C-407E-A947-70E740481C1C}">
                           <a14:useLocalDpi xmlns:a14="http://schemas.microsoft.com/office/drawing/2010/main" val="0"/>

</xml_diff>